<commit_message>
Student's rewritten report; OUTLINE.md rewritten as final-report map
</commit_message>
<xml_diff>
--- a/report/report.docx
+++ b/report/report.docx
@@ -5,12 +5,14 @@
     <w:p>
       <w:pPr>
         <w:pStyle w:val="Title"/>
-        <w:rPr>
-          <w:rFonts w:hint="eastAsia"/>
-        </w:rPr>
-      </w:pPr>
-      <w:r>
-        <w:t>HyperInvest — Systematic Funds, News Sentiment, and a Learning-by-Doing Practice Area</w:t>
+      </w:pPr>
+      <w:proofErr w:type="spellStart"/>
+      <w:r>
+        <w:t>HyperInvest</w:t>
+      </w:r>
+      <w:proofErr w:type="spellEnd"/>
+      <w:r>
+        <w:t xml:space="preserve"> — Systematic Funds, News Sentiment, and a Learning-by-Doing Practice Area</w:t>
       </w:r>
     </w:p>
     <w:p>
@@ -45,13 +47,18 @@
     <w:p>
       <w:pPr>
         <w:pStyle w:val="Heading1"/>
-        <w:rPr>
-          <w:rFonts w:hint="eastAsia"/>
-        </w:rPr>
       </w:pPr>
       <w:r>
         <w:lastRenderedPageBreak/>
-        <w:t>1. The funds and the backtest design</w:t>
+        <w:t xml:space="preserve">1. The funds and the </w:t>
+      </w:r>
+      <w:proofErr w:type="spellStart"/>
+      <w:r>
+        <w:t>backtest</w:t>
+      </w:r>
+      <w:proofErr w:type="spellEnd"/>
+      <w:r>
+        <w:t xml:space="preserve"> design</w:t>
       </w:r>
     </w:p>
     <w:p>
@@ -223,13 +230,19 @@
         <w:rPr>
           <w:lang w:eastAsia="zh-CN"/>
         </w:rPr>
-        <w:t xml:space="preserve">, which </w:t>
-      </w:r>
-      <w:r>
-        <w:rPr>
-          <w:lang w:eastAsia="zh-CN"/>
-        </w:rPr>
-        <w:t>are listed below, and the sentiment tilt is separated from the thirteenth variant and is not part of the matrix.</w:t>
+        <w:t xml:space="preserve">, which are listed below, and the sentiment tilt is </w:t>
+      </w:r>
+      <w:r>
+        <w:rPr>
+          <w:lang w:eastAsia="zh-CN"/>
+        </w:rPr>
+        <w:t xml:space="preserve">a </w:t>
+      </w:r>
+      <w:r>
+        <w:rPr>
+          <w:lang w:eastAsia="zh-CN"/>
+        </w:rPr>
+        <w:t>separate thirteenth variant and is not part of the matrix.</w:t>
       </w:r>
     </w:p>
     <w:p>
@@ -301,19 +314,7 @@
         <w:rPr>
           <w:lang w:eastAsia="zh-CN"/>
         </w:rPr>
-        <w:t xml:space="preserve">Risk Parity: Ensures that each asset contributes equally to the portfolio’s total </w:t>
-      </w:r>
-      <w:r>
-        <w:rPr>
-          <w:lang w:eastAsia="zh-CN"/>
-        </w:rPr>
-        <w:t>risk; assets with lower volatility are given higher weights, while those with higher volatility</w:t>
-      </w:r>
-      <w:r>
-        <w:rPr>
-          <w:lang w:eastAsia="zh-CN"/>
-        </w:rPr>
-        <w:t xml:space="preserve"> are underweighted.</w:t>
+        <w:t>Risk Parity: Ensures that each asset contributes equally to the portfolio’s total risk; assets with lower volatility are given higher weights, while those with higher volatility are underweighted.</w:t>
       </w:r>
     </w:p>
     <w:p>
@@ -349,7 +350,6 @@
     <w:p>
       <w:pPr>
         <w:rPr>
-          <w:rFonts w:hint="eastAsia"/>
           <w:lang w:eastAsia="zh-CN"/>
         </w:rPr>
       </w:pPr>
@@ -887,9 +887,6 @@
     <w:p>
       <w:pPr>
         <w:pStyle w:val="Heading1"/>
-        <w:rPr>
-          <w:rFonts w:hint="eastAsia"/>
-        </w:rPr>
       </w:pPr>
       <w:r>
         <w:lastRenderedPageBreak/>
@@ -1999,11 +1996,19 @@
             <w:tcW w:w="2127" w:type="dxa"/>
           </w:tcPr>
           <w:p>
+            <w:proofErr w:type="spellStart"/>
             <w:r>
               <w:rPr>
                 <w:sz w:val="19"/>
               </w:rPr>
-              <w:t>Equity+Sentiment Tilt</w:t>
+              <w:t>Equity+Sentiment</w:t>
+            </w:r>
+            <w:proofErr w:type="spellEnd"/>
+            <w:r>
+              <w:rPr>
+                <w:sz w:val="19"/>
+              </w:rPr>
+              <w:t xml:space="preserve"> Tilt</w:t>
             </w:r>
           </w:p>
         </w:tc>
@@ -2303,7 +2308,19 @@
         <w:rPr>
           <w:color w:val="6B625C"/>
         </w:rPr>
-        <w:t>Out-of-sample Sharpe ratio by fund (risk-free rate 0), same periods as Exhibit 1.</w:t>
+        <w:t xml:space="preserve">Out-of-sample Sharpe ratio by fund (risk-free rate 0), same periods as </w:t>
+      </w:r>
+      <w:r>
+        <w:rPr>
+          <w:color w:val="6B625C"/>
+        </w:rPr>
+        <w:t>Table</w:t>
+      </w:r>
+      <w:r>
+        <w:rPr>
+          <w:color w:val="6B625C"/>
+        </w:rPr>
+        <w:t xml:space="preserve"> 1.</w:t>
       </w:r>
     </w:p>
     <w:p>
@@ -2386,7 +2403,26 @@
         <w:rPr>
           <w:lang w:eastAsia="zh-CN"/>
         </w:rPr>
-        <w:t xml:space="preserve">Parity had the highest Sharpe Ratio at 0.91, with a return of 14.1% and volatility of 15.9%. </w:t>
+        <w:t xml:space="preserve">Parity had the highest Sharpe </w:t>
+      </w:r>
+      <w:r>
+        <w:rPr>
+          <w:lang w:eastAsia="zh-CN"/>
+        </w:rPr>
+        <w:t>r</w:t>
+      </w:r>
+      <w:r>
+        <w:rPr>
+          <w:lang w:eastAsia="zh-CN"/>
+        </w:rPr>
+        <w:t>atio at 0.91, with a return of 14.1% and volatility of 15.9%.</w:t>
+      </w:r>
+      <w:r>
+        <w:rPr>
+          <w:rFonts w:hint="eastAsia"/>
+          <w:lang w:eastAsia="zh-CN"/>
+        </w:rPr>
+        <w:t xml:space="preserve"> </w:t>
       </w:r>
       <w:r>
         <w:rPr>
@@ -2410,7 +2446,44 @@
         <w:rPr>
           <w:lang w:eastAsia="zh-CN"/>
         </w:rPr>
-        <w:t>Sharpe ratio delivered the highest return at 17.2%, but also experienced the deepest drawdown of -27.3</w:t>
+        <w:t>Sharpe ratio delivered the highest return</w:t>
+      </w:r>
+      <w:r>
+        <w:rPr>
+          <w:rFonts w:hint="eastAsia"/>
+          <w:lang w:eastAsia="zh-CN"/>
+        </w:rPr>
+        <w:t xml:space="preserve"> in</w:t>
+      </w:r>
+      <w:r>
+        <w:rPr>
+          <w:lang w:eastAsia="zh-CN"/>
+        </w:rPr>
+        <w:t xml:space="preserve"> the combined family</w:t>
+      </w:r>
+      <w:r>
+        <w:rPr>
+          <w:lang w:eastAsia="zh-CN"/>
+        </w:rPr>
+        <w:t xml:space="preserve"> </w:t>
+      </w:r>
+      <w:r>
+        <w:rPr>
+          <w:lang w:eastAsia="zh-CN"/>
+        </w:rPr>
+        <w:t>at 17.2%</w:t>
+      </w:r>
+      <w:r>
+        <w:rPr>
+          <w:lang w:eastAsia="zh-CN"/>
+        </w:rPr>
+        <w:t xml:space="preserve">, with a </w:t>
+      </w:r>
+      <w:r>
+        <w:rPr>
+          <w:lang w:eastAsia="zh-CN"/>
+        </w:rPr>
+        <w:t>drawdown of -27.3</w:t>
       </w:r>
       <w:r>
         <w:rPr>
@@ -2422,7 +2495,19 @@
         <w:rPr>
           <w:lang w:eastAsia="zh-CN"/>
         </w:rPr>
-        <w:t xml:space="preserve">, which occurred on 30 September 2022. </w:t>
+        <w:t xml:space="preserve"> that occurred on 30 September 2022. The deepest draw</w:t>
+      </w:r>
+      <w:r>
+        <w:rPr>
+          <w:lang w:eastAsia="zh-CN"/>
+        </w:rPr>
+        <w:t>down in the combined family belongs to Combined Equal-Weight at -28.7%, on the same date</w:t>
+      </w:r>
+      <w:r>
+        <w:rPr>
+          <w:lang w:eastAsia="zh-CN"/>
+        </w:rPr>
+        <w:t xml:space="preserve">. </w:t>
       </w:r>
       <w:r>
         <w:rPr>
@@ -2601,6 +2686,12 @@
         <w:rPr>
           <w:lang w:eastAsia="zh-CN"/>
         </w:rPr>
+        <w:t xml:space="preserve">Appendix A1 shows this kind of path in a drawdown plot of Combined Max-Sharpe. </w:t>
+      </w:r>
+      <w:r>
+        <w:rPr>
+          <w:lang w:eastAsia="zh-CN"/>
+        </w:rPr>
         <w:t xml:space="preserve">By looking at the return rate individually, users would not recognize </w:t>
       </w:r>
       <w:r>
@@ -2740,20 +2831,14 @@
         <w:rPr>
           <w:lang w:eastAsia="zh-CN"/>
         </w:rPr>
-        <w:t xml:space="preserve"> increased from 0.61 to 0.83, the minimum variance saw a slight increase from 0.52 to 0.57, and the risk parity rose from 0.76 to 0.91. However, the performance of the Equal-Weight fund worsened, dropping from 0.86 to 0.76. The </w:t>
+        <w:t xml:space="preserve"> increased from 0.61 to 0.83, the minimum </w:t>
       </w:r>
       <w:r>
         <w:rPr>
           <w:lang w:eastAsia="zh-CN"/>
         </w:rPr>
         <w:lastRenderedPageBreak/>
-        <w:t xml:space="preserve">reason is </w:t>
-      </w:r>
-      <w:r>
-        <w:rPr>
-          <w:lang w:eastAsia="zh-CN"/>
-        </w:rPr>
-        <w:t xml:space="preserve">that no matter what the risk is, the Equal-Weight fund always </w:t>
+        <w:t xml:space="preserve">variance saw a slight increase from 0.52 to 0.57, and the risk parity rose from 0.76 to 0.91. However, the performance of the Equal-Weight fund worsened, dropping from 0.86 to 0.76. The reason is that no matter what the risk is, the Equal-Weight fund always </w:t>
       </w:r>
       <w:r>
         <w:rPr>
@@ -2784,13 +2869,7 @@
         <w:rPr>
           <w:lang w:eastAsia="zh-CN"/>
         </w:rPr>
-        <w:t>of the portfolio in</w:t>
-      </w:r>
-      <w:r>
-        <w:rPr>
-          <w:lang w:eastAsia="zh-CN"/>
-        </w:rPr>
-        <w:t xml:space="preserve"> cryptocurrency, whereas the optimization methods can determine the allocation on their own. Therefore, the conclusion is conditional: whether including cryptocurrency improves performance depends on whether there is a rule to determine its allocation.</w:t>
+        <w:t>of the portfolio in cryptocurrency, whereas the optimization methods can determine the allocation on their own. Therefore, the conclusion is conditional: whether including cryptocurrency improves performance depends on whether there is a rule to determine its allocation.</w:t>
       </w:r>
     </w:p>
     <w:p>
@@ -2822,19 +2901,20 @@
         <w:rPr>
           <w:lang w:eastAsia="zh-CN"/>
         </w:rPr>
-        <w:t xml:space="preserve">of the Combined Max-Sharp; </w:t>
-      </w:r>
-      <w:r>
-        <w:rPr>
-          <w:lang w:eastAsia="zh-CN"/>
-        </w:rPr>
-        <w:t>first, the portfolio is highly concentrated, and there are some months when one asset holds</w:t>
-      </w:r>
-      <w:r>
-        <w:rPr>
-          <w:lang w:eastAsia="zh-CN"/>
-        </w:rPr>
-        <w:t xml:space="preserve"> more than half of the portfolio. Second, the </w:t>
+        <w:t>of the Combined Max-Sharp</w:t>
+      </w:r>
+      <w:r>
+        <w:rPr>
+          <w:rFonts w:hint="eastAsia"/>
+          <w:lang w:eastAsia="zh-CN"/>
+        </w:rPr>
+        <w:t>e</w:t>
+      </w:r>
+      <w:r>
+        <w:rPr>
+          <w:lang w:eastAsia="zh-CN"/>
+        </w:rPr>
+        <w:t xml:space="preserve">; first, the portfolio is highly concentrated, and there are some months when one asset holds more than half of the portfolio. Second, the </w:t>
       </w:r>
       <w:r>
         <w:rPr>
@@ -3033,13 +3113,7 @@
         <w:rPr>
           <w:lang w:eastAsia="zh-CN"/>
         </w:rPr>
-        <w:t>users: is the fund simply a name, or is there a clear set of rules behind it?</w:t>
-      </w:r>
-      <w:r>
-        <w:rPr>
-          <w:lang w:eastAsia="zh-CN"/>
-        </w:rPr>
-        <w:t xml:space="preserve"> The professional mode shows the mathematical formula for those experienced investors, while Plain English mode illustrates the rules by using the fund’s own latest figures. For example, a Combined Equal-Weight fund states that each asset accounts for 100% divided by 60, which is 1.67%. Equity Max-Sharpe states that it currently holds only 7 out of 50 stocks. The sidebar also features a fixed section explaining how every fund is built, which introduces the construction process common to all funds. Each paragraph concludes with a reminder</w:t>
+        <w:t>users: is the fund simply a name, or is there a clear set of rules behind it? The professional mode shows the mathematical formula for those experienced investors, while Plain English mode illustrates the rules by using the fund’s own latest figures. For example, a Combined Equal-Weight fund states that each asset accounts for 100% divided by 60, which is 1.67%. Equity Max-Sharpe states that it currently holds only 7 out of 50 stocks. The sidebar also features a fixed section explaining how every fund is built, which introduces the construction process common to all funds. Each paragraph concludes with a reminder</w:t>
       </w:r>
       <w:r>
         <w:rPr>
@@ -3148,29 +3222,20 @@
         <w:rPr>
           <w:lang w:eastAsia="zh-CN"/>
         </w:rPr>
-        <w:t xml:space="preserve">, and within each group, the risk profiles of the four methods vary significantly. Second, adding cryptocurrencies helps all optimization methods but harms the Equal-Weight fund. Third, no single metric can rank all funds. The Crypto Min-Variance, with the highest Sharpe ratio, also has a maximum drawdown of -71.1%, while the most stable fund in the mixed group, Combined Min-Variance, has the </w:t>
+        <w:t xml:space="preserve">, and within each group, the risk profiles of the four methods vary significantly. Second, adding cryptocurrencies helps all optimization methods but harms the Equal-Weight fund. Third, no single metric can rank all funds. The Crypto Min-Variance, with the highest Sharpe ratio, also has a maximum drawdown </w:t>
       </w:r>
       <w:r>
         <w:rPr>
           <w:lang w:eastAsia="zh-CN"/>
         </w:rPr>
         <w:lastRenderedPageBreak/>
-        <w:t xml:space="preserve">lowest return within its group, at only 6.7%. Which fund to choose depends on the investor, and the numbers </w:t>
-      </w:r>
-      <w:r>
-        <w:rPr>
-          <w:lang w:eastAsia="zh-CN"/>
-        </w:rPr>
-        <w:t>provide supporting evidence to help investors make their own decisions.</w:t>
+        <w:t>of -71.1%, while the most stable fund in the mixed group, Combined Min-Variance, has the lowest return within its group, at only 6.7%. Which fund to choose depends on the investor, and the numbers provide supporting evidence to help investors make their own decisions.</w:t>
       </w:r>
     </w:p>
     <w:bookmarkEnd w:id="4"/>
     <w:p>
       <w:pPr>
         <w:pStyle w:val="Heading1"/>
-        <w:rPr>
-          <w:rFonts w:hint="eastAsia"/>
-        </w:rPr>
       </w:pPr>
       <w:r>
         <w:t>3. The news-sentiment index</w:t>
@@ -3296,7 +3361,20 @@
         <w:rPr>
           <w:lang w:eastAsia="zh-CN"/>
         </w:rPr>
-        <w:t xml:space="preserve"> it will be counted as the next trading day. The 6 titles after the last trading day could not be mapped to the next trading day and can only be discarded. After two steps, 146,836 headlines were left to enter the model.</w:t>
+        <w:t xml:space="preserve"> it will be counted as the next trading day. The 6 titles after the last trading day could not be mapped to the next trading day and can only be discarded. After two steps, 146,83</w:t>
+      </w:r>
+      <w:r>
+        <w:rPr>
+          <w:rFonts w:hint="eastAsia"/>
+          <w:lang w:eastAsia="zh-CN"/>
+        </w:rPr>
+        <w:t>0</w:t>
+      </w:r>
+      <w:r>
+        <w:rPr>
+          <w:lang w:eastAsia="zh-CN"/>
+        </w:rPr>
+        <w:t xml:space="preserve"> headlines were left to enter the model.</w:t>
       </w:r>
     </w:p>
     <w:p>
@@ -3309,7 +3387,38 @@
         <w:rPr>
           <w:lang w:eastAsia="zh-CN"/>
         </w:rPr>
-        <w:t>The model uses VADER, which is a rule-based sentiment scoring tool, and there is also a</w:t>
+        <w:t>The model uses VADER</w:t>
+      </w:r>
+      <w:r>
+        <w:rPr>
+          <w:rFonts w:hint="eastAsia"/>
+          <w:lang w:eastAsia="zh-CN"/>
+        </w:rPr>
+        <w:t xml:space="preserve"> </w:t>
+      </w:r>
+      <w:r>
+        <w:rPr>
+          <w:lang w:eastAsia="zh-CN"/>
+        </w:rPr>
+        <w:t>(</w:t>
+      </w:r>
+      <w:r>
+        <w:rPr>
+          <w:lang w:eastAsia="zh-CN"/>
+        </w:rPr>
+        <w:t>Hutto and Gilbert, 2014</w:t>
+      </w:r>
+      <w:r>
+        <w:rPr>
+          <w:lang w:eastAsia="zh-CN"/>
+        </w:rPr>
+        <w:t>)</w:t>
+      </w:r>
+      <w:r>
+        <w:rPr>
+          <w:lang w:eastAsia="zh-CN"/>
+        </w:rPr>
+        <w:t>, which is a rule-based sentiment scoring tool, and there is also a</w:t>
       </w:r>
       <w:r>
         <w:rPr>
@@ -3550,13 +3659,7 @@
         <w:rPr>
           <w:lang w:eastAsia="zh-CN"/>
         </w:rPr>
-        <w:t xml:space="preserve"> </w:t>
-      </w:r>
-      <w:r>
-        <w:rPr>
-          <w:lang w:eastAsia="zh-CN"/>
-        </w:rPr>
-        <w:t xml:space="preserve">individual stocks is that </w:t>
+        <w:t xml:space="preserve"> individual stocks is that </w:t>
       </w:r>
       <w:r>
         <w:rPr>
@@ -3580,13 +3683,7 @@
         <w:rPr>
           <w:lang w:eastAsia="zh-CN"/>
         </w:rPr>
-        <w:t>on about 70% of trading days; combining five stocks in an</w:t>
-      </w:r>
-      <w:r>
-        <w:rPr>
-          <w:lang w:eastAsia="zh-CN"/>
-        </w:rPr>
-        <w:t xml:space="preserve"> industry significantly reduces gaps in news coverage.</w:t>
+        <w:t>on about 70% of trading days; combining five stocks in an industry significantly reduces gaps in news coverage.</w:t>
       </w:r>
     </w:p>
     <w:p>
@@ -3615,7 +3712,6 @@
           <w:numId w:val="12"/>
         </w:numPr>
         <w:rPr>
-          <w:rFonts w:hint="eastAsia"/>
           <w:lang w:eastAsia="zh-CN"/>
         </w:rPr>
       </w:pPr>
@@ -3785,19 +3881,7 @@
         <w:rPr>
           <w:color w:val="6B625C"/>
         </w:rPr>
-        <w:t xml:space="preserve">Sector news-sentiment index over time, one panel per sector on a shared scale (VADER + finance </w:t>
-      </w:r>
-      <w:r>
-        <w:rPr>
-          <w:color w:val="6B625C"/>
-        </w:rPr>
-        <w:t>dictionary</w:t>
-      </w:r>
-      <w:r>
-        <w:rPr>
-          <w:color w:val="6B625C"/>
-        </w:rPr>
-        <w:t>, lagged one trading day), 2020–2023.</w:t>
+        <w:t>Sector news-sentiment index over time, one panel per sector on a shared scale (VADER + finance dictionary, lagged one trading day), 2020–2023.</w:t>
       </w:r>
     </w:p>
     <w:p>
@@ -3921,7 +4005,70 @@
         <w:rPr>
           <w:lang w:eastAsia="zh-CN"/>
         </w:rPr>
-        <w:t xml:space="preserve"> lexicon and Henry’s financial word list,</w:t>
+        <w:t xml:space="preserve"> lexicon</w:t>
+      </w:r>
+      <w:r>
+        <w:rPr>
+          <w:rFonts w:hint="eastAsia"/>
+          <w:lang w:eastAsia="zh-CN"/>
+        </w:rPr>
+        <w:t xml:space="preserve"> </w:t>
+      </w:r>
+      <w:r>
+        <w:rPr>
+          <w:lang w:eastAsia="zh-CN"/>
+        </w:rPr>
+        <w:t>(</w:t>
+      </w:r>
+      <w:r>
+        <w:rPr>
+          <w:lang w:eastAsia="zh-CN"/>
+        </w:rPr>
+        <w:t>Consoli, Barbaglia and Manzan, 2021</w:t>
+      </w:r>
+      <w:r>
+        <w:rPr>
+          <w:lang w:eastAsia="zh-CN"/>
+        </w:rPr>
+        <w:t>)</w:t>
+      </w:r>
+      <w:r>
+        <w:rPr>
+          <w:lang w:eastAsia="zh-CN"/>
+        </w:rPr>
+        <w:t xml:space="preserve"> and Henry’s financial word list</w:t>
+      </w:r>
+      <w:r>
+        <w:rPr>
+          <w:rFonts w:hint="eastAsia"/>
+          <w:lang w:eastAsia="zh-CN"/>
+        </w:rPr>
+        <w:t xml:space="preserve"> </w:t>
+      </w:r>
+      <w:r>
+        <w:rPr>
+          <w:lang w:eastAsia="zh-CN"/>
+        </w:rPr>
+        <w:t>(He</w:t>
+      </w:r>
+      <w:r>
+        <w:rPr>
+          <w:rFonts w:hint="eastAsia"/>
+          <w:lang w:eastAsia="zh-CN"/>
+        </w:rPr>
+        <w:t>n</w:t>
+      </w:r>
+      <w:r>
+        <w:rPr>
+          <w:lang w:eastAsia="zh-CN"/>
+        </w:rPr>
+        <w:t>ry, 2008)</w:t>
+      </w:r>
+      <w:r>
+        <w:rPr>
+          <w:lang w:eastAsia="zh-CN"/>
+        </w:rPr>
+        <w:t>,</w:t>
       </w:r>
       <w:r>
         <w:rPr>
@@ -4103,7 +4250,58 @@
         <w:rPr>
           <w:lang w:eastAsia="zh-CN"/>
         </w:rPr>
-        <w:t xml:space="preserve"> 5-day smoothing corresponds to a work week; spikes caused by single headlines subside within a few days, and averaging on a weekly scale preserves the true news cycle while suppressing daily noise. Days without news reuse the previous reading, </w:t>
+        <w:t xml:space="preserve"> 5-day smoothing corresponds to a work week; spikes caused by single headlines subside within a few days, and averaging on a weekly scale preserves the true news cycle while suppressing daily noise. Days without news reuse the previous reading</w:t>
+      </w:r>
+      <w:r>
+        <w:rPr>
+          <w:rFonts w:hint="eastAsia"/>
+          <w:lang w:eastAsia="zh-CN"/>
+        </w:rPr>
+        <w:t>.</w:t>
+      </w:r>
+      <w:r>
+        <w:rPr>
+          <w:lang w:eastAsia="zh-CN"/>
+        </w:rPr>
+        <w:t xml:space="preserve"> The</w:t>
+      </w:r>
+      <w:r>
+        <w:rPr>
+          <w:rFonts w:hint="eastAsia"/>
+          <w:lang w:eastAsia="zh-CN"/>
+        </w:rPr>
+        <w:t xml:space="preserve"> </w:t>
+      </w:r>
+      <w:r>
+        <w:rPr>
+          <w:lang w:eastAsia="zh-CN"/>
+        </w:rPr>
+        <w:t>carry-forward</w:t>
+      </w:r>
+      <w:r>
+        <w:rPr>
+          <w:rFonts w:hint="eastAsia"/>
+          <w:lang w:eastAsia="zh-CN"/>
+        </w:rPr>
+        <w:t xml:space="preserve"> </w:t>
+      </w:r>
+      <w:r>
+        <w:rPr>
+          <w:lang w:eastAsia="zh-CN"/>
+        </w:rPr>
+        <w:t xml:space="preserve">limit is set at 10 trading days based on the assumption that information becomes outdated: readings from two weeks ago might still describe the news environment of an industry, but beyond that they </w:t>
+      </w:r>
+      <w:r>
+        <w:rPr>
+          <w:lang w:eastAsia="zh-CN"/>
+        </w:rPr>
+        <w:t>go stale</w:t>
+      </w:r>
+      <w:r>
+        <w:rPr>
+          <w:lang w:eastAsia="zh-CN"/>
+        </w:rPr>
+        <w:t>. Therefore, readings older than two weeks without news are treated as neutral, avoiding the use of outdated readings.</w:t>
       </w:r>
     </w:p>
     <w:p>
@@ -4116,7 +4314,31 @@
         <w:rPr>
           <w:lang w:eastAsia="zh-CN"/>
         </w:rPr>
-        <w:t>The</w:t>
+        <w:t xml:space="preserve">The industry differences in Figure 4 are also reasonable. Defensive industries like utilities and real estate have the highest overall line position; cyclical industries like </w:t>
+      </w:r>
+      <w:r>
+        <w:rPr>
+          <w:lang w:eastAsia="zh-CN"/>
+        </w:rPr>
+        <w:t>F</w:t>
+      </w:r>
+      <w:r>
+        <w:rPr>
+          <w:lang w:eastAsia="zh-CN"/>
+        </w:rPr>
+        <w:t xml:space="preserve">inance and </w:t>
+      </w:r>
+      <w:r>
+        <w:rPr>
+          <w:lang w:eastAsia="zh-CN"/>
+        </w:rPr>
+        <w:t>M</w:t>
+      </w:r>
+      <w:r>
+        <w:rPr>
+          <w:lang w:eastAsia="zh-CN"/>
+        </w:rPr>
+        <w:t>aterials are at the bottom. Industries with less news have noticeably</w:t>
       </w:r>
       <w:r>
         <w:rPr>
@@ -4129,7 +4351,7 @@
         <w:rPr>
           <w:lang w:eastAsia="zh-CN"/>
         </w:rPr>
-        <w:t>carry-forward</w:t>
+        <w:t>noisier</w:t>
       </w:r>
       <w:r>
         <w:rPr>
@@ -4142,93 +4364,72 @@
         <w:rPr>
           <w:lang w:eastAsia="zh-CN"/>
         </w:rPr>
-        <w:t xml:space="preserve">limit is set at 10 trading days based on the assumption that information becomes outdated: readings from two weeks ago might still describe the news environment of an industry, but beyond that they </w:t>
-      </w:r>
-      <w:r>
-        <w:rPr>
-          <w:lang w:eastAsia="zh-CN"/>
-        </w:rPr>
-        <w:t>go stale</w:t>
-      </w:r>
-      <w:r>
-        <w:rPr>
-          <w:lang w:eastAsia="zh-CN"/>
-        </w:rPr>
-        <w:t>. Therefore, readings older than two weeks without news are treated as neutral, avoiding the use of outdated readings.</w:t>
+        <w:t>lines, which reflects the reality of data coverage, not a model flaw.</w:t>
       </w:r>
     </w:p>
     <w:p>
       <w:pPr>
-        <w:rPr>
-          <w:lang w:eastAsia="zh-CN"/>
-        </w:rPr>
-      </w:pPr>
-      <w:r>
-        <w:rPr>
-          <w:lang w:eastAsia="zh-CN"/>
-        </w:rPr>
-        <w:t xml:space="preserve">The industry differences in Figure 4 are also reasonable. Defensive industries like utilities and real estate have the highest overall line position; cyclical industries like </w:t>
-      </w:r>
-      <w:r>
-        <w:rPr>
-          <w:lang w:eastAsia="zh-CN"/>
-        </w:rPr>
-        <w:t>F</w:t>
-      </w:r>
-      <w:r>
-        <w:rPr>
-          <w:lang w:eastAsia="zh-CN"/>
-        </w:rPr>
-        <w:t xml:space="preserve">inance and </w:t>
-      </w:r>
-      <w:r>
-        <w:rPr>
-          <w:lang w:eastAsia="zh-CN"/>
-        </w:rPr>
-        <w:t>M</w:t>
-      </w:r>
-      <w:r>
-        <w:rPr>
-          <w:lang w:eastAsia="zh-CN"/>
-        </w:rPr>
-        <w:t>aterials are at the bottom. Industries with less news have noticeably</w:t>
-      </w:r>
-      <w:r>
-        <w:rPr>
-          <w:rFonts w:hint="eastAsia"/>
-          <w:lang w:eastAsia="zh-CN"/>
-        </w:rPr>
-        <w:t xml:space="preserve"> </w:t>
-      </w:r>
-      <w:r>
-        <w:rPr>
-          <w:lang w:eastAsia="zh-CN"/>
-        </w:rPr>
-        <w:t>noisier</w:t>
-      </w:r>
-      <w:r>
-        <w:rPr>
-          <w:rFonts w:hint="eastAsia"/>
-          <w:lang w:eastAsia="zh-CN"/>
-        </w:rPr>
-        <w:t xml:space="preserve"> </w:t>
-      </w:r>
-      <w:r>
-        <w:rPr>
-          <w:lang w:eastAsia="zh-CN"/>
-        </w:rPr>
-        <w:t>lines, which reflects the reality of data coverage, not a model flaw.</w:t>
+        <w:pStyle w:val="Heading1"/>
+      </w:pPr>
+      <w:r>
+        <w:t>4. Extensions and innovations</w:t>
       </w:r>
     </w:p>
     <w:p>
       <w:pPr>
-        <w:pStyle w:val="Heading1"/>
-        <w:rPr>
-          <w:rFonts w:hint="eastAsia"/>
-        </w:rPr>
-      </w:pPr>
-      <w:r>
-        <w:t>4. Extensions and innovations</w:t>
+        <w:rPr>
+          <w:lang w:eastAsia="zh-CN"/>
+        </w:rPr>
+      </w:pPr>
+      <w:r>
+        <w:rPr>
+          <w:lang w:eastAsia="zh-CN"/>
+        </w:rPr>
+        <w:t xml:space="preserve">This section focuses on </w:t>
+      </w:r>
+      <w:r>
+        <w:rPr>
+          <w:lang w:eastAsia="zh-CN"/>
+        </w:rPr>
+        <w:t>five</w:t>
+      </w:r>
+      <w:r>
+        <w:rPr>
+          <w:lang w:eastAsia="zh-CN"/>
+        </w:rPr>
+        <w:t xml:space="preserve"> extensions beyond the baseline </w:t>
+      </w:r>
+      <w:r>
+        <w:rPr>
+          <w:lang w:eastAsia="zh-CN"/>
+        </w:rPr>
+        <w:t xml:space="preserve">design. The most important one is the </w:t>
+      </w:r>
+      <w:r>
+        <w:rPr>
+          <w:lang w:eastAsia="zh-CN"/>
+        </w:rPr>
+        <w:t>practice area</w:t>
+      </w:r>
+      <w:r>
+        <w:rPr>
+          <w:lang w:eastAsia="zh-CN"/>
+        </w:rPr>
+        <w:t xml:space="preserve">, which is an investment time machine. Users choose a starting date, an amount, and a set of funds, and then cross the three-year out-of-sample interval. It has two modes. In the Replay mode, the entire timeline is visible. The user drags the slider to move the time forward. It usually goes by month, and when it enters the turbulent period, it will automatically slow down to the day. The Blind walk mode hides the future, and the picture only draws to the current date. Users decide to move forward step by step, but the progress will automatically stop at the beginning of the next turbulent period, so users can skip a calm year, but the actual huge fluctuation events </w:t>
+      </w:r>
+      <w:proofErr w:type="spellStart"/>
+      <w:r>
+        <w:rPr>
+          <w:lang w:eastAsia="zh-CN"/>
+        </w:rPr>
+        <w:t>can not</w:t>
+      </w:r>
+      <w:proofErr w:type="spellEnd"/>
+      <w:r>
+        <w:rPr>
+          <w:lang w:eastAsia="zh-CN"/>
+        </w:rPr>
+        <w:t xml:space="preserve"> be avoided. On any date, users can adjust the combination, add money, or withdraw money, and the position is tracked in US dollars, just like the real holding.</w:t>
       </w:r>
     </w:p>
     <w:p>
@@ -4241,51 +4442,91 @@
         <w:rPr>
           <w:lang w:eastAsia="zh-CN"/>
         </w:rPr>
-        <w:t xml:space="preserve">This section focuses on </w:t>
-      </w:r>
-      <w:r>
-        <w:rPr>
-          <w:lang w:eastAsia="zh-CN"/>
-        </w:rPr>
-        <w:t>five</w:t>
-      </w:r>
-      <w:r>
-        <w:rPr>
-          <w:lang w:eastAsia="zh-CN"/>
-        </w:rPr>
-        <w:t xml:space="preserve"> extensions beyond the baseline </w:t>
-      </w:r>
-      <w:r>
-        <w:rPr>
-          <w:lang w:eastAsia="zh-CN"/>
-        </w:rPr>
-        <w:t xml:space="preserve">design. The most important one is the </w:t>
-      </w:r>
-      <w:r>
-        <w:rPr>
-          <w:lang w:eastAsia="zh-CN"/>
-        </w:rPr>
-        <w:t>practice area</w:t>
-      </w:r>
-      <w:r>
-        <w:rPr>
-          <w:lang w:eastAsia="zh-CN"/>
-        </w:rPr>
-        <w:t xml:space="preserve">, which is an investment time machine. Users choose a starting date, an amount, and a set of funds, and then cross the three-year out-of-sample interval. It has two modes. In the Replay mode, the entire timeline is visible. The user drags the slider to move the time forward. It usually goes by month, and when it enters the turbulent period, it will automatically slow down to the day. The Blind walk mode hides the future, and the picture only draws to the current date. Users decide to move forward step by step, but the progress will automatically stop at the beginning of the next turbulent period, so users can skip a calm year, but the actual huge fluctuation events </w:t>
-      </w:r>
-      <w:proofErr w:type="spellStart"/>
-      <w:r>
-        <w:rPr>
-          <w:lang w:eastAsia="zh-CN"/>
-        </w:rPr>
-        <w:t>can not</w:t>
-      </w:r>
-      <w:proofErr w:type="spellEnd"/>
-      <w:r>
-        <w:rPr>
-          <w:lang w:eastAsia="zh-CN"/>
-        </w:rPr>
-        <w:t xml:space="preserve"> be avoided. On any date, users can adjust the combination, add money, or withdraw money, and the position is tracked in US dollars, just like the real holding.</w:t>
+        <w:t>There is also deliberate design in the time machine</w:t>
+      </w:r>
+      <w:r>
+        <w:rPr>
+          <w:lang w:eastAsia="zh-CN"/>
+        </w:rPr>
+        <w:t>;</w:t>
+      </w:r>
+      <w:r>
+        <w:rPr>
+          <w:lang w:eastAsia="zh-CN"/>
+        </w:rPr>
+        <w:t xml:space="preserve"> </w:t>
+      </w:r>
+      <w:r>
+        <w:rPr>
+          <w:lang w:eastAsia="zh-CN"/>
+        </w:rPr>
+        <w:t xml:space="preserve">it states but does not evaluate. </w:t>
+      </w:r>
+      <w:r>
+        <w:rPr>
+          <w:lang w:eastAsia="zh-CN"/>
+        </w:rPr>
+        <w:t xml:space="preserve">When the user experiences a </w:t>
+      </w:r>
+      <w:r>
+        <w:rPr>
+          <w:lang w:eastAsia="zh-CN"/>
+        </w:rPr>
+        <w:t>drawdown</w:t>
+      </w:r>
+      <w:r>
+        <w:rPr>
+          <w:lang w:eastAsia="zh-CN"/>
+        </w:rPr>
+        <w:t>, the interface will tell the user what happened and why, using the user’s real numbers but not saying whether their decision is correct</w:t>
+      </w:r>
+      <w:r>
+        <w:rPr>
+          <w:lang w:eastAsia="zh-CN"/>
+        </w:rPr>
+        <w:t xml:space="preserve"> or not.</w:t>
+      </w:r>
+      <w:r>
+        <w:rPr>
+          <w:lang w:eastAsia="zh-CN"/>
+        </w:rPr>
+        <w:t xml:space="preserve"> </w:t>
+      </w:r>
+      <w:r>
+        <w:rPr>
+          <w:lang w:eastAsia="zh-CN"/>
+        </w:rPr>
+        <w:t xml:space="preserve">Trading apps face </w:t>
+      </w:r>
+      <w:r>
+        <w:rPr>
+          <w:lang w:eastAsia="zh-CN"/>
+        </w:rPr>
+        <w:t>the criticism of gamifying trading; for example, Robinhood removed its confetti animation in 2021 after such criticism (</w:t>
+      </w:r>
+      <w:r>
+        <w:rPr>
+          <w:lang w:eastAsia="zh-CN"/>
+        </w:rPr>
+        <w:t>Massachusetts Securities Division, 2020</w:t>
+      </w:r>
+      <w:r>
+        <w:rPr>
+          <w:lang w:eastAsia="zh-CN"/>
+        </w:rPr>
+        <w:t>).</w:t>
+      </w:r>
+      <w:r>
+        <w:rPr>
+          <w:lang w:eastAsia="zh-CN"/>
+        </w:rPr>
+        <w:t xml:space="preserve"> This design </w:t>
+      </w:r>
+      <w:r>
+        <w:rPr>
+          <w:lang w:eastAsia="zh-CN"/>
+        </w:rPr>
+        <w:t>is to reward users with understanding rather than activity.</w:t>
       </w:r>
     </w:p>
     <w:p>
@@ -4298,121 +4539,92 @@
         <w:rPr>
           <w:lang w:eastAsia="zh-CN"/>
         </w:rPr>
-        <w:t>There is also deliberate design in the time machine</w:t>
-      </w:r>
-      <w:r>
-        <w:rPr>
-          <w:lang w:eastAsia="zh-CN"/>
-        </w:rPr>
-        <w:t>;</w:t>
-      </w:r>
-      <w:r>
-        <w:rPr>
-          <w:lang w:eastAsia="zh-CN"/>
-        </w:rPr>
-        <w:t xml:space="preserve"> </w:t>
-      </w:r>
-      <w:r>
-        <w:rPr>
-          <w:lang w:eastAsia="zh-CN"/>
-        </w:rPr>
-        <w:t xml:space="preserve">it states but does not evaluate. </w:t>
-      </w:r>
-      <w:r>
-        <w:rPr>
-          <w:lang w:eastAsia="zh-CN"/>
-        </w:rPr>
-        <w:t xml:space="preserve">When the user experiences a </w:t>
-      </w:r>
-      <w:r>
-        <w:rPr>
-          <w:lang w:eastAsia="zh-CN"/>
-        </w:rPr>
-        <w:t>drawdown</w:t>
-      </w:r>
-      <w:r>
-        <w:rPr>
-          <w:lang w:eastAsia="zh-CN"/>
-        </w:rPr>
-        <w:t>, the interface will tell the user what happened and why, using the user’s real numbers but not saying whether their decision is correct</w:t>
-      </w:r>
-      <w:r>
-        <w:rPr>
-          <w:lang w:eastAsia="zh-CN"/>
-        </w:rPr>
-        <w:t xml:space="preserve"> or not.</w:t>
-      </w:r>
-      <w:r>
-        <w:rPr>
-          <w:lang w:eastAsia="zh-CN"/>
-        </w:rPr>
-        <w:t xml:space="preserve"> </w:t>
-      </w:r>
-      <w:r>
-        <w:rPr>
-          <w:lang w:eastAsia="zh-CN"/>
-        </w:rPr>
-        <w:t xml:space="preserve">Trading apps face the criticism of gamifying trading, a specific case is Robinhood removed </w:t>
-      </w:r>
-      <w:proofErr w:type="gramStart"/>
-      <w:r>
-        <w:rPr>
-          <w:lang w:eastAsia="zh-CN"/>
-        </w:rPr>
-        <w:t>its</w:t>
-      </w:r>
-      <w:proofErr w:type="gramEnd"/>
-      <w:r>
-        <w:rPr>
-          <w:lang w:eastAsia="zh-CN"/>
-        </w:rPr>
-        <w:t xml:space="preserve"> </w:t>
-      </w:r>
-      <w:proofErr w:type="spellStart"/>
-      <w:r>
-        <w:rPr>
-          <w:lang w:eastAsia="zh-CN"/>
-        </w:rPr>
-        <w:t>its</w:t>
-      </w:r>
-      <w:proofErr w:type="spellEnd"/>
-      <w:r>
-        <w:rPr>
-          <w:lang w:eastAsia="zh-CN"/>
-        </w:rPr>
-        <w:t xml:space="preserve"> confetti animation in 2021 after such </w:t>
-      </w:r>
-      <w:proofErr w:type="gramStart"/>
-      <w:r>
-        <w:rPr>
-          <w:lang w:eastAsia="zh-CN"/>
-        </w:rPr>
-        <w:t xml:space="preserve">criticism </w:t>
-      </w:r>
-      <w:r>
-        <w:rPr>
-          <w:lang w:eastAsia="zh-CN"/>
-        </w:rPr>
-        <w:t xml:space="preserve"> (</w:t>
-      </w:r>
-      <w:proofErr w:type="gramEnd"/>
-      <w:r>
-        <w:rPr>
-          <w:lang w:eastAsia="zh-CN"/>
-        </w:rPr>
-        <w:t>CNBC, 2021).</w:t>
-      </w:r>
-      <w:r>
-        <w:rPr>
-          <w:lang w:eastAsia="zh-CN"/>
-        </w:rPr>
-        <w:t xml:space="preserve"> This design </w:t>
-      </w:r>
-      <w:r>
-        <w:rPr>
-          <w:lang w:eastAsia="zh-CN"/>
-        </w:rPr>
-        <w:t>is to reward users with understanding rather than activity.</w:t>
+        <w:t>The second extension is to fold the</w:t>
+      </w:r>
+      <w:r>
+        <w:rPr>
+          <w:lang w:eastAsia="zh-CN"/>
+        </w:rPr>
+        <w:t xml:space="preserve"> sentiment</w:t>
+      </w:r>
+      <w:r>
+        <w:rPr>
+          <w:lang w:eastAsia="zh-CN"/>
+        </w:rPr>
+        <w:t xml:space="preserve"> index into the </w:t>
+      </w:r>
+      <w:r>
+        <w:rPr>
+          <w:lang w:eastAsia="zh-CN"/>
+        </w:rPr>
+        <w:t>equity</w:t>
+      </w:r>
+      <w:r>
+        <w:rPr>
+          <w:lang w:eastAsia="zh-CN"/>
+        </w:rPr>
+        <w:t xml:space="preserve"> fund, and the result </w:t>
+      </w:r>
+      <w:r>
+        <w:rPr>
+          <w:lang w:eastAsia="zh-CN"/>
+        </w:rPr>
+        <w:t xml:space="preserve">is </w:t>
+      </w:r>
+      <w:r>
+        <w:rPr>
+          <w:lang w:eastAsia="zh-CN"/>
+        </w:rPr>
+        <w:t xml:space="preserve">negative. </w:t>
+      </w:r>
+      <w:r>
+        <w:rPr>
+          <w:lang w:eastAsia="zh-CN"/>
+        </w:rPr>
+        <w:t>T</w:t>
+      </w:r>
+      <w:r>
+        <w:rPr>
+          <w:lang w:eastAsia="zh-CN"/>
+        </w:rPr>
+        <w:t xml:space="preserve">he result is </w:t>
+      </w:r>
+      <w:r>
+        <w:rPr>
+          <w:lang w:eastAsia="zh-CN"/>
+        </w:rPr>
+        <w:t xml:space="preserve">reported as it is; the </w:t>
+      </w:r>
+      <w:r>
+        <w:rPr>
+          <w:lang w:eastAsia="zh-CN"/>
+        </w:rPr>
+        <w:t>method</w:t>
+      </w:r>
+      <w:r>
+        <w:rPr>
+          <w:lang w:eastAsia="zh-CN"/>
+        </w:rPr>
+        <w:t xml:space="preserve"> is very direct</w:t>
+      </w:r>
+      <w:r>
+        <w:rPr>
+          <w:lang w:eastAsia="zh-CN"/>
+        </w:rPr>
+        <w:t xml:space="preserve"> and simple</w:t>
+      </w:r>
+      <w:r>
+        <w:rPr>
+          <w:lang w:eastAsia="zh-CN"/>
+        </w:rPr>
+        <w:t xml:space="preserve">: at every monthly rebalancing, multiply the base weight of Equity Max-Sharpe by a factor, and the factor increases or decreases with the z-score of the industry sentiment, and then the calculated negative weight </w:t>
+      </w:r>
+      <w:r>
+        <w:rPr>
+          <w:lang w:eastAsia="zh-CN"/>
+        </w:rPr>
+        <w:lastRenderedPageBreak/>
+        <w:t>is truncated to zero and re-normalized. The effect is that industries with a positive news tone automatically get more weight.</w:t>
       </w:r>
     </w:p>
     <w:p>
@@ -4425,122 +4637,6 @@
         <w:rPr>
           <w:lang w:eastAsia="zh-CN"/>
         </w:rPr>
-        <w:t>The second extension is to fold the</w:t>
-      </w:r>
-      <w:r>
-        <w:rPr>
-          <w:lang w:eastAsia="zh-CN"/>
-        </w:rPr>
-        <w:t xml:space="preserve"> sentiment</w:t>
-      </w:r>
-      <w:r>
-        <w:rPr>
-          <w:lang w:eastAsia="zh-CN"/>
-        </w:rPr>
-        <w:t xml:space="preserve"> index into the </w:t>
-      </w:r>
-      <w:r>
-        <w:rPr>
-          <w:lang w:eastAsia="zh-CN"/>
-        </w:rPr>
-        <w:t>equity</w:t>
-      </w:r>
-      <w:r>
-        <w:rPr>
-          <w:lang w:eastAsia="zh-CN"/>
-        </w:rPr>
-        <w:t xml:space="preserve"> fund, and the result </w:t>
-      </w:r>
-      <w:r>
-        <w:rPr>
-          <w:lang w:eastAsia="zh-CN"/>
-        </w:rPr>
-        <w:t xml:space="preserve">is </w:t>
-      </w:r>
-      <w:r>
-        <w:rPr>
-          <w:lang w:eastAsia="zh-CN"/>
-        </w:rPr>
-        <w:t xml:space="preserve">negative. </w:t>
-      </w:r>
-      <w:r>
-        <w:rPr>
-          <w:lang w:eastAsia="zh-CN"/>
-        </w:rPr>
-        <w:t>T</w:t>
-      </w:r>
-      <w:r>
-        <w:rPr>
-          <w:lang w:eastAsia="zh-CN"/>
-        </w:rPr>
-        <w:t xml:space="preserve">he result is </w:t>
-      </w:r>
-      <w:r>
-        <w:rPr>
-          <w:lang w:eastAsia="zh-CN"/>
-        </w:rPr>
-        <w:t xml:space="preserve">reported as it is; the </w:t>
-      </w:r>
-      <w:r>
-        <w:rPr>
-          <w:lang w:eastAsia="zh-CN"/>
-        </w:rPr>
-        <w:t>method</w:t>
-      </w:r>
-      <w:r>
-        <w:rPr>
-          <w:lang w:eastAsia="zh-CN"/>
-        </w:rPr>
-        <w:t xml:space="preserve"> is very direct</w:t>
-      </w:r>
-      <w:r>
-        <w:rPr>
-          <w:lang w:eastAsia="zh-CN"/>
-        </w:rPr>
-        <w:t xml:space="preserve"> and simple</w:t>
-      </w:r>
-      <w:r>
-        <w:rPr>
-          <w:lang w:eastAsia="zh-CN"/>
-        </w:rPr>
-        <w:t xml:space="preserve">: </w:t>
-      </w:r>
-      <w:r>
-        <w:rPr>
-          <w:lang w:eastAsia="zh-CN"/>
-        </w:rPr>
-        <w:t xml:space="preserve">at </w:t>
-      </w:r>
-      <w:r>
-        <w:rPr>
-          <w:lang w:eastAsia="zh-CN"/>
-        </w:rPr>
-        <w:t xml:space="preserve">every monthly rebalancing, multiply the base weight of Equity Max-Sharpe by a factor, and the factor increases </w:t>
-      </w:r>
-      <w:r>
-        <w:rPr>
-          <w:lang w:eastAsia="zh-CN"/>
-        </w:rPr>
-        <w:lastRenderedPageBreak/>
-        <w:t>or decreases with the z-score of the industry sentiment, and then the calculated negative weight is truncated to zero and re-normalized.</w:t>
-      </w:r>
-      <w:r>
-        <w:rPr>
-          <w:lang w:eastAsia="zh-CN"/>
-        </w:rPr>
-        <w:t xml:space="preserve"> The effect is that industries with a positive news tone automatically get more weight.</w:t>
-      </w:r>
-    </w:p>
-    <w:p>
-      <w:pPr>
-        <w:rPr>
-          <w:lang w:eastAsia="zh-CN"/>
-        </w:rPr>
-      </w:pPr>
-      <w:r>
-        <w:rPr>
-          <w:lang w:eastAsia="zh-CN"/>
-        </w:rPr>
         <w:t xml:space="preserve">The results are shown in Figure 5 and Table 2: the tilt fund </w:t>
       </w:r>
       <w:r>
@@ -4601,7 +4697,49 @@
         <w:rPr>
           <w:lang w:eastAsia="zh-CN"/>
         </w:rPr>
-        <w:t xml:space="preserve"> or signal was not adjusted. The report was the result of the first run.</w:t>
+        <w:t xml:space="preserve"> </w:t>
+      </w:r>
+      <w:r>
+        <w:rPr>
+          <w:lang w:eastAsia="zh-CN"/>
+        </w:rPr>
+        <w:t>and</w:t>
+      </w:r>
+      <w:r>
+        <w:rPr>
+          <w:lang w:eastAsia="zh-CN"/>
+        </w:rPr>
+        <w:t xml:space="preserve"> signal w</w:t>
+      </w:r>
+      <w:r>
+        <w:rPr>
+          <w:lang w:eastAsia="zh-CN"/>
+        </w:rPr>
+        <w:t xml:space="preserve">ere </w:t>
+      </w:r>
+      <w:r>
+        <w:rPr>
+          <w:lang w:eastAsia="zh-CN"/>
+        </w:rPr>
+        <w:t>not</w:t>
+      </w:r>
+      <w:r>
+        <w:rPr>
+          <w:lang w:eastAsia="zh-CN"/>
+        </w:rPr>
+        <w:t xml:space="preserve"> re-tuned</w:t>
+      </w:r>
+      <w:r>
+        <w:rPr>
+          <w:lang w:eastAsia="zh-CN"/>
+        </w:rPr>
+        <w:t>.</w:t>
+      </w:r>
+      <w:r>
+        <w:rPr>
+          <w:lang w:eastAsia="zh-CN"/>
+        </w:rPr>
+        <w:t xml:space="preserve"> What is reported is the result of the first run.</w:t>
       </w:r>
     </w:p>
     <w:p>
@@ -5196,7 +5334,6 @@
     <w:p>
       <w:pPr>
         <w:rPr>
-          <w:rFonts w:hint="eastAsia"/>
           <w:lang w:eastAsia="zh-CN"/>
         </w:rPr>
       </w:pPr>
@@ -5218,14 +5355,46 @@
         <w:rPr>
           <w:lang w:eastAsia="zh-CN"/>
         </w:rPr>
-        <w:t xml:space="preserve"> benchmark. The fourth is the product's design system, which is a set of its own color, </w:t>
+        <w:t xml:space="preserve"> benchmark</w:t>
+      </w:r>
+      <w:r>
+        <w:rPr>
+          <w:lang w:eastAsia="zh-CN"/>
+        </w:rPr>
+        <w:t xml:space="preserve"> (</w:t>
+      </w:r>
+      <w:proofErr w:type="spellStart"/>
+      <w:r>
+        <w:rPr>
+          <w:lang w:eastAsia="zh-CN"/>
+        </w:rPr>
+        <w:t>Koráb</w:t>
+      </w:r>
+      <w:proofErr w:type="spellEnd"/>
+      <w:r>
+        <w:rPr>
+          <w:lang w:eastAsia="zh-CN"/>
+        </w:rPr>
+        <w:t>, 2023</w:t>
+      </w:r>
+      <w:r>
+        <w:rPr>
+          <w:lang w:eastAsia="zh-CN"/>
+        </w:rPr>
+        <w:t>)</w:t>
+      </w:r>
+      <w:r>
+        <w:rPr>
+          <w:lang w:eastAsia="zh-CN"/>
+        </w:rPr>
+        <w:t xml:space="preserve">. The fourth is the product's design system, which is a set of its own color, font, and chart style consistent throughout the whole app. A further illustration is </w:t>
       </w:r>
       <w:r>
         <w:rPr>
           <w:lang w:eastAsia="zh-CN"/>
         </w:rPr>
         <w:lastRenderedPageBreak/>
-        <w:t>font, and chart style consistent throughout the whole app. A further illustration is in Section 5.</w:t>
+        <w:t>in Section 5.</w:t>
       </w:r>
       <w:r>
         <w:rPr>
@@ -5268,9 +5437,6 @@
     <w:p>
       <w:pPr>
         <w:pStyle w:val="Heading1"/>
-        <w:rPr>
-          <w:rFonts w:hint="eastAsia"/>
-        </w:rPr>
       </w:pPr>
       <w:r>
         <w:t>5. The app and the investor journey</w:t>
@@ -5378,25 +5544,123 @@
         <w:rPr>
           <w:lang w:eastAsia="zh-CN"/>
         </w:rPr>
-        <w:t>There are four steps in the journey of investors:</w:t>
+        <w:t xml:space="preserve">The turbulent period in the time machine of the Practice area is pre-calculated. The rules are divided into two layers; the first layer looks at the data: the single-day fluctuation of Combined Equal-Weight is more than twice the daily standard deviation of the whole sample. Such days are marked out, and </w:t>
+      </w:r>
+      <w:r>
+        <w:rPr>
+          <w:lang w:eastAsia="zh-CN"/>
+        </w:rPr>
+        <w:t xml:space="preserve">the </w:t>
+      </w:r>
+      <w:r>
+        <w:rPr>
+          <w:lang w:eastAsia="zh-CN"/>
+        </w:rPr>
+        <w:t>days</w:t>
+      </w:r>
+      <w:r>
+        <w:rPr>
+          <w:lang w:eastAsia="zh-CN"/>
+        </w:rPr>
+        <w:t xml:space="preserve"> close together</w:t>
+      </w:r>
+      <w:r>
+        <w:rPr>
+          <w:lang w:eastAsia="zh-CN"/>
+        </w:rPr>
+        <w:t xml:space="preserve"> are merged into windows. The second layer </w:t>
+      </w:r>
+      <w:r>
+        <w:rPr>
+          <w:lang w:eastAsia="zh-CN"/>
+        </w:rPr>
+        <w:t>adds</w:t>
+      </w:r>
+      <w:r>
+        <w:rPr>
+          <w:lang w:eastAsia="zh-CN"/>
+        </w:rPr>
+        <w:t xml:space="preserve"> history: four named events: Crypto Selloff in May 2021, Bear Market in June 2022,</w:t>
+      </w:r>
+      <w:r>
+        <w:rPr>
+          <w:lang w:eastAsia="zh-CN"/>
+        </w:rPr>
+        <w:t xml:space="preserve"> the November 2022 FTX collapse</w:t>
+      </w:r>
+      <w:r>
+        <w:rPr>
+          <w:lang w:eastAsia="zh-CN"/>
+        </w:rPr>
+        <w:t>,</w:t>
+      </w:r>
+      <w:r>
+        <w:rPr>
+          <w:lang w:eastAsia="zh-CN"/>
+        </w:rPr>
+        <w:t xml:space="preserve"> </w:t>
+      </w:r>
+      <w:r>
+        <w:rPr>
+          <w:lang w:eastAsia="zh-CN"/>
+        </w:rPr>
+        <w:t xml:space="preserve">and </w:t>
+      </w:r>
+      <w:r>
+        <w:rPr>
+          <w:lang w:eastAsia="zh-CN"/>
+        </w:rPr>
+        <w:t xml:space="preserve">Banking Pressure in March 2023. Each extended forward and backward for five trading days. After the two layers are merged, there are a total of 7 windows, which exist in the event calendar. Replay mode usually goes by month, and when entering the window, it automatically slows down to </w:t>
+      </w:r>
+      <w:r>
+        <w:rPr>
+          <w:lang w:eastAsia="zh-CN"/>
+        </w:rPr>
+        <w:t xml:space="preserve">the </w:t>
+      </w:r>
+      <w:r>
+        <w:rPr>
+          <w:lang w:eastAsia="zh-CN"/>
+        </w:rPr>
+        <w:t>day; for Blind Walk mode, any advance in it will stop at the starting point of the next window.</w:t>
       </w:r>
     </w:p>
     <w:p>
       <w:pPr>
-        <w:pStyle w:val="ListParagraph"/>
-        <w:numPr>
-          <w:ilvl w:val="0"/>
-          <w:numId w:val="14"/>
-        </w:numPr>
-        <w:rPr>
-          <w:lang w:eastAsia="zh-CN"/>
-        </w:rPr>
-      </w:pPr>
-      <w:r>
-        <w:rPr>
-          <w:lang w:eastAsia="zh-CN"/>
-        </w:rPr>
-        <w:t>First</w:t>
+        <w:rPr>
+          <w:lang w:eastAsia="zh-CN"/>
+        </w:rPr>
+      </w:pPr>
+      <w:r>
+        <w:rPr>
+          <w:lang w:eastAsia="zh-CN"/>
+        </w:rPr>
+        <w:t xml:space="preserve">The learning cards only appear when the user’s own numbers meet the conditions, and each one only appears once. The net value retreats from its own high point by 10% or 20%, the single-day fluctuation is more than twice the standard deviation in the interval walked, and the combination deviation is more than the original setting by 5 percentage points. At the beginning of the walk-through, there will be no cards issued in the </w:t>
+      </w:r>
+      <w:r>
+        <w:rPr>
+          <w:lang w:eastAsia="zh-CN"/>
+        </w:rPr>
+        <w:t xml:space="preserve">first </w:t>
+      </w:r>
+      <w:r>
+        <w:rPr>
+          <w:lang w:eastAsia="zh-CN"/>
+        </w:rPr>
+        <w:t xml:space="preserve">21 trading days, because before the user has a benchmark, the pop-up reminder is noisy and not suitable for teaching. Each card only says what happened and why, corresponding to the actual numbers of users, and does not evaluate the decision itself. Appendix A4 shows a real example of a journey through the Crypto Selloff in May 2021, triggering a 10% </w:t>
+      </w:r>
+      <w:r>
+        <w:rPr>
+          <w:lang w:eastAsia="zh-CN"/>
+        </w:rPr>
+        <w:t>drawdown</w:t>
+      </w:r>
+      <w:r>
+        <w:rPr>
+          <w:rFonts w:hint="eastAsia"/>
+          <w:lang w:eastAsia="zh-CN"/>
+        </w:rPr>
+        <w:t>,</w:t>
       </w:r>
       <w:r>
         <w:rPr>
@@ -5408,199 +5672,83 @@
         <w:rPr>
           <w:lang w:eastAsia="zh-CN"/>
         </w:rPr>
-        <w:t>-</w:t>
-      </w:r>
-      <w:r>
-        <w:rPr>
-          <w:lang w:eastAsia="zh-CN"/>
-        </w:rPr>
-        <w:t xml:space="preserve"> </w:t>
-      </w:r>
-      <w:r>
-        <w:rPr>
-          <w:lang w:eastAsia="zh-CN"/>
-        </w:rPr>
-        <w:t>Compar</w:t>
-      </w:r>
-      <w:r>
-        <w:rPr>
-          <w:lang w:eastAsia="zh-CN"/>
-        </w:rPr>
-        <w:t>e</w:t>
-      </w:r>
-      <w:r>
-        <w:rPr>
-          <w:lang w:eastAsia="zh-CN"/>
-        </w:rPr>
-        <w:t xml:space="preserve">: the shelf table lists 13 funds on four core indicators, </w:t>
-      </w:r>
-      <w:r>
-        <w:rPr>
-          <w:lang w:eastAsia="zh-CN"/>
-        </w:rPr>
-        <w:t>with the note that sorting changes the order instead of the quality of the fund.</w:t>
+        <w:t>the</w:t>
+      </w:r>
+      <w:r>
+        <w:rPr>
+          <w:lang w:eastAsia="zh-CN"/>
+        </w:rPr>
+        <w:t xml:space="preserve"> 20% </w:t>
+      </w:r>
+      <w:r>
+        <w:rPr>
+          <w:lang w:eastAsia="zh-CN"/>
+        </w:rPr>
+        <w:t>drawdown card, and the largest single-day movement card.</w:t>
       </w:r>
     </w:p>
     <w:p>
       <w:pPr>
-        <w:pStyle w:val="ListParagraph"/>
-        <w:numPr>
-          <w:ilvl w:val="0"/>
-          <w:numId w:val="14"/>
-        </w:numPr>
-        <w:rPr>
-          <w:lang w:eastAsia="zh-CN"/>
-        </w:rPr>
-      </w:pPr>
-      <w:r>
-        <w:rPr>
-          <w:lang w:eastAsia="zh-CN"/>
-        </w:rPr>
-        <w:t>Second</w:t>
-      </w:r>
-      <w:r>
-        <w:rPr>
-          <w:lang w:eastAsia="zh-CN"/>
-        </w:rPr>
-        <w:t xml:space="preserve"> </w:t>
-      </w:r>
-      <w:r>
-        <w:rPr>
-          <w:lang w:eastAsia="zh-CN"/>
-        </w:rPr>
-        <w:t>-</w:t>
-      </w:r>
-      <w:r>
-        <w:rPr>
-          <w:lang w:eastAsia="zh-CN"/>
-        </w:rPr>
-        <w:t xml:space="preserve"> Inspect</w:t>
-      </w:r>
-      <w:r>
-        <w:rPr>
-          <w:lang w:eastAsia="zh-CN"/>
-        </w:rPr>
-        <w:t>: The fact sheet of each fund shows growth</w:t>
-      </w:r>
-      <w:r>
-        <w:rPr>
-          <w:lang w:eastAsia="zh-CN"/>
-        </w:rPr>
-        <w:t xml:space="preserve"> of $1</w:t>
-      </w:r>
-      <w:r>
-        <w:rPr>
-          <w:lang w:eastAsia="zh-CN"/>
-        </w:rPr>
-        <w:t>, draw</w:t>
-      </w:r>
-      <w:r>
-        <w:rPr>
-          <w:lang w:eastAsia="zh-CN"/>
-        </w:rPr>
-        <w:t>down</w:t>
-      </w:r>
-      <w:r>
-        <w:rPr>
-          <w:lang w:eastAsia="zh-CN"/>
-        </w:rPr>
-        <w:t>, target weight</w:t>
-      </w:r>
-      <w:r>
-        <w:rPr>
-          <w:lang w:eastAsia="zh-CN"/>
-        </w:rPr>
-        <w:t>s</w:t>
-      </w:r>
-      <w:r>
-        <w:rPr>
-          <w:lang w:eastAsia="zh-CN"/>
-        </w:rPr>
-        <w:t xml:space="preserve"> and current holding</w:t>
-      </w:r>
-      <w:r>
-        <w:rPr>
-          <w:lang w:eastAsia="zh-CN"/>
-        </w:rPr>
-        <w:t>s</w:t>
-      </w:r>
-      <w:r>
-        <w:rPr>
-          <w:lang w:eastAsia="zh-CN"/>
-        </w:rPr>
-        <w:t>.</w:t>
+        <w:rPr>
+          <w:lang w:eastAsia="zh-CN"/>
+        </w:rPr>
+      </w:pPr>
+      <w:r>
+        <w:rPr>
+          <w:lang w:eastAsia="zh-CN"/>
+        </w:rPr>
+        <w:t>To ensure neutrality, all the copywriting of these cards is concentrated in a static structure, which is audited one by one against a list of forbidden expressions to make sure the vocabulary does not include words such as “best” and “safe”.</w:t>
       </w:r>
     </w:p>
     <w:p>
       <w:pPr>
-        <w:pStyle w:val="ListParagraph"/>
-        <w:numPr>
-          <w:ilvl w:val="0"/>
-          <w:numId w:val="14"/>
-        </w:numPr>
-        <w:rPr>
-          <w:lang w:eastAsia="zh-CN"/>
-        </w:rPr>
-      </w:pPr>
-      <w:r>
-        <w:rPr>
-          <w:lang w:eastAsia="zh-CN"/>
-        </w:rPr>
-        <w:t>Th</w:t>
-      </w:r>
-      <w:r>
-        <w:rPr>
-          <w:lang w:eastAsia="zh-CN"/>
-        </w:rPr>
-        <w:t>ird</w:t>
-      </w:r>
-      <w:r>
-        <w:rPr>
-          <w:lang w:eastAsia="zh-CN"/>
-        </w:rPr>
-        <w:t xml:space="preserve"> </w:t>
-      </w:r>
-      <w:r>
-        <w:rPr>
-          <w:lang w:eastAsia="zh-CN"/>
-        </w:rPr>
-        <w:t>-</w:t>
-      </w:r>
-      <w:r>
-        <w:rPr>
-          <w:lang w:eastAsia="zh-CN"/>
-        </w:rPr>
-        <w:t xml:space="preserve"> Allocate</w:t>
-      </w:r>
-      <w:r>
-        <w:rPr>
-          <w:lang w:eastAsia="zh-CN"/>
-        </w:rPr>
-        <w:t xml:space="preserve">: The user enters a dollar amount and allocates it to each fund, and the historical performance of the portfolio will be given together </w:t>
-      </w:r>
-      <w:r>
-        <w:rPr>
-          <w:lang w:eastAsia="zh-CN"/>
-        </w:rPr>
-        <w:t>with all assumptions.</w:t>
+        <w:rPr>
+          <w:lang w:eastAsia="zh-CN"/>
+        </w:rPr>
+      </w:pPr>
+      <w:r>
+        <w:rPr>
+          <w:lang w:eastAsia="zh-CN"/>
+        </w:rPr>
+        <w:lastRenderedPageBreak/>
+        <w:t>T</w:t>
+      </w:r>
+      <w:r>
+        <w:rPr>
+          <w:lang w:eastAsia="zh-CN"/>
+        </w:rPr>
+        <w:t>he design of this app is to better help two type</w:t>
+      </w:r>
+      <w:r>
+        <w:rPr>
+          <w:lang w:eastAsia="zh-CN"/>
+        </w:rPr>
+        <w:t>s</w:t>
+      </w:r>
+      <w:r>
+        <w:rPr>
+          <w:lang w:eastAsia="zh-CN"/>
+        </w:rPr>
+        <w:t xml:space="preserve"> of investo</w:t>
+      </w:r>
+      <w:r>
+        <w:rPr>
+          <w:lang w:eastAsia="zh-CN"/>
+        </w:rPr>
+        <w:t>rs, which are novice independent investors and experienced independent investors. For the first type of investor, the app could help them make their own decisions by providing supporting evidence in plain language. And for the second type, users can switch to Professional mode to see the complete method description. The two types of users see the same set of numbers. The user journey is presented as below:</w:t>
       </w:r>
     </w:p>
     <w:p>
       <w:pPr>
-        <w:pStyle w:val="ListParagraph"/>
-        <w:numPr>
-          <w:ilvl w:val="0"/>
-          <w:numId w:val="14"/>
-        </w:numPr>
-        <w:rPr>
-          <w:lang w:eastAsia="zh-CN"/>
-        </w:rPr>
-      </w:pPr>
-      <w:r>
-        <w:rPr>
-          <w:lang w:eastAsia="zh-CN"/>
-        </w:rPr>
-        <w:t>Fourth</w:t>
+        <w:rPr>
+          <w:lang w:eastAsia="zh-CN"/>
+        </w:rPr>
+      </w:pPr>
+      <w:r>
+        <w:rPr>
+          <w:lang w:eastAsia="zh-CN"/>
+        </w:rPr>
+        <w:t>First</w:t>
       </w:r>
       <w:r>
         <w:rPr>
@@ -5624,7 +5772,7 @@
         <w:rPr>
           <w:lang w:eastAsia="zh-CN"/>
         </w:rPr>
-        <w:t>Explor</w:t>
+        <w:t>Compar</w:t>
       </w:r>
       <w:r>
         <w:rPr>
@@ -5636,90 +5784,35 @@
         <w:rPr>
           <w:lang w:eastAsia="zh-CN"/>
         </w:rPr>
-        <w:t>: The sentiment page provides a multiple-choice comparison and standardized view of the industry index. The permanent sentence is that it describes the tone of news and does not represent a trading signal.</w:t>
-      </w:r>
-    </w:p>
-    <w:p>
-      <w:pPr>
-        <w:rPr>
-          <w:lang w:eastAsia="zh-CN"/>
-        </w:rPr>
-      </w:pPr>
-      <w:r>
-        <w:rPr>
-          <w:lang w:eastAsia="zh-CN"/>
-        </w:rPr>
-        <w:t xml:space="preserve">The saved combination will enter My </w:t>
-      </w:r>
-      <w:r>
-        <w:rPr>
-          <w:lang w:eastAsia="zh-CN"/>
-        </w:rPr>
-        <w:t>P</w:t>
-      </w:r>
-      <w:r>
-        <w:rPr>
-          <w:lang w:eastAsia="zh-CN"/>
-        </w:rPr>
-        <w:t xml:space="preserve">ortfolio and can be sent back to the practice area for a time machine walkthrough at any time. Keep the same line for the whole journey that </w:t>
-      </w:r>
-      <w:proofErr w:type="spellStart"/>
-      <w:r>
-        <w:rPr>
-          <w:lang w:eastAsia="zh-CN"/>
-        </w:rPr>
-        <w:t>HyperInvest</w:t>
-      </w:r>
-      <w:proofErr w:type="spellEnd"/>
-      <w:r>
-        <w:rPr>
-          <w:lang w:eastAsia="zh-CN"/>
-        </w:rPr>
-        <w:t xml:space="preserve"> is an evidence layer</w:t>
-      </w:r>
-      <w:r>
-        <w:rPr>
-          <w:lang w:eastAsia="zh-CN"/>
-        </w:rPr>
-        <w:t xml:space="preserve"> rather than an advice layer</w:t>
-      </w:r>
-      <w:r>
-        <w:rPr>
-          <w:lang w:eastAsia="zh-CN"/>
-        </w:rPr>
-        <w:t xml:space="preserve">, and the app itself does not recommend any fund; no </w:t>
-      </w:r>
-      <w:r>
-        <w:rPr>
-          <w:lang w:eastAsia="zh-CN"/>
-        </w:rPr>
-        <w:t xml:space="preserve">mixed </w:t>
-      </w:r>
-      <w:r>
-        <w:rPr>
-          <w:lang w:eastAsia="zh-CN"/>
-        </w:rPr>
-        <w:t>is scored, and it is always decided to leave it to users,</w:t>
-      </w:r>
-    </w:p>
-    <w:p>
-      <w:pPr>
-        <w:jc w:val="center"/>
-        <w:rPr>
-          <w:highlight w:val="yellow"/>
-        </w:rPr>
-      </w:pPr>
+        <w:t xml:space="preserve">: the shelf table lists 13 funds on four core indicators, </w:t>
+      </w:r>
+      <w:r>
+        <w:rPr>
+          <w:lang w:eastAsia="zh-CN"/>
+        </w:rPr>
+        <w:t>with the note that sorting changes the order instead of the quality of the fund</w:t>
+      </w:r>
+      <w:r>
+        <w:rPr>
+          <w:lang w:eastAsia="zh-CN"/>
+        </w:rPr>
+        <w:t>.</w:t>
+      </w:r>
       <w:r>
         <w:rPr>
           <w:noProof/>
-          <w:highlight w:val="yellow"/>
-        </w:rPr>
-        <w:lastRenderedPageBreak/>
+        </w:rPr>
+        <w:t xml:space="preserve"> (Product view 1)</w:t>
+      </w:r>
+      <w:r>
+        <w:rPr>
+          <w:noProof/>
+        </w:rPr>
         <w:drawing>
-          <wp:inline distT="0" distB="0" distL="0" distR="0" wp14:anchorId="764DA2E6" wp14:editId="1B6F41BA">
+          <wp:inline distT="0" distB="0" distL="0" distR="0" wp14:anchorId="18652864" wp14:editId="616D437D">
             <wp:extent cx="5486400" cy="3429000"/>
             <wp:effectExtent l="0" t="0" r="0" b="0"/>
-            <wp:docPr id="5" name="Picture 5"/>
+            <wp:docPr id="1544579372" name="Picture 1544579372"/>
             <wp:cNvGraphicFramePr>
               <a:graphicFrameLocks xmlns:a="http://schemas.openxmlformats.org/drawingml/2006/main" noChangeAspect="1"/>
             </wp:cNvGraphicFramePr>
@@ -5751,42 +5844,135 @@
           </wp:inline>
         </w:drawing>
       </w:r>
+      <w:r>
+        <w:rPr>
+          <w:b/>
+          <w:bCs/>
+          <w:color w:val="990F3D"/>
+          <w:sz w:val="18"/>
+          <w:szCs w:val="18"/>
+        </w:rPr>
+        <w:t xml:space="preserve">Product view 1 — </w:t>
+      </w:r>
+      <w:r>
+        <w:rPr>
+          <w:b/>
+          <w:bCs/>
+          <w:color w:val="6B625C"/>
+          <w:sz w:val="18"/>
+          <w:szCs w:val="18"/>
+        </w:rPr>
+        <w:t>The fund shelf: all thirteen funds compared on the four core measures (plain-English mode), with the standing note that sorting changes order, not merit.</w:t>
+      </w:r>
     </w:p>
     <w:p>
       <w:pPr>
-        <w:pStyle w:val="Caption"/>
-        <w:jc w:val="center"/>
-      </w:pPr>
-      <w:r>
-        <w:rPr>
-          <w:color w:val="990F3D"/>
-        </w:rPr>
-        <w:t xml:space="preserve">Product view 1 — </w:t>
-      </w:r>
-      <w:r>
-        <w:rPr>
-          <w:color w:val="6B625C"/>
-        </w:rPr>
-        <w:t>The fund shelf: all thirteen funds compared on the four core measures (plain-English mode), with the standing note that sorting changes order, not merit.</w:t>
-      </w:r>
-    </w:p>
-    <w:p>
-      <w:pPr>
-        <w:jc w:val="center"/>
-        <w:rPr>
-          <w:highlight w:val="yellow"/>
-        </w:rPr>
-      </w:pPr>
+        <w:rPr>
+          <w:lang w:eastAsia="zh-CN"/>
+        </w:rPr>
+      </w:pPr>
+      <w:r>
+        <w:rPr>
+          <w:lang w:eastAsia="zh-CN"/>
+        </w:rPr>
+        <w:t>Second</w:t>
+      </w:r>
+      <w:r>
+        <w:rPr>
+          <w:lang w:eastAsia="zh-CN"/>
+        </w:rPr>
+        <w:t xml:space="preserve"> </w:t>
+      </w:r>
+      <w:r>
+        <w:rPr>
+          <w:lang w:eastAsia="zh-CN"/>
+        </w:rPr>
+        <w:t>-</w:t>
+      </w:r>
+      <w:r>
+        <w:rPr>
+          <w:lang w:eastAsia="zh-CN"/>
+        </w:rPr>
+        <w:t xml:space="preserve"> Inspect</w:t>
+      </w:r>
+      <w:r>
+        <w:rPr>
+          <w:lang w:eastAsia="zh-CN"/>
+        </w:rPr>
+        <w:t>: The fact sheet of each fund shows growth</w:t>
+      </w:r>
+      <w:r>
+        <w:rPr>
+          <w:lang w:eastAsia="zh-CN"/>
+        </w:rPr>
+        <w:t xml:space="preserve"> of $1</w:t>
+      </w:r>
+      <w:r>
+        <w:rPr>
+          <w:lang w:eastAsia="zh-CN"/>
+        </w:rPr>
+        <w:t>, draw</w:t>
+      </w:r>
+      <w:r>
+        <w:rPr>
+          <w:lang w:eastAsia="zh-CN"/>
+        </w:rPr>
+        <w:t>down</w:t>
+      </w:r>
+      <w:r>
+        <w:rPr>
+          <w:lang w:eastAsia="zh-CN"/>
+        </w:rPr>
+        <w:t>, target weight</w:t>
+      </w:r>
+      <w:r>
+        <w:rPr>
+          <w:lang w:eastAsia="zh-CN"/>
+        </w:rPr>
+        <w:t>s</w:t>
+      </w:r>
+      <w:r>
+        <w:rPr>
+          <w:lang w:eastAsia="zh-CN"/>
+        </w:rPr>
+        <w:t xml:space="preserve"> and current holding</w:t>
+      </w:r>
+      <w:r>
+        <w:rPr>
+          <w:lang w:eastAsia="zh-CN"/>
+        </w:rPr>
+        <w:t>s</w:t>
+      </w:r>
+      <w:r>
+        <w:rPr>
+          <w:lang w:eastAsia="zh-CN"/>
+        </w:rPr>
+        <w:t>.</w:t>
+      </w:r>
+      <w:r>
+        <w:rPr>
+          <w:lang w:eastAsia="zh-CN"/>
+        </w:rPr>
+        <w:t xml:space="preserve"> (Product view 2)</w:t>
+      </w:r>
       <w:r>
         <w:rPr>
           <w:noProof/>
           <w:highlight w:val="yellow"/>
         </w:rPr>
+        <w:t xml:space="preserve"> </w:t>
+      </w:r>
+      <w:r>
+        <w:rPr>
+          <w:noProof/>
+          <w:highlight w:val="yellow"/>
+        </w:rPr>
+        <w:lastRenderedPageBreak/>
         <w:drawing>
-          <wp:inline distT="0" distB="0" distL="0" distR="0" wp14:anchorId="16392CE7" wp14:editId="2A7C5377">
+          <wp:inline distT="0" distB="0" distL="0" distR="0" wp14:anchorId="681C8B17" wp14:editId="5E07FE42">
             <wp:extent cx="5486400" cy="3429000"/>
             <wp:effectExtent l="0" t="0" r="0" b="0"/>
-            <wp:docPr id="6" name="Picture 6"/>
+            <wp:docPr id="960783034" name="Picture 960783034"/>
             <wp:cNvGraphicFramePr>
               <a:graphicFrameLocks xmlns:a="http://schemas.openxmlformats.org/drawingml/2006/main" noChangeAspect="1"/>
             </wp:cNvGraphicFramePr>
@@ -5818,43 +6004,125 @@
           </wp:inline>
         </w:drawing>
       </w:r>
+      <w:r>
+        <w:rPr>
+          <w:b/>
+          <w:bCs/>
+          <w:color w:val="990F3D"/>
+          <w:sz w:val="18"/>
+          <w:szCs w:val="18"/>
+        </w:rPr>
+        <w:t xml:space="preserve">Product view 2 — </w:t>
+      </w:r>
+      <w:r>
+        <w:rPr>
+          <w:b/>
+          <w:bCs/>
+          <w:color w:val="6B625C"/>
+          <w:sz w:val="18"/>
+          <w:szCs w:val="18"/>
+        </w:rPr>
+        <w:t>A fund fact sheet: headline measures with reading instructions, the one-line method description, and the construction block showing the rule applied to the fund's own latest numbers.</w:t>
+      </w:r>
     </w:p>
     <w:p>
       <w:pPr>
-        <w:pStyle w:val="Caption"/>
         <w:jc w:val="center"/>
-      </w:pPr>
-      <w:r>
-        <w:rPr>
-          <w:color w:val="990F3D"/>
-        </w:rPr>
-        <w:t xml:space="preserve">Product view 2 — </w:t>
-      </w:r>
-      <w:r>
-        <w:rPr>
-          <w:color w:val="6B625C"/>
-        </w:rPr>
-        <w:t>A fund fact sheet: headline measures with reading instructions, the one-line method description, and the construction block showing the rule applied to the fund's own latest numbers.</w:t>
+        <w:rPr>
+          <w:lang w:eastAsia="zh-CN"/>
+        </w:rPr>
+      </w:pPr>
+      <w:r>
+        <w:rPr>
+          <w:lang w:eastAsia="zh-CN"/>
+        </w:rPr>
+        <w:br/>
       </w:r>
     </w:p>
     <w:p>
       <w:pPr>
-        <w:jc w:val="center"/>
-        <w:rPr>
-          <w:highlight w:val="yellow"/>
-        </w:rPr>
-      </w:pPr>
-      <w:r>
         <w:rPr>
           <w:noProof/>
-          <w:highlight w:val="yellow"/>
+        </w:rPr>
+      </w:pPr>
+      <w:r>
+        <w:rPr>
+          <w:lang w:eastAsia="zh-CN"/>
+        </w:rPr>
+        <w:br w:type="page"/>
+      </w:r>
+      <w:r>
+        <w:rPr>
+          <w:lang w:eastAsia="zh-CN"/>
         </w:rPr>
         <w:lastRenderedPageBreak/>
+        <w:t>Th</w:t>
+      </w:r>
+      <w:r>
+        <w:rPr>
+          <w:lang w:eastAsia="zh-CN"/>
+        </w:rPr>
+        <w:t>ird</w:t>
+      </w:r>
+      <w:r>
+        <w:rPr>
+          <w:lang w:eastAsia="zh-CN"/>
+        </w:rPr>
+        <w:t xml:space="preserve"> </w:t>
+      </w:r>
+      <w:r>
+        <w:rPr>
+          <w:lang w:eastAsia="zh-CN"/>
+        </w:rPr>
+        <w:t>-</w:t>
+      </w:r>
+      <w:r>
+        <w:rPr>
+          <w:lang w:eastAsia="zh-CN"/>
+        </w:rPr>
+        <w:t xml:space="preserve"> Allocate</w:t>
+      </w:r>
+      <w:r>
+        <w:rPr>
+          <w:lang w:eastAsia="zh-CN"/>
+        </w:rPr>
+        <w:t xml:space="preserve">: The user enters a dollar amount and allocates it to each fund, and the historical performance of the portfolio will be given </w:t>
+      </w:r>
+      <w:r>
+        <w:rPr>
+          <w:lang w:eastAsia="zh-CN"/>
+        </w:rPr>
+        <w:t xml:space="preserve">together </w:t>
+      </w:r>
+      <w:r>
+        <w:rPr>
+          <w:lang w:eastAsia="zh-CN"/>
+        </w:rPr>
+        <w:t>with all assumptions.</w:t>
+      </w:r>
+      <w:r>
+        <w:rPr>
+          <w:noProof/>
+        </w:rPr>
+        <w:t xml:space="preserve"> (Product view 3)</w:t>
+      </w:r>
+    </w:p>
+    <w:p>
+      <w:pPr>
+        <w:rPr>
+          <w:lang w:eastAsia="zh-CN"/>
+        </w:rPr>
+      </w:pPr>
+      <w:r>
+        <w:rPr>
+          <w:noProof/>
+          <w:lang w:eastAsia="zh-CN"/>
+        </w:rPr>
         <w:drawing>
-          <wp:inline distT="0" distB="0" distL="0" distR="0" wp14:anchorId="7E9AC2E2" wp14:editId="12336352">
-            <wp:extent cx="5486400" cy="3429000"/>
-            <wp:effectExtent l="0" t="0" r="0" b="0"/>
-            <wp:docPr id="7" name="Picture 7"/>
+          <wp:inline distT="0" distB="0" distL="0" distR="0" wp14:anchorId="10637344" wp14:editId="614A85E9">
+            <wp:extent cx="5486400" cy="6737985"/>
+            <wp:effectExtent l="0" t="0" r="0" b="5715"/>
+            <wp:docPr id="141132302" name="Picture 1"/>
             <wp:cNvGraphicFramePr>
               <a:graphicFrameLocks xmlns:a="http://schemas.openxmlformats.org/drawingml/2006/main" noChangeAspect="1"/>
             </wp:cNvGraphicFramePr>
@@ -5862,7 +6130,7 @@
               <a:graphicData uri="http://schemas.openxmlformats.org/drawingml/2006/picture">
                 <pic:pic xmlns:pic="http://schemas.openxmlformats.org/drawingml/2006/picture">
                   <pic:nvPicPr>
-                    <pic:cNvPr id="0" name="app_blind_walk.png"/>
+                    <pic:cNvPr id="141132302" name="Picture 141132302"/>
                     <pic:cNvPicPr/>
                   </pic:nvPicPr>
                   <pic:blipFill>
@@ -5874,7 +6142,7 @@
                   <pic:spPr>
                     <a:xfrm>
                       <a:off x="0" y="0"/>
-                      <a:ext cx="5486400" cy="3429000"/>
+                      <a:ext cx="5486400" cy="6737985"/>
                     </a:xfrm>
                     <a:prstGeom prst="rect">
                       <a:avLst/>
@@ -5886,42 +6154,126 @@
           </wp:inline>
         </w:drawing>
       </w:r>
+      <w:r>
+        <w:rPr>
+          <w:b/>
+          <w:bCs/>
+          <w:color w:val="990F3D"/>
+          <w:sz w:val="18"/>
+          <w:szCs w:val="18"/>
+        </w:rPr>
+        <w:t xml:space="preserve">Product view 3 — </w:t>
+      </w:r>
+      <w:r>
+        <w:rPr>
+          <w:b/>
+          <w:bCs/>
+          <w:color w:val="6B625C"/>
+          <w:sz w:val="18"/>
+          <w:szCs w:val="18"/>
+        </w:rPr>
+        <w:t>The allocation step: a dollar amount is entered first, then placed across the funds, with each fund's live share of the mix shown as it is typed</w:t>
+      </w:r>
     </w:p>
     <w:p>
       <w:pPr>
-        <w:pStyle w:val="Caption"/>
-        <w:jc w:val="center"/>
-      </w:pPr>
-      <w:r>
-        <w:rPr>
-          <w:color w:val="990F3D"/>
-        </w:rPr>
-        <w:t xml:space="preserve">Product view 3 — </w:t>
-      </w:r>
-      <w:r>
-        <w:rPr>
-          <w:color w:val="6B625C"/>
-        </w:rPr>
-        <w:t>The Practice time machine in Blind walk: the future is hidden, a turbulent stretch (the May 2021 crypto sell-off) slows travel to daily steps, and forward movement pauses at window starts.</w:t>
+        <w:rPr>
+          <w:lang w:eastAsia="zh-CN"/>
+        </w:rPr>
+      </w:pPr>
+      <w:r>
+        <w:rPr>
+          <w:lang w:eastAsia="zh-CN"/>
+        </w:rPr>
+        <w:br w:type="page"/>
       </w:r>
     </w:p>
     <w:p>
       <w:pPr>
-        <w:jc w:val="center"/>
-        <w:rPr>
-          <w:highlight w:val="yellow"/>
-        </w:rPr>
-      </w:pPr>
-      <w:r>
         <w:rPr>
           <w:noProof/>
-          <w:highlight w:val="yellow"/>
+          <w:lang w:eastAsia="zh-CN"/>
+        </w:rPr>
+      </w:pPr>
+      <w:r>
+        <w:rPr>
+          <w:lang w:eastAsia="zh-CN"/>
+        </w:rPr>
+        <w:lastRenderedPageBreak/>
+        <w:t>F</w:t>
+      </w:r>
+      <w:r>
+        <w:rPr>
+          <w:lang w:eastAsia="zh-CN"/>
+        </w:rPr>
+        <w:t>ourth</w:t>
+      </w:r>
+      <w:r>
+        <w:rPr>
+          <w:lang w:eastAsia="zh-CN"/>
+        </w:rPr>
+        <w:t xml:space="preserve"> </w:t>
+      </w:r>
+      <w:r>
+        <w:rPr>
+          <w:lang w:eastAsia="zh-CN"/>
+        </w:rPr>
+        <w:t>-</w:t>
+      </w:r>
+      <w:r>
+        <w:rPr>
+          <w:lang w:eastAsia="zh-CN"/>
+        </w:rPr>
+        <w:t xml:space="preserve"> </w:t>
+      </w:r>
+      <w:r>
+        <w:rPr>
+          <w:lang w:eastAsia="zh-CN"/>
+        </w:rPr>
+        <w:t>Explor</w:t>
+      </w:r>
+      <w:r>
+        <w:rPr>
+          <w:lang w:eastAsia="zh-CN"/>
+        </w:rPr>
+        <w:t>e</w:t>
+      </w:r>
+      <w:r>
+        <w:rPr>
+          <w:lang w:eastAsia="zh-CN"/>
+        </w:rPr>
+        <w:t>: The sentiment page provides a multiple-choice comparison and standardized view of the industry index. The permanent sentence is that it describes the tone of news and does not represent a trading signal.</w:t>
+      </w:r>
+      <w:r>
+        <w:rPr>
+          <w:lang w:eastAsia="zh-CN"/>
+        </w:rPr>
+        <w:t xml:space="preserve"> </w:t>
+      </w:r>
+      <w:r>
+        <w:rPr>
+          <w:noProof/>
+          <w:lang w:eastAsia="zh-CN"/>
+        </w:rPr>
+        <w:t>(Product view 3)</w:t>
+      </w:r>
+    </w:p>
+    <w:p>
+      <w:pPr>
+        <w:rPr>
+          <w:noProof/>
+          <w:lang w:eastAsia="zh-CN"/>
+        </w:rPr>
+      </w:pPr>
+      <w:r>
+        <w:rPr>
+          <w:noProof/>
         </w:rPr>
         <w:drawing>
-          <wp:inline distT="0" distB="0" distL="0" distR="0" wp14:anchorId="587606FF" wp14:editId="42F7460B">
+          <wp:inline distT="0" distB="0" distL="0" distR="0" wp14:anchorId="28E7A80E" wp14:editId="5A26E27F">
             <wp:extent cx="5486400" cy="3429000"/>
             <wp:effectExtent l="0" t="0" r="0" b="0"/>
-            <wp:docPr id="8" name="Picture 8"/>
+            <wp:docPr id="1536942778" name="Picture 1536942778"/>
             <wp:cNvGraphicFramePr>
               <a:graphicFrameLocks xmlns:a="http://schemas.openxmlformats.org/drawingml/2006/main" noChangeAspect="1"/>
             </wp:cNvGraphicFramePr>
@@ -5953,122 +6305,241 @@
           </wp:inline>
         </w:drawing>
       </w:r>
+      <w:r>
+        <w:rPr>
+          <w:b/>
+          <w:bCs/>
+          <w:color w:val="990F3D"/>
+          <w:sz w:val="18"/>
+          <w:szCs w:val="18"/>
+        </w:rPr>
+        <w:t xml:space="preserve">Product view </w:t>
+      </w:r>
+      <w:r>
+        <w:rPr>
+          <w:b/>
+          <w:bCs/>
+          <w:color w:val="990F3D"/>
+          <w:sz w:val="18"/>
+          <w:szCs w:val="18"/>
+        </w:rPr>
+        <w:t>4</w:t>
+      </w:r>
+      <w:r>
+        <w:rPr>
+          <w:b/>
+          <w:bCs/>
+          <w:color w:val="990F3D"/>
+          <w:sz w:val="18"/>
+          <w:szCs w:val="18"/>
+        </w:rPr>
+        <w:t xml:space="preserve"> — </w:t>
+      </w:r>
+      <w:r>
+        <w:rPr>
+          <w:b/>
+          <w:bCs/>
+          <w:color w:val="6B625C"/>
+          <w:sz w:val="18"/>
+          <w:szCs w:val="18"/>
+        </w:rPr>
+        <w:t>The sentiment tab: sector news tone with multi-select comparison and the standardized view, under the permanent not-a-signal disclaimer.</w:t>
+      </w:r>
     </w:p>
     <w:p>
       <w:pPr>
-        <w:pStyle w:val="Caption"/>
-        <w:jc w:val="center"/>
-      </w:pPr>
-      <w:r>
-        <w:rPr>
-          <w:color w:val="990F3D"/>
-        </w:rPr>
-        <w:t xml:space="preserve">Product view 4 — </w:t>
-      </w:r>
-      <w:r>
-        <w:rPr>
-          <w:color w:val="6B625C"/>
-        </w:rPr>
-        <w:t>The sentiment tab: sector news tone with multi-select comparison and the standardised view, under the permanent not-a-signal disclaimer.</w:t>
+        <w:rPr>
+          <w:lang w:eastAsia="zh-CN"/>
+        </w:rPr>
+      </w:pPr>
+      <w:r>
+        <w:rPr>
+          <w:lang w:eastAsia="zh-CN"/>
+        </w:rPr>
+        <w:t xml:space="preserve">The saved combination will </w:t>
+      </w:r>
+      <w:r>
+        <w:rPr>
+          <w:lang w:eastAsia="zh-CN"/>
+        </w:rPr>
+        <w:t>be added to</w:t>
+      </w:r>
+      <w:r>
+        <w:rPr>
+          <w:lang w:eastAsia="zh-CN"/>
+        </w:rPr>
+        <w:t xml:space="preserve"> My </w:t>
+      </w:r>
+      <w:r>
+        <w:rPr>
+          <w:lang w:eastAsia="zh-CN"/>
+        </w:rPr>
+        <w:t>P</w:t>
+      </w:r>
+      <w:r>
+        <w:rPr>
+          <w:lang w:eastAsia="zh-CN"/>
+        </w:rPr>
+        <w:t>ortfolio and can be sent back to the practice area for a time machine walkthrough at any time</w:t>
+      </w:r>
+      <w:r>
+        <w:rPr>
+          <w:lang w:eastAsia="zh-CN"/>
+        </w:rPr>
+        <w:t xml:space="preserve"> (Product view </w:t>
+      </w:r>
+      <w:r>
+        <w:rPr>
+          <w:lang w:eastAsia="zh-CN"/>
+        </w:rPr>
+        <w:t>5</w:t>
+      </w:r>
+      <w:r>
+        <w:rPr>
+          <w:lang w:eastAsia="zh-CN"/>
+        </w:rPr>
+        <w:t>)</w:t>
+      </w:r>
+      <w:r>
+        <w:rPr>
+          <w:lang w:eastAsia="zh-CN"/>
+        </w:rPr>
+        <w:t xml:space="preserve">. Keep the same line for the whole journey that </w:t>
+      </w:r>
+      <w:proofErr w:type="spellStart"/>
+      <w:r>
+        <w:rPr>
+          <w:lang w:eastAsia="zh-CN"/>
+        </w:rPr>
+        <w:t>HyperInvest</w:t>
+      </w:r>
+      <w:proofErr w:type="spellEnd"/>
+      <w:r>
+        <w:rPr>
+          <w:lang w:eastAsia="zh-CN"/>
+        </w:rPr>
+        <w:t xml:space="preserve"> is an evidence layer</w:t>
+      </w:r>
+      <w:r>
+        <w:rPr>
+          <w:lang w:eastAsia="zh-CN"/>
+        </w:rPr>
+        <w:t xml:space="preserve"> rather than an advice layer</w:t>
+      </w:r>
+      <w:r>
+        <w:rPr>
+          <w:lang w:eastAsia="zh-CN"/>
+        </w:rPr>
+        <w:t xml:space="preserve">, and the app itself does not recommend any fund; no </w:t>
+      </w:r>
+      <w:r>
+        <w:rPr>
+          <w:lang w:eastAsia="zh-CN"/>
+        </w:rPr>
+        <w:t xml:space="preserve">mixed </w:t>
+      </w:r>
+      <w:r>
+        <w:rPr>
+          <w:lang w:eastAsia="zh-CN"/>
+        </w:rPr>
+        <w:t>is scored, and it is always decided to leave it to users,</w:t>
       </w:r>
     </w:p>
     <w:p>
       <w:pPr>
-        <w:pStyle w:val="Heading1"/>
-        <w:rPr>
-          <w:rFonts w:hint="eastAsia"/>
-        </w:rPr>
-      </w:pPr>
-      <w:r>
+        <w:rPr>
+          <w:lang w:eastAsia="zh-CN"/>
+        </w:rPr>
+      </w:pPr>
+      <w:r>
+        <w:rPr>
+          <w:noProof/>
+          <w:highlight w:val="yellow"/>
+        </w:rPr>
         <w:lastRenderedPageBreak/>
-        <w:t>6. Critical reflection and recommendations</w:t>
+        <w:drawing>
+          <wp:inline distT="0" distB="0" distL="0" distR="0" wp14:anchorId="1B7AD7F3" wp14:editId="52BB3348">
+            <wp:extent cx="5486400" cy="3429000"/>
+            <wp:effectExtent l="0" t="0" r="4445" b="2540"/>
+            <wp:docPr id="65491481" name="Picture 65491481"/>
+            <wp:cNvGraphicFramePr>
+              <a:graphicFrameLocks xmlns:a="http://schemas.openxmlformats.org/drawingml/2006/main" noChangeAspect="1"/>
+            </wp:cNvGraphicFramePr>
+            <a:graphic xmlns:a="http://schemas.openxmlformats.org/drawingml/2006/main">
+              <a:graphicData uri="http://schemas.openxmlformats.org/drawingml/2006/picture">
+                <pic:pic xmlns:pic="http://schemas.openxmlformats.org/drawingml/2006/picture">
+                  <pic:nvPicPr>
+                    <pic:cNvPr id="0" name="app_blind_walk.png"/>
+                    <pic:cNvPicPr/>
+                  </pic:nvPicPr>
+                  <pic:blipFill>
+                    <a:blip r:embed="rId16"/>
+                    <a:stretch>
+                      <a:fillRect/>
+                    </a:stretch>
+                  </pic:blipFill>
+                  <pic:spPr>
+                    <a:xfrm>
+                      <a:off x="0" y="0"/>
+                      <a:ext cx="5486400" cy="3429000"/>
+                    </a:xfrm>
+                    <a:prstGeom prst="rect">
+                      <a:avLst/>
+                    </a:prstGeom>
+                  </pic:spPr>
+                </pic:pic>
+              </a:graphicData>
+            </a:graphic>
+          </wp:inline>
+        </w:drawing>
+      </w:r>
+      <w:r>
+        <w:rPr>
+          <w:b/>
+          <w:bCs/>
+          <w:color w:val="990F3D"/>
+          <w:sz w:val="18"/>
+          <w:szCs w:val="18"/>
+        </w:rPr>
+        <w:t xml:space="preserve">Product view </w:t>
+      </w:r>
+      <w:r>
+        <w:rPr>
+          <w:b/>
+          <w:bCs/>
+          <w:color w:val="990F3D"/>
+          <w:sz w:val="18"/>
+          <w:szCs w:val="18"/>
+        </w:rPr>
+        <w:t>5</w:t>
+      </w:r>
+      <w:r>
+        <w:rPr>
+          <w:b/>
+          <w:bCs/>
+          <w:color w:val="990F3D"/>
+          <w:sz w:val="18"/>
+          <w:szCs w:val="18"/>
+        </w:rPr>
+        <w:t xml:space="preserve"> — </w:t>
+      </w:r>
+      <w:r>
+        <w:rPr>
+          <w:b/>
+          <w:bCs/>
+          <w:color w:val="6B625C"/>
+          <w:sz w:val="18"/>
+          <w:szCs w:val="18"/>
+        </w:rPr>
+        <w:t>The Practice time machine in Blind walk: the future is hidden, a turbulent stretch (the May 2021 crypto sell-off) slows travel to daily steps, and forward movement pauses at window starts.</w:t>
       </w:r>
     </w:p>
     <w:p>
       <w:pPr>
-        <w:rPr>
-          <w:lang w:eastAsia="zh-CN"/>
-        </w:rPr>
-      </w:pPr>
-      <w:r>
-        <w:rPr>
-          <w:lang w:eastAsia="zh-CN"/>
-        </w:rPr>
-        <w:t>After review</w:t>
-      </w:r>
-      <w:r>
-        <w:rPr>
-          <w:lang w:eastAsia="zh-CN"/>
-        </w:rPr>
-        <w:t>ing</w:t>
-      </w:r>
-      <w:r>
-        <w:rPr>
-          <w:lang w:eastAsia="zh-CN"/>
-        </w:rPr>
-        <w:t xml:space="preserve"> the whole project, the most effective thing is not a certain result, but discipline.</w:t>
-      </w:r>
-      <w:r>
-        <w:rPr>
-          <w:lang w:eastAsia="zh-CN"/>
-        </w:rPr>
-        <w:t xml:space="preserve"> The weight is only formed by past data, the </w:t>
-      </w:r>
-      <w:r>
-        <w:rPr>
-          <w:lang w:eastAsia="zh-CN"/>
-        </w:rPr>
-        <w:t>sentiment</w:t>
-      </w:r>
-      <w:r>
-        <w:rPr>
-          <w:lang w:eastAsia="zh-CN"/>
-        </w:rPr>
-        <w:t xml:space="preserve"> signals </w:t>
-      </w:r>
-      <w:proofErr w:type="gramStart"/>
-      <w:r>
-        <w:rPr>
-          <w:lang w:eastAsia="zh-CN"/>
-        </w:rPr>
-        <w:t>is</w:t>
-      </w:r>
-      <w:proofErr w:type="gramEnd"/>
-      <w:r>
-        <w:rPr>
-          <w:lang w:eastAsia="zh-CN"/>
-        </w:rPr>
-        <w:t xml:space="preserve"> forced to lag one trading day, and the output of the solver is compared across methods every time it is constructed. These checks detected mistakes. The </w:t>
-      </w:r>
-      <w:r>
-        <w:rPr>
-          <w:lang w:eastAsia="zh-CN"/>
-        </w:rPr>
-        <w:t>solver’s silent stalling</w:t>
-      </w:r>
-      <w:r>
-        <w:rPr>
-          <w:lang w:eastAsia="zh-CN"/>
-        </w:rPr>
-        <w:t xml:space="preserve"> and the </w:t>
-      </w:r>
-      <w:r>
-        <w:rPr>
-          <w:lang w:eastAsia="zh-CN"/>
-        </w:rPr>
-        <w:t>look-ahead in the sentiment signal were caught in this way</w:t>
-      </w:r>
-      <w:r>
-        <w:rPr>
-          <w:lang w:eastAsia="zh-CN"/>
-        </w:rPr>
-        <w:t>. Another valid judgment is that neutrality and usefulness can coexist; the plain language teaches how to read and understand the evidenc</w:t>
-      </w:r>
-      <w:r>
-        <w:rPr>
-          <w:lang w:eastAsia="zh-CN"/>
-        </w:rPr>
-        <w:t>e, not choose for users.</w:t>
+        <w:pStyle w:val="Heading1"/>
+      </w:pPr>
+      <w:r>
+        <w:t>6. Critical reflection and recommendations</w:t>
       </w:r>
     </w:p>
     <w:p>
@@ -6081,21 +6552,79 @@
         <w:rPr>
           <w:lang w:eastAsia="zh-CN"/>
         </w:rPr>
-        <w:t xml:space="preserve">The unsuccessful part also has a lot of information. Sentiment tilt reduces value, and post-analysis is more useful than the result itself. The signal is real but noisy, and the noise is directly folded into the weight, which shows that it is an unnecessary position adjustment, not an advantage. The three explicit simplifications qualify all the conclusions: zero transaction costs, zero risk-free interest rates, and the sample </w:t>
-      </w:r>
-      <w:proofErr w:type="gramStart"/>
-      <w:r>
-        <w:rPr>
-          <w:lang w:eastAsia="zh-CN"/>
-        </w:rPr>
-        <w:t>ends</w:t>
-      </w:r>
-      <w:proofErr w:type="gramEnd"/>
-      <w:r>
-        <w:rPr>
-          <w:lang w:eastAsia="zh-CN"/>
-        </w:rPr>
-        <w:t xml:space="preserve"> on 29 December 2023, so this product does not have a word to describe today’s market.</w:t>
+        <w:t>After review</w:t>
+      </w:r>
+      <w:r>
+        <w:rPr>
+          <w:lang w:eastAsia="zh-CN"/>
+        </w:rPr>
+        <w:t>ing</w:t>
+      </w:r>
+      <w:r>
+        <w:rPr>
+          <w:lang w:eastAsia="zh-CN"/>
+        </w:rPr>
+        <w:t xml:space="preserve"> the whole project, the most effective thing is not a certain result, but discipline.</w:t>
+      </w:r>
+      <w:r>
+        <w:rPr>
+          <w:lang w:eastAsia="zh-CN"/>
+        </w:rPr>
+        <w:t xml:space="preserve"> The weight is only formed by past data, the </w:t>
+      </w:r>
+      <w:r>
+        <w:rPr>
+          <w:lang w:eastAsia="zh-CN"/>
+        </w:rPr>
+        <w:t>sentiment</w:t>
+      </w:r>
+      <w:r>
+        <w:rPr>
+          <w:lang w:eastAsia="zh-CN"/>
+        </w:rPr>
+        <w:t xml:space="preserve"> signals </w:t>
+      </w:r>
+      <w:r>
+        <w:rPr>
+          <w:lang w:eastAsia="zh-CN"/>
+        </w:rPr>
+        <w:t>are</w:t>
+      </w:r>
+      <w:r>
+        <w:rPr>
+          <w:lang w:eastAsia="zh-CN"/>
+        </w:rPr>
+        <w:t xml:space="preserve"> forced to lag one trading day, and the output of the solver is compared across methods every time it is constructed. These checks detected mistakes. The </w:t>
+      </w:r>
+      <w:r>
+        <w:rPr>
+          <w:lang w:eastAsia="zh-CN"/>
+        </w:rPr>
+        <w:t>solver’s silent stalling</w:t>
+      </w:r>
+      <w:r>
+        <w:rPr>
+          <w:lang w:eastAsia="zh-CN"/>
+        </w:rPr>
+        <w:t xml:space="preserve"> and the </w:t>
+      </w:r>
+      <w:r>
+        <w:rPr>
+          <w:lang w:eastAsia="zh-CN"/>
+        </w:rPr>
+        <w:t>look-ahead in the sentiment signal were caught in this way</w:t>
+      </w:r>
+      <w:r>
+        <w:rPr>
+          <w:lang w:eastAsia="zh-CN"/>
+        </w:rPr>
+        <w:t>. Another valid judgment is that neutrality and usefulness can coexist; the plain language teaches how to read and understand the evidenc</w:t>
+      </w:r>
+      <w:r>
+        <w:rPr>
+          <w:lang w:eastAsia="zh-CN"/>
+        </w:rPr>
+        <w:t>e, not choose for users.</w:t>
       </w:r>
     </w:p>
     <w:p>
@@ -6108,69 +6637,19 @@
         <w:rPr>
           <w:lang w:eastAsia="zh-CN"/>
         </w:rPr>
-        <w:t>In addition, there is another function in the practice area that only ha</w:t>
-      </w:r>
-      <w:r>
-        <w:rPr>
-          <w:lang w:eastAsia="zh-CN"/>
-        </w:rPr>
-        <w:t>s</w:t>
-      </w:r>
-      <w:r>
-        <w:rPr>
-          <w:lang w:eastAsia="zh-CN"/>
-        </w:rPr>
-        <w:t xml:space="preserve"> the design idea but </w:t>
-      </w:r>
-      <w:r>
-        <w:rPr>
-          <w:lang w:eastAsia="zh-CN"/>
-        </w:rPr>
-        <w:t xml:space="preserve">is </w:t>
-      </w:r>
-      <w:r>
-        <w:rPr>
-          <w:lang w:eastAsia="zh-CN"/>
-        </w:rPr>
-        <w:t>not implemented in the app, which is the settlement page. Now</w:t>
-      </w:r>
-      <w:r>
-        <w:rPr>
-          <w:lang w:eastAsia="zh-CN"/>
-        </w:rPr>
-        <w:t>,</w:t>
-      </w:r>
-      <w:r>
-        <w:rPr>
-          <w:lang w:eastAsia="zh-CN"/>
-        </w:rPr>
-        <w:t xml:space="preserve"> after the journey, users can only see the contrast between their own path and </w:t>
-      </w:r>
-      <w:r>
-        <w:rPr>
-          <w:lang w:eastAsia="zh-CN"/>
-        </w:rPr>
-        <w:t>doing nothing</w:t>
-      </w:r>
-      <w:r>
-        <w:rPr>
-          <w:lang w:eastAsia="zh-CN"/>
-        </w:rPr>
-        <w:t xml:space="preserve">. The settlement page will clearly calculate how much profit and loss each adjustment brings, so that users can see which decisions are useful and which are not. This is the first function to be done in the future of </w:t>
-      </w:r>
-      <w:proofErr w:type="spellStart"/>
-      <w:r>
-        <w:rPr>
-          <w:lang w:eastAsia="zh-CN"/>
-        </w:rPr>
-        <w:t>HyperInvest</w:t>
-      </w:r>
-      <w:proofErr w:type="spellEnd"/>
-      <w:r>
-        <w:rPr>
-          <w:lang w:eastAsia="zh-CN"/>
-        </w:rPr>
-        <w:t>.</w:t>
+        <w:t xml:space="preserve">The unsuccessful part also has a lot of information. Sentiment tilt reduces value, and post-analysis is more useful than the result itself. The signal is real but noisy, and the noise is directly folded into the weight, which shows that it is an unnecessary position adjustment, not an advantage. The three explicit simplifications qualify all the conclusions: zero transaction costs, zero risk-free interest rates, and the sample </w:t>
+      </w:r>
+      <w:r>
+        <w:rPr>
+          <w:lang w:eastAsia="zh-CN"/>
+        </w:rPr>
+        <w:t>end</w:t>
+      </w:r>
+      <w:r>
+        <w:rPr>
+          <w:lang w:eastAsia="zh-CN"/>
+        </w:rPr>
+        <w:t xml:space="preserve"> on 29 December 2023, so this product does not have a word to describe today’s market.</w:t>
       </w:r>
     </w:p>
     <w:p>
@@ -6183,128 +6662,69 @@
         <w:rPr>
           <w:lang w:eastAsia="zh-CN"/>
         </w:rPr>
-        <w:t>There are three specific suggestions based on evidence. First, before believing in the advantage of any optimization fund, add the transaction</w:t>
-      </w:r>
-      <w:r>
-        <w:rPr>
-          <w:lang w:eastAsia="zh-CN"/>
-        </w:rPr>
-        <w:t>-</w:t>
-      </w:r>
-      <w:r>
-        <w:rPr>
-          <w:lang w:eastAsia="zh-CN"/>
-        </w:rPr>
-        <w:t xml:space="preserve">cost and </w:t>
-      </w:r>
-      <w:r>
-        <w:rPr>
-          <w:lang w:eastAsia="zh-CN"/>
-        </w:rPr>
-        <w:t>turnover</w:t>
-      </w:r>
-      <w:r>
-        <w:rPr>
-          <w:lang w:eastAsia="zh-CN"/>
-        </w:rPr>
-        <w:t xml:space="preserve"> model. Appendix A2 and A2b show that </w:t>
-      </w:r>
-      <w:r>
-        <w:rPr>
-          <w:lang w:eastAsia="zh-CN"/>
-        </w:rPr>
-        <w:t xml:space="preserve">some funds replace the whole portfolio </w:t>
-      </w:r>
-      <w:r>
-        <w:rPr>
-          <w:lang w:eastAsia="zh-CN"/>
-        </w:rPr>
-        <w:t>in a single rebalance</w:t>
-      </w:r>
-      <w:r>
-        <w:rPr>
-          <w:lang w:eastAsia="zh-CN"/>
-        </w:rPr>
-        <w:t xml:space="preserve">. Even if only a few basis points are collected for each transaction, the ranking given in this report may be rearranged. Second, if the product </w:t>
-      </w:r>
-      <w:r>
-        <w:rPr>
-          <w:lang w:eastAsia="zh-CN"/>
-        </w:rPr>
-        <w:t>go</w:t>
-      </w:r>
-      <w:r>
-        <w:rPr>
-          <w:lang w:eastAsia="zh-CN"/>
-        </w:rPr>
-        <w:t xml:space="preserve">es </w:t>
-      </w:r>
-      <w:r>
-        <w:rPr>
-          <w:lang w:eastAsia="zh-CN"/>
-        </w:rPr>
-        <w:t>liv</w:t>
-      </w:r>
-      <w:r>
-        <w:rPr>
-          <w:lang w:eastAsia="zh-CN"/>
-        </w:rPr>
-        <w:t xml:space="preserve">e instead of a prototype, refresh the </w:t>
-      </w:r>
-      <w:r>
-        <w:rPr>
-          <w:lang w:eastAsia="zh-CN"/>
-        </w:rPr>
-        <w:t>data nightly and re-run the pipeline, so the evidence stays current to the day before</w:t>
-      </w:r>
-      <w:r>
-        <w:rPr>
-          <w:lang w:eastAsia="zh-CN"/>
-        </w:rPr>
-        <w:t xml:space="preserve">. The architecture supports running every day, and the boundary does not need to be moved; the application will not show </w:t>
-      </w:r>
-      <w:r>
-        <w:rPr>
-          <w:rFonts w:hint="eastAsia"/>
-          <w:lang w:eastAsia="zh-CN"/>
-        </w:rPr>
-        <w:t>nothing</w:t>
-      </w:r>
-      <w:r>
-        <w:rPr>
-          <w:lang w:eastAsia="zh-CN"/>
-        </w:rPr>
-        <w:t xml:space="preserve"> beyond the sample.</w:t>
-      </w:r>
-      <w:r>
-        <w:rPr>
-          <w:lang w:eastAsia="zh-CN"/>
-        </w:rPr>
-        <w:t xml:space="preserve"> Third, add an optimization method that </w:t>
-      </w:r>
-      <w:r>
-        <w:rPr>
-          <w:lang w:eastAsia="zh-CN"/>
-        </w:rPr>
-        <w:t>considers tail risk, such as conditional value at risk (mean-CVaR). The deep draw</w:t>
-      </w:r>
-      <w:r>
-        <w:rPr>
-          <w:lang w:eastAsia="zh-CN"/>
-        </w:rPr>
-        <w:t>down</w:t>
-      </w:r>
-      <w:r>
-        <w:rPr>
-          <w:lang w:eastAsia="zh-CN"/>
-        </w:rPr>
-        <w:t xml:space="preserve"> in 2022 is the tail event that is easily underestimated by the variance target.</w:t>
-      </w:r>
-      <w:r>
-        <w:rPr>
-          <w:lang w:eastAsia="zh-CN"/>
-        </w:rPr>
-        <w:t xml:space="preserve"> The method of tail loss pricing can be used to test whether the current drawdown ranking can stand under a stricter risk definition.</w:t>
+        <w:t>In addition, there is another function in the practice area that only ha</w:t>
+      </w:r>
+      <w:r>
+        <w:rPr>
+          <w:lang w:eastAsia="zh-CN"/>
+        </w:rPr>
+        <w:t>s</w:t>
+      </w:r>
+      <w:r>
+        <w:rPr>
+          <w:lang w:eastAsia="zh-CN"/>
+        </w:rPr>
+        <w:t xml:space="preserve"> the design idea but </w:t>
+      </w:r>
+      <w:r>
+        <w:rPr>
+          <w:lang w:eastAsia="zh-CN"/>
+        </w:rPr>
+        <w:t xml:space="preserve">is </w:t>
+      </w:r>
+      <w:r>
+        <w:rPr>
+          <w:lang w:eastAsia="zh-CN"/>
+        </w:rPr>
+        <w:t>not implemented in the app, which is the settlement page. Now</w:t>
+      </w:r>
+      <w:r>
+        <w:rPr>
+          <w:lang w:eastAsia="zh-CN"/>
+        </w:rPr>
+        <w:t>,</w:t>
+      </w:r>
+      <w:r>
+        <w:rPr>
+          <w:lang w:eastAsia="zh-CN"/>
+        </w:rPr>
+        <w:t xml:space="preserve"> after the journey, users can only see the contrast between their own path and </w:t>
+      </w:r>
+      <w:r>
+        <w:rPr>
+          <w:lang w:eastAsia="zh-CN"/>
+        </w:rPr>
+        <w:t>doing nothing</w:t>
+      </w:r>
+      <w:r>
+        <w:rPr>
+          <w:lang w:eastAsia="zh-CN"/>
+        </w:rPr>
+        <w:t xml:space="preserve">. The settlement page will clearly calculate how much profit and loss each adjustment brings, so that users can see which decisions are useful and which are not. This is the first function to be done in the future of </w:t>
+      </w:r>
+      <w:proofErr w:type="spellStart"/>
+      <w:r>
+        <w:rPr>
+          <w:lang w:eastAsia="zh-CN"/>
+        </w:rPr>
+        <w:t>HyperInvest</w:t>
+      </w:r>
+      <w:proofErr w:type="spellEnd"/>
+      <w:r>
+        <w:rPr>
+          <w:lang w:eastAsia="zh-CN"/>
+        </w:rPr>
+        <w:t>.</w:t>
       </w:r>
     </w:p>
     <w:p>
@@ -6317,88 +6737,364 @@
         <w:rPr>
           <w:lang w:eastAsia="zh-CN"/>
         </w:rPr>
-        <w:t xml:space="preserve">The lesson worth mentioning in the process is that the verification check should be written first, and the model should be built later. Every check in this project immediately </w:t>
-      </w:r>
-      <w:r>
-        <w:rPr>
-          <w:lang w:eastAsia="zh-CN"/>
-        </w:rPr>
-        <w:t>caught</w:t>
-      </w:r>
-      <w:r>
-        <w:rPr>
-          <w:lang w:eastAsia="zh-CN"/>
-        </w:rPr>
-        <w:t xml:space="preserve"> errors. The earlier the inspection exists, the cheaper the errors it catches.</w:t>
+        <w:lastRenderedPageBreak/>
+        <w:t>There are three specific suggestions based on evidence. First, before believing in the advantage of any optimization fund, add the transaction</w:t>
+      </w:r>
+      <w:r>
+        <w:rPr>
+          <w:lang w:eastAsia="zh-CN"/>
+        </w:rPr>
+        <w:t>-</w:t>
+      </w:r>
+      <w:r>
+        <w:rPr>
+          <w:lang w:eastAsia="zh-CN"/>
+        </w:rPr>
+        <w:t xml:space="preserve">cost and </w:t>
+      </w:r>
+      <w:r>
+        <w:rPr>
+          <w:lang w:eastAsia="zh-CN"/>
+        </w:rPr>
+        <w:t>turnover</w:t>
+      </w:r>
+      <w:r>
+        <w:rPr>
+          <w:lang w:eastAsia="zh-CN"/>
+        </w:rPr>
+        <w:t xml:space="preserve"> model. Appendix A2 and A2b show that </w:t>
+      </w:r>
+      <w:r>
+        <w:rPr>
+          <w:lang w:eastAsia="zh-CN"/>
+        </w:rPr>
+        <w:t xml:space="preserve">some funds replace the whole portfolio </w:t>
+      </w:r>
+      <w:r>
+        <w:rPr>
+          <w:lang w:eastAsia="zh-CN"/>
+        </w:rPr>
+        <w:t>in a single rebalance</w:t>
+      </w:r>
+      <w:r>
+        <w:rPr>
+          <w:lang w:eastAsia="zh-CN"/>
+        </w:rPr>
+        <w:t xml:space="preserve">. Even if only a few basis points are collected for each transaction, the ranking given in this report may be rearranged. Second, if the product </w:t>
+      </w:r>
+      <w:r>
+        <w:rPr>
+          <w:lang w:eastAsia="zh-CN"/>
+        </w:rPr>
+        <w:t>go</w:t>
+      </w:r>
+      <w:r>
+        <w:rPr>
+          <w:lang w:eastAsia="zh-CN"/>
+        </w:rPr>
+        <w:t xml:space="preserve">es </w:t>
+      </w:r>
+      <w:r>
+        <w:rPr>
+          <w:lang w:eastAsia="zh-CN"/>
+        </w:rPr>
+        <w:t>liv</w:t>
+      </w:r>
+      <w:r>
+        <w:rPr>
+          <w:lang w:eastAsia="zh-CN"/>
+        </w:rPr>
+        <w:t xml:space="preserve">e instead of a prototype, refresh the </w:t>
+      </w:r>
+      <w:r>
+        <w:rPr>
+          <w:lang w:eastAsia="zh-CN"/>
+        </w:rPr>
+        <w:t>data nightly and re-run the pipeline, so the evidence stays current to the day before</w:t>
+      </w:r>
+      <w:r>
+        <w:rPr>
+          <w:lang w:eastAsia="zh-CN"/>
+        </w:rPr>
+        <w:t xml:space="preserve">. The architecture supports running every day, and the boundary does not need to be moved; the application will show </w:t>
+      </w:r>
+      <w:r>
+        <w:rPr>
+          <w:rFonts w:hint="eastAsia"/>
+          <w:lang w:eastAsia="zh-CN"/>
+        </w:rPr>
+        <w:t>nothing</w:t>
+      </w:r>
+      <w:r>
+        <w:rPr>
+          <w:lang w:eastAsia="zh-CN"/>
+        </w:rPr>
+        <w:t xml:space="preserve"> beyond the sample.</w:t>
+      </w:r>
+      <w:r>
+        <w:rPr>
+          <w:lang w:eastAsia="zh-CN"/>
+        </w:rPr>
+        <w:t xml:space="preserve"> Third, add an optimization method that considers tail risk, such as conditional value at risk (mean-CVaR). The deep drawdown in 2022 is the tail event that is easily underestimated by the variance target. The method of tail loss pricing can be used to test whether the current drawdown ranking can stand under a stricter risk definition.</w:t>
       </w:r>
     </w:p>
     <w:p>
-      <w:r>
-        <w:rPr>
-          <w:rFonts w:hint="eastAsia"/>
-          <w:highlight w:val="yellow"/>
-          <w:lang w:eastAsia="zh-CN"/>
-        </w:rPr>
-        <w:br/>
+      <w:pPr>
+        <w:rPr>
+          <w:lang w:eastAsia="zh-CN"/>
+        </w:rPr>
+      </w:pPr>
+      <w:r>
+        <w:rPr>
+          <w:lang w:eastAsia="zh-CN"/>
+        </w:rPr>
+        <w:t xml:space="preserve">The lesson worth mentioning in the process is that the verification check should be written first, and the model should be built later. Every check in this project immediately </w:t>
+      </w:r>
+      <w:r>
+        <w:rPr>
+          <w:lang w:eastAsia="zh-CN"/>
+        </w:rPr>
+        <w:t>caught</w:t>
+      </w:r>
+      <w:r>
+        <w:rPr>
+          <w:lang w:eastAsia="zh-CN"/>
+        </w:rPr>
+        <w:t xml:space="preserve"> errors. The earlier the inspection exists, the cheaper the errors it catches.</w:t>
       </w:r>
     </w:p>
     <w:p>
       <w:pPr>
-        <w:rPr>
-          <w:highlight w:val="yellow"/>
-        </w:rPr>
-      </w:pPr>
+        <w:pStyle w:val="Heading1"/>
+      </w:pPr>
+      <w:r>
+        <w:t>AI workflow statement</w:t>
+      </w:r>
     </w:p>
     <w:p>
       <w:pPr>
-        <w:pStyle w:val="Heading1"/>
         <w:rPr>
           <w:rFonts w:hint="eastAsia"/>
-        </w:rPr>
-      </w:pPr>
-      <w:r>
-        <w:lastRenderedPageBreak/>
-        <w:t>AI workflow statement</w:t>
+          <w:lang w:eastAsia="zh-CN"/>
+        </w:rPr>
+      </w:pPr>
+      <w:r>
+        <w:rPr>
+          <w:lang w:eastAsia="zh-CN"/>
+        </w:rPr>
+        <w:t xml:space="preserve">The code, </w:t>
+      </w:r>
+      <w:proofErr w:type="spellStart"/>
+      <w:r>
+        <w:rPr>
+          <w:lang w:eastAsia="zh-CN"/>
+        </w:rPr>
+        <w:t>backtest</w:t>
+      </w:r>
+      <w:proofErr w:type="spellEnd"/>
+      <w:r>
+        <w:rPr>
+          <w:lang w:eastAsia="zh-CN"/>
+        </w:rPr>
+        <w:t>,</w:t>
+      </w:r>
+      <w:r>
+        <w:rPr>
+          <w:lang w:eastAsia="zh-CN"/>
+        </w:rPr>
+        <w:t xml:space="preserve"> sentiment</w:t>
+      </w:r>
+      <w:r>
+        <w:rPr>
+          <w:lang w:eastAsia="zh-CN"/>
+        </w:rPr>
+        <w:t xml:space="preserve"> index, and application of this project are completed by a single AI agent, Kimi Code CLI, under my command. Every substantive change is approved or rejected by me, and the product and modeling decisions are made by me. I review the results by executing code to </w:t>
+      </w:r>
+      <w:r>
+        <w:rPr>
+          <w:lang w:eastAsia="zh-CN"/>
+        </w:rPr>
+        <w:t>ensur</w:t>
+      </w:r>
+      <w:r>
+        <w:rPr>
+          <w:lang w:eastAsia="zh-CN"/>
+        </w:rPr>
+        <w:t xml:space="preserve">e </w:t>
+      </w:r>
+      <w:r>
+        <w:rPr>
+          <w:lang w:eastAsia="zh-CN"/>
+        </w:rPr>
+        <w:t>they</w:t>
+      </w:r>
+      <w:r>
+        <w:rPr>
+          <w:lang w:eastAsia="zh-CN"/>
+        </w:rPr>
+        <w:t xml:space="preserve"> </w:t>
+      </w:r>
+      <w:r>
+        <w:rPr>
+          <w:lang w:eastAsia="zh-CN"/>
+        </w:rPr>
+        <w:t>are</w:t>
+      </w:r>
+      <w:r>
+        <w:rPr>
+          <w:lang w:eastAsia="zh-CN"/>
+        </w:rPr>
+        <w:t xml:space="preserve"> correct. This report was </w:t>
+      </w:r>
+      <w:r>
+        <w:rPr>
+          <w:lang w:eastAsia="zh-CN"/>
+        </w:rPr>
+        <w:t>initially generated as a draft by AI, and I then rewrote it</w:t>
+      </w:r>
+      <w:r>
+        <w:rPr>
+          <w:lang w:eastAsia="zh-CN"/>
+        </w:rPr>
+        <w:t xml:space="preserve"> in my own words. </w:t>
+      </w:r>
+      <w:r>
+        <w:rPr>
+          <w:lang w:eastAsia="zh-CN"/>
+        </w:rPr>
+        <w:t>During</w:t>
+      </w:r>
+      <w:r>
+        <w:rPr>
+          <w:lang w:eastAsia="zh-CN"/>
+        </w:rPr>
+        <w:t xml:space="preserve"> the writing</w:t>
+      </w:r>
+      <w:r>
+        <w:rPr>
+          <w:lang w:eastAsia="zh-CN"/>
+        </w:rPr>
+        <w:t xml:space="preserve"> process</w:t>
+      </w:r>
+      <w:r>
+        <w:rPr>
+          <w:lang w:eastAsia="zh-CN"/>
+        </w:rPr>
+        <w:t>, Grammarly was used for basic editing assistance, such as fixing typos</w:t>
+      </w:r>
+      <w:r>
+        <w:rPr>
+          <w:lang w:eastAsia="zh-CN"/>
+        </w:rPr>
+        <w:t>,</w:t>
+      </w:r>
+      <w:r>
+        <w:rPr>
+          <w:lang w:eastAsia="zh-CN"/>
+        </w:rPr>
+        <w:t xml:space="preserve"> misspellings</w:t>
+      </w:r>
+      <w:r>
+        <w:rPr>
+          <w:lang w:eastAsia="zh-CN"/>
+        </w:rPr>
+        <w:t>, and grammatical errors</w:t>
+      </w:r>
+      <w:r>
+        <w:rPr>
+          <w:lang w:eastAsia="zh-CN"/>
+        </w:rPr>
+        <w:t>. AI was also used to check logic and numbers.</w:t>
+      </w:r>
+      <w:r>
+        <w:rPr>
+          <w:lang w:eastAsia="zh-CN"/>
+        </w:rPr>
+        <w:t xml:space="preserve"> The logic </w:t>
+      </w:r>
+      <w:r>
+        <w:rPr>
+          <w:lang w:eastAsia="zh-CN"/>
+        </w:rPr>
+        <w:t>in some parts of the report was originally incorrect and messy; I fixed it and polished it using</w:t>
+      </w:r>
+      <w:r>
+        <w:rPr>
+          <w:lang w:eastAsia="zh-CN"/>
+        </w:rPr>
+        <w:t xml:space="preserve"> AI. </w:t>
+      </w:r>
+      <w:proofErr w:type="spellStart"/>
+      <w:r>
+        <w:rPr>
+          <w:lang w:eastAsia="zh-CN"/>
+        </w:rPr>
+        <w:t>The</w:t>
+      </w:r>
+      <w:proofErr w:type="spellEnd"/>
+      <w:r>
+        <w:rPr>
+          <w:lang w:eastAsia="zh-CN"/>
+        </w:rPr>
+        <w:t xml:space="preserve"> complete prompt record can be found in ai/prompt_log.md, and the proxy instruction file</w:t>
+      </w:r>
+      <w:r>
+        <w:rPr>
+          <w:lang w:eastAsia="zh-CN"/>
+        </w:rPr>
+        <w:t>,</w:t>
+      </w:r>
+      <w:r>
+        <w:rPr>
+          <w:lang w:eastAsia="zh-CN"/>
+        </w:rPr>
+        <w:t xml:space="preserve"> AGENT</w:t>
+      </w:r>
+      <w:r>
+        <w:rPr>
+          <w:lang w:eastAsia="zh-CN"/>
+        </w:rPr>
+        <w:t>S</w:t>
+      </w:r>
+      <w:r>
+        <w:rPr>
+          <w:lang w:eastAsia="zh-CN"/>
+        </w:rPr>
+        <w:t>.md</w:t>
+      </w:r>
+      <w:r>
+        <w:rPr>
+          <w:lang w:eastAsia="zh-CN"/>
+        </w:rPr>
+        <w:t>,</w:t>
+      </w:r>
+      <w:r>
+        <w:rPr>
+          <w:lang w:eastAsia="zh-CN"/>
+        </w:rPr>
+        <w:t xml:space="preserve"> </w:t>
+      </w:r>
+      <w:r>
+        <w:rPr>
+          <w:lang w:eastAsia="zh-CN"/>
+        </w:rPr>
+        <w:t>wa</w:t>
+      </w:r>
+      <w:r>
+        <w:rPr>
+          <w:lang w:eastAsia="zh-CN"/>
+        </w:rPr>
+        <w:t>s written by me. The analysis and interpretation of this report are my own.</w:t>
       </w:r>
     </w:p>
     <w:p>
-      <w:pPr>
-        <w:rPr>
-          <w:lang w:eastAsia="zh-CN"/>
-        </w:rPr>
-      </w:pPr>
-      <w:r>
-        <w:rPr>
-          <w:lang w:eastAsia="zh-CN"/>
-        </w:rPr>
-        <w:t xml:space="preserve">The code, </w:t>
-      </w:r>
-      <w:proofErr w:type="spellStart"/>
-      <w:r>
-        <w:rPr>
-          <w:lang w:eastAsia="zh-CN"/>
-        </w:rPr>
-        <w:t>backtest</w:t>
-      </w:r>
-      <w:proofErr w:type="spellEnd"/>
-      <w:r>
-        <w:rPr>
-          <w:lang w:eastAsia="zh-CN"/>
-        </w:rPr>
-        <w:t>, mood index, and application of this project are completed by a single AI agent, Kimi Code CLI, under my command. Every substantive change is approved or rejected by me, and the product and modeling decisions are made by me. I review the results by executing code to make sure the result is correct. This report was first generated as a draft sample by AI, and then I rewrote the whole report in my own words. In the process of writing, Grammarly was used for basic editing assistance, such as fixing typos and misspellings. AI was also used to check logic and numbers. The complete prompt record can be found in ai/prompt_log.md, and the proxy instruction file AGENT.md is written by me. The analysis and interpretation of this report are my own.</w:t>
+      <w:r>
+        <w:br w:type="page"/>
       </w:r>
     </w:p>
     <w:p>
-      <w:r>
-        <w:br w:type="page"/>
-      </w:r>
-    </w:p>
-    <w:p>
       <w:pPr>
         <w:pStyle w:val="Heading1"/>
-        <w:rPr>
-          <w:rFonts w:hint="eastAsia"/>
-        </w:rPr>
       </w:pPr>
       <w:r>
         <w:lastRenderedPageBreak/>
@@ -6429,7 +7125,7 @@
                     <pic:cNvPicPr/>
                   </pic:nvPicPr>
                   <pic:blipFill>
-                    <a:blip r:embed="rId16"/>
+                    <a:blip r:embed="rId17"/>
                     <a:stretch>
                       <a:fillRect/>
                     </a:stretch>
@@ -6455,7 +7151,6 @@
         <w:pStyle w:val="Caption"/>
         <w:jc w:val="center"/>
         <w:rPr>
-          <w:rFonts w:hint="eastAsia"/>
           <w:color w:val="6B625C"/>
           <w:lang w:eastAsia="zh-CN"/>
         </w:rPr>
@@ -6499,7 +7194,7 @@
                     <pic:cNvPicPr/>
                   </pic:nvPicPr>
                   <pic:blipFill>
-                    <a:blip r:embed="rId17"/>
+                    <a:blip r:embed="rId18"/>
                     <a:stretch>
                       <a:fillRect/>
                     </a:stretch>
@@ -6570,7 +7265,7 @@
                     <pic:cNvPicPr/>
                   </pic:nvPicPr>
                   <pic:blipFill>
-                    <a:blip r:embed="rId18"/>
+                    <a:blip r:embed="rId19"/>
                     <a:stretch>
                       <a:fillRect/>
                     </a:stretch>
@@ -6596,7 +7291,6 @@
         <w:pStyle w:val="Caption"/>
         <w:jc w:val="center"/>
         <w:rPr>
-          <w:rFonts w:hint="eastAsia"/>
           <w:color w:val="6B625C"/>
           <w:lang w:eastAsia="zh-CN"/>
         </w:rPr>
@@ -6652,7 +7346,7 @@
                     <pic:cNvPicPr/>
                   </pic:nvPicPr>
                   <pic:blipFill>
-                    <a:blip r:embed="rId19"/>
+                    <a:blip r:embed="rId20"/>
                     <a:stretch>
                       <a:fillRect/>
                     </a:stretch>
@@ -6719,34 +7413,241 @@
       </w:r>
     </w:p>
     <w:p>
-      <w:r>
-        <w:rPr>
-          <w:color w:val="6B625C"/>
-          <w:sz w:val="19"/>
-        </w:rPr>
-        <w:t>[EVIDENCE — verified numbers] Also reference as tables: results/tables/performance_metrics.csv, fusion_comparison.csv, sentiment_model_comparison.csv, sentiment_disagreement_examples.csv, weights_sanity_check.csv.</w:t>
+      <w:pPr>
+        <w:rPr>
+          <w:lang w:eastAsia="zh-CN"/>
+        </w:rPr>
+      </w:pPr>
+      <w:r>
+        <w:rPr>
+          <w:noProof/>
+          <w:lang w:eastAsia="zh-CN"/>
+        </w:rPr>
+        <w:lastRenderedPageBreak/>
+        <w:drawing>
+          <wp:inline distT="0" distB="0" distL="0" distR="0" wp14:anchorId="04BDDC45" wp14:editId="2D6EDF0F">
+            <wp:extent cx="5486400" cy="6737985"/>
+            <wp:effectExtent l="0" t="0" r="0" b="5715"/>
+            <wp:docPr id="411517614" name="Picture 1"/>
+            <wp:cNvGraphicFramePr>
+              <a:graphicFrameLocks xmlns:a="http://schemas.openxmlformats.org/drawingml/2006/main" noChangeAspect="1"/>
+            </wp:cNvGraphicFramePr>
+            <a:graphic xmlns:a="http://schemas.openxmlformats.org/drawingml/2006/main">
+              <a:graphicData uri="http://schemas.openxmlformats.org/drawingml/2006/picture">
+                <pic:pic xmlns:pic="http://schemas.openxmlformats.org/drawingml/2006/picture">
+                  <pic:nvPicPr>
+                    <pic:cNvPr id="411517614" name=""/>
+                    <pic:cNvPicPr/>
+                  </pic:nvPicPr>
+                  <pic:blipFill>
+                    <a:blip r:embed="rId21"/>
+                    <a:stretch>
+                      <a:fillRect/>
+                    </a:stretch>
+                  </pic:blipFill>
+                  <pic:spPr>
+                    <a:xfrm>
+                      <a:off x="0" y="0"/>
+                      <a:ext cx="5486400" cy="6737985"/>
+                    </a:xfrm>
+                    <a:prstGeom prst="rect">
+                      <a:avLst/>
+                    </a:prstGeom>
+                  </pic:spPr>
+                </pic:pic>
+              </a:graphicData>
+            </a:graphic>
+          </wp:inline>
+        </w:drawing>
       </w:r>
     </w:p>
     <w:p>
       <w:pPr>
+        <w:pStyle w:val="Caption"/>
+        <w:jc w:val="center"/>
+        <w:rPr>
+          <w:rFonts w:ascii="Georgia" w:hAnsi="Georgia"/>
+          <w:b w:val="0"/>
+          <w:bCs w:val="0"/>
+          <w:color w:val="0F766E"/>
+          <w:sz w:val="30"/>
+          <w:szCs w:val="28"/>
+        </w:rPr>
+      </w:pPr>
+      <w:r>
+        <w:rPr>
+          <w:color w:val="990F3D"/>
+        </w:rPr>
+        <w:t xml:space="preserve">A4 — </w:t>
+      </w:r>
+      <w:r>
+        <w:rPr>
+          <w:color w:val="6B625C"/>
+        </w:rPr>
+        <w:t>Learning cards in the practice area: a Replay run started 1 February 2021 with $1,000 in Crypto Max-Sharpe, shown on 13 June 2021 after traveling through the May 2021 crypto sell-off. Three cards have fired, each driven by the user's own numbers</w:t>
+      </w:r>
+      <w:r>
+        <w:br w:type="page"/>
+      </w:r>
+    </w:p>
+    <w:p>
+      <w:pPr>
         <w:pStyle w:val="Heading1"/>
-        <w:rPr>
-          <w:rFonts w:hint="eastAsia"/>
-        </w:rPr>
       </w:pPr>
       <w:r>
         <w:lastRenderedPageBreak/>
         <w:t>References</w:t>
       </w:r>
     </w:p>
+    <w:p/>
     <w:p>
-      <w:r>
-        <w:t>[VERIFY EACH REFERENCE YOURSELF before submission — context/verify_ai_output.md: every citation must be one you have opened. Candidate list:] Course data bundle (equity prices, crypto prices, news headlines, 2020–2023). Hutto, C.J. &amp; Gilbert, E. (2014), VADER: A Parsimonious Rule-based Model for Sentiment Analysis of Social Media Text, ICWSM. Henry, E. (2008), Are Investors Influenced by How Earnings Press Releases are Written?, Journal of Business Communication (Henry's finance word list). SentiBigNomics lexicon (as distributed with the finvader package). Course weekly materials, weeks 1–9 [cite the specific weeks you use].</w:t>
+      <w:pPr>
+        <w:rPr>
+          <w:lang w:val="en-CN"/>
+        </w:rPr>
+      </w:pPr>
+      <w:r>
+        <w:rPr>
+          <w:lang w:val="en-CN"/>
+        </w:rPr>
+        <w:t xml:space="preserve">Massachusetts Securities Division (2020) In the Matter of Robinhood Financial, LLC (Administrative Complaint, Docket No. E-2020-0047), Commonwealth of Massachusetts, 16 December. Available at: </w:t>
+      </w:r>
+      <w:hyperlink r:id="rId22" w:history="1">
+        <w:r>
+          <w:rPr>
+            <w:rStyle w:val="Hyperlink"/>
+            <w:lang w:val="en-CN"/>
+          </w:rPr>
+          <w:t>https://business.cch.com/srd/MSD-Robinhood-Financial-LLC-Complaint-E-2020-0047.pdf</w:t>
+        </w:r>
+      </w:hyperlink>
+      <w:r>
+        <w:rPr>
+          <w:lang w:val="en-CN"/>
+        </w:rPr>
+        <w:t xml:space="preserve"> </w:t>
+      </w:r>
+      <w:r>
+        <w:rPr>
+          <w:lang w:val="en-CN"/>
+        </w:rPr>
+        <w:t xml:space="preserve">(Accessed: </w:t>
+      </w:r>
+      <w:r>
+        <w:rPr>
+          <w:rFonts w:hint="eastAsia"/>
+          <w:lang w:val="en-CN" w:eastAsia="zh-CN"/>
+        </w:rPr>
+        <w:t>13 August</w:t>
+      </w:r>
+      <w:r>
+        <w:rPr>
+          <w:lang w:eastAsia="zh-CN"/>
+        </w:rPr>
+        <w:t>, 2026</w:t>
+      </w:r>
+      <w:r>
+        <w:rPr>
+          <w:lang w:val="en-CN"/>
+        </w:rPr>
+        <w:t>)</w:t>
+      </w:r>
+      <w:r>
+        <w:rPr>
+          <w:lang w:val="en-CN"/>
+        </w:rPr>
+        <w:t>.</w:t>
+      </w:r>
+    </w:p>
+    <w:p>
+      <w:pPr>
+        <w:rPr>
+          <w:lang w:val="en-CN"/>
+        </w:rPr>
+      </w:pPr>
+      <w:r>
+        <w:rPr>
+          <w:lang w:val="en-CN"/>
+        </w:rPr>
+        <w:t>Consoli, S., Barbaglia, L. and Manzan, S. (2021) 'Explaining sentiment from Lexicon', CEUR Workshop Proceedings, vol. 2918, pp. 87–95.</w:t>
+      </w:r>
+    </w:p>
+    <w:p>
+      <w:pPr>
+        <w:rPr>
+          <w:lang w:val="en-CN"/>
+        </w:rPr>
+      </w:pPr>
+      <w:r>
+        <w:rPr>
+          <w:lang w:val="en-CN"/>
+        </w:rPr>
+        <w:t>Henry, E. (2008) 'Are Investors Influenced by How Earnings Press Releases Are Written?', Journal of Business Communication, 45(4), pp. 363–407.</w:t>
+      </w:r>
+    </w:p>
+    <w:p>
+      <w:pPr>
+        <w:rPr>
+          <w:lang w:val="en-CN"/>
+        </w:rPr>
+      </w:pPr>
+      <w:r>
+        <w:rPr>
+          <w:lang w:val="en-CN"/>
+        </w:rPr>
+        <w:t>Hutto, C.J. and Gilbert, E. (2014) 'VADER: A Parsimonious Rule-based Model for Sentiment Analysis of Social Media Text', Proceedings of the Eighth International AAAI Conference on Weblogs and Social Media (ICWSM), pp. 216–225.</w:t>
+      </w:r>
+    </w:p>
+    <w:p>
+      <w:pPr>
+        <w:rPr>
+          <w:lang w:val="en-CN"/>
+        </w:rPr>
+      </w:pPr>
+      <w:r>
+        <w:rPr>
+          <w:rFonts w:hint="eastAsia"/>
+          <w:lang w:val="en-CN"/>
+        </w:rPr>
+        <w:t>Koráb, P. (2023) FinVADER: VADER sentiment classifier updated with financial lexicons [computer software]. Available at:</w:t>
+      </w:r>
+      <w:r>
+        <w:rPr>
+          <w:rFonts w:hint="eastAsia"/>
+          <w:lang w:val="en-CN" w:eastAsia="zh-CN"/>
+        </w:rPr>
+        <w:t xml:space="preserve"> </w:t>
+      </w:r>
+      <w:r>
+        <w:rPr>
+          <w:lang w:val="en-CN" w:eastAsia="zh-CN"/>
+        </w:rPr>
+        <w:t>https://github.com/PetrKorab/FinVADER</w:t>
+      </w:r>
+      <w:r>
+        <w:rPr>
+          <w:rFonts w:hint="eastAsia"/>
+          <w:lang w:val="en-CN"/>
+        </w:rPr>
+        <w:t xml:space="preserve"> (Accessed: </w:t>
+      </w:r>
+      <w:r>
+        <w:rPr>
+          <w:lang w:val="en-CN"/>
+        </w:rPr>
+        <w:t>13 August 13, 2026</w:t>
+      </w:r>
+      <w:r>
+        <w:rPr>
+          <w:rFonts w:hint="eastAsia"/>
+          <w:lang w:val="en-CN"/>
+        </w:rPr>
+        <w:t>).</w:t>
       </w:r>
     </w:p>
     <w:sectPr>
-      <w:headerReference w:type="default" r:id="rId20"/>
-      <w:footerReference w:type="default" r:id="rId21"/>
+      <w:headerReference w:type="default" r:id="rId23"/>
+      <w:footerReference w:type="default" r:id="rId24"/>
       <w:pgSz w:w="12240" w:h="15840"/>
       <w:pgMar w:top="1440" w:right="1800" w:bottom="1440" w:left="1800" w:header="720" w:footer="720" w:gutter="0"/>
       <w:cols w:space="720"/>
@@ -18928,6 +19829,29 @@
       </w:tcPr>
     </w:tblStylePr>
   </w:style>
+  <w:style w:type="character" w:styleId="Hyperlink">
+    <w:name w:val="Hyperlink"/>
+    <w:basedOn w:val="DefaultParagraphFont"/>
+    <w:uiPriority w:val="99"/>
+    <w:unhideWhenUsed/>
+    <w:rsid w:val="00D85B92"/>
+    <w:rPr>
+      <w:color w:val="0000FF" w:themeColor="hyperlink"/>
+      <w:u w:val="single"/>
+    </w:rPr>
+  </w:style>
+  <w:style w:type="character" w:styleId="UnresolvedMention">
+    <w:name w:val="Unresolved Mention"/>
+    <w:basedOn w:val="DefaultParagraphFont"/>
+    <w:uiPriority w:val="99"/>
+    <w:semiHidden/>
+    <w:unhideWhenUsed/>
+    <w:rsid w:val="00D85B92"/>
+    <w:rPr>
+      <w:color w:val="605E5C"/>
+      <w:shd w:val="clear" w:color="auto" w:fill="E1DFDD"/>
+    </w:rPr>
+  </w:style>
 </w:styles>
 </file>
 

</xml_diff>

<commit_message>
Final report (student rewrite with review fixes); script path fix; ignore Office temp files
</commit_message>
<xml_diff>
--- a/report/report.docx
+++ b/report/report.docx
@@ -155,7 +155,13 @@
         <w:t>crossed with</w:t>
       </w:r>
       <w:r>
-        <w:t xml:space="preserve"> construction methods. The asset families </w:t>
+        <w:t xml:space="preserve"> </w:t>
+      </w:r>
+      <w:r>
+        <w:t xml:space="preserve">four </w:t>
+      </w:r>
+      <w:r>
+        <w:t xml:space="preserve">construction methods. The asset families </w:t>
       </w:r>
       <w:r>
         <w:t>are</w:t>
@@ -435,7 +441,14 @@
         <w:rPr>
           <w:lang w:eastAsia="zh-CN"/>
         </w:rPr>
-        <w:t xml:space="preserve"> The estimated slices exclude returns from the rebalancing date itself, ensuring that information from that day and beyond does not influence the weights. Between rebalancing </w:t>
+        <w:t xml:space="preserve"> The estimated slices exclude returns from the rebalancing date itself, ensuring that information from that day and beyond does not influence the weights. Between </w:t>
+      </w:r>
+      <w:r>
+        <w:rPr>
+          <w:lang w:eastAsia="zh-CN"/>
+        </w:rPr>
+        <w:lastRenderedPageBreak/>
+        <w:t xml:space="preserve">rebalancing </w:t>
       </w:r>
       <w:r>
         <w:rPr>
@@ -477,14 +490,7 @@
         <w:rPr>
           <w:lang w:eastAsia="zh-CN"/>
         </w:rPr>
-        <w:t xml:space="preserve"> the out-</w:t>
-      </w:r>
-      <w:r>
-        <w:rPr>
-          <w:lang w:eastAsia="zh-CN"/>
-        </w:rPr>
-        <w:lastRenderedPageBreak/>
-        <w:t xml:space="preserve">of-sample period begins only after the first complete estimation window ends: for the </w:t>
+        <w:t xml:space="preserve"> the out-of-sample period begins only after the first complete estimation window ends: for the </w:t>
       </w:r>
       <w:r>
         <w:rPr>
@@ -598,7 +604,19 @@
         <w:rPr>
           <w:lang w:eastAsia="zh-CN"/>
         </w:rPr>
-        <w:t>The pure cryptocurrency funds follow their own daily calendar, so their out-of-sample period begins earlier, starting on 1 October 2020 for a total of 1,187 valuation dates.</w:t>
+        <w:t xml:space="preserve">The pure cryptocurrency funds follow their own daily calendar, so their out-of-sample period begins earlier, starting on 1 October 2020 for a total of 1,187 </w:t>
+      </w:r>
+      <w:r>
+        <w:rPr>
+          <w:lang w:eastAsia="zh-CN"/>
+        </w:rPr>
+        <w:t>e</w:t>
+      </w:r>
+      <w:r>
+        <w:rPr>
+          <w:lang w:eastAsia="zh-CN"/>
+        </w:rPr>
+        <w:t>valuation dates.</w:t>
       </w:r>
       <w:r>
         <w:rPr>
@@ -2208,7 +2226,21 @@
         <w:rPr>
           <w:color w:val="990F3D"/>
         </w:rPr>
-        <w:t xml:space="preserve"> 2 — </w:t>
+        <w:t xml:space="preserve"> </w:t>
+      </w:r>
+      <w:r>
+        <w:rPr>
+          <w:rFonts w:hint="eastAsia"/>
+          <w:color w:val="990F3D"/>
+          <w:lang w:eastAsia="zh-CN"/>
+        </w:rPr>
+        <w:t>1</w:t>
+      </w:r>
+      <w:r>
+        <w:rPr>
+          <w:color w:val="990F3D"/>
+        </w:rPr>
+        <w:t xml:space="preserve"> — </w:t>
       </w:r>
       <w:r>
         <w:rPr>
@@ -2302,7 +2334,21 @@
         <w:rPr>
           <w:color w:val="990F3D"/>
         </w:rPr>
-        <w:t xml:space="preserve"> 3 — </w:t>
+        <w:t xml:space="preserve"> </w:t>
+      </w:r>
+      <w:r>
+        <w:rPr>
+          <w:rFonts w:hint="eastAsia"/>
+          <w:color w:val="990F3D"/>
+          <w:lang w:eastAsia="zh-CN"/>
+        </w:rPr>
+        <w:t>2</w:t>
+      </w:r>
+      <w:r>
+        <w:rPr>
+          <w:color w:val="990F3D"/>
+        </w:rPr>
+        <w:t xml:space="preserve"> — </w:t>
       </w:r>
       <w:r>
         <w:rPr>
@@ -2348,7 +2394,33 @@
         <w:rPr>
           <w:lang w:eastAsia="zh-CN"/>
         </w:rPr>
-        <w:t xml:space="preserve"> 2 and 3 summarize the out-of-sample performance of all funds over a three-year period. The conclusion is that asset classes determine the extremes, while investment strategies determine the shape of the performance curve. The highest Sharpe ratio across the entire portfolio came from the Crypto </w:t>
+        <w:t xml:space="preserve"> </w:t>
+      </w:r>
+      <w:r>
+        <w:rPr>
+          <w:rFonts w:hint="eastAsia"/>
+          <w:lang w:eastAsia="zh-CN"/>
+        </w:rPr>
+        <w:t>1</w:t>
+      </w:r>
+      <w:r>
+        <w:rPr>
+          <w:lang w:eastAsia="zh-CN"/>
+        </w:rPr>
+        <w:t xml:space="preserve"> and </w:t>
+      </w:r>
+      <w:r>
+        <w:rPr>
+          <w:rFonts w:hint="eastAsia"/>
+          <w:lang w:eastAsia="zh-CN"/>
+        </w:rPr>
+        <w:t>2</w:t>
+      </w:r>
+      <w:r>
+        <w:rPr>
+          <w:lang w:eastAsia="zh-CN"/>
+        </w:rPr>
+        <w:t xml:space="preserve"> summarize the out-of-sample performance of all funds over a three-year period. The conclusion is that asset classes determine the extremes, while investment strategies determine the shape of the performance curve. The highest Sharpe ratio across the entire portfolio came from the Crypto </w:t>
       </w:r>
       <w:r>
         <w:rPr>
@@ -3151,7 +3223,20 @@
         <w:rPr>
           <w:lang w:eastAsia="zh-CN"/>
         </w:rPr>
-        <w:t>Figure 3 sorts the 13 funds by Sharpe ratio from highest to lowest; the top three are all crypto funds. Specific values are in Table 1</w:t>
+        <w:t xml:space="preserve">Figure </w:t>
+      </w:r>
+      <w:r>
+        <w:rPr>
+          <w:rFonts w:hint="eastAsia"/>
+          <w:lang w:eastAsia="zh-CN"/>
+        </w:rPr>
+        <w:t>2</w:t>
+      </w:r>
+      <w:r>
+        <w:rPr>
+          <w:lang w:eastAsia="zh-CN"/>
+        </w:rPr>
+        <w:t xml:space="preserve"> sorts the 13 funds by Sharpe ratio from highest to lowest; the top three are all crypto funds. Specific values are in Table 1</w:t>
       </w:r>
       <w:r>
         <w:rPr>
@@ -3468,7 +3553,31 @@
         <w:rPr>
           <w:lang w:eastAsia="zh-CN"/>
         </w:rPr>
-        <w:t xml:space="preserve"> there were 4,000 headlines, and 48.5% scored zero in </w:t>
+        <w:t xml:space="preserve"> </w:t>
+      </w:r>
+      <w:r>
+        <w:rPr>
+          <w:lang w:eastAsia="zh-CN"/>
+        </w:rPr>
+        <w:t xml:space="preserve">in a </w:t>
+      </w:r>
+      <w:r>
+        <w:rPr>
+          <w:lang w:eastAsia="zh-CN"/>
+        </w:rPr>
+        <w:t>4,000</w:t>
+      </w:r>
+      <w:r>
+        <w:rPr>
+          <w:lang w:eastAsia="zh-CN"/>
+        </w:rPr>
+        <w:t>-headline spot check</w:t>
+      </w:r>
+      <w:r>
+        <w:rPr>
+          <w:lang w:eastAsia="zh-CN"/>
+        </w:rPr>
+        <w:t xml:space="preserve">, 48.5% scored zero in </w:t>
       </w:r>
       <w:r>
         <w:rPr>
@@ -3873,9 +3982,17 @@
       </w:r>
       <w:r>
         <w:rPr>
+          <w:rFonts w:hint="eastAsia"/>
           <w:color w:val="990F3D"/>
-        </w:rPr>
-        <w:t xml:space="preserve">4 — </w:t>
+          <w:lang w:eastAsia="zh-CN"/>
+        </w:rPr>
+        <w:t xml:space="preserve">3 </w:t>
+      </w:r>
+      <w:r>
+        <w:rPr>
+          <w:color w:val="990F3D"/>
+        </w:rPr>
+        <w:t xml:space="preserve">— </w:t>
       </w:r>
       <w:r>
         <w:rPr>
@@ -3895,7 +4012,21 @@
           <w:rFonts w:hint="eastAsia"/>
           <w:lang w:eastAsia="zh-CN"/>
         </w:rPr>
-        <w:t xml:space="preserve">Figure 4 above </w:t>
+        <w:t xml:space="preserve">Figure </w:t>
+      </w:r>
+      <w:r>
+        <w:rPr>
+          <w:rFonts w:hint="eastAsia"/>
+          <w:lang w:eastAsia="zh-CN"/>
+        </w:rPr>
+        <w:t>3</w:t>
+      </w:r>
+      <w:r>
+        <w:rPr>
+          <w:rFonts w:hint="eastAsia"/>
+          <w:lang w:eastAsia="zh-CN"/>
+        </w:rPr>
+        <w:t xml:space="preserve"> above </w:t>
       </w:r>
       <w:r>
         <w:rPr>
@@ -4314,7 +4445,20 @@
         <w:rPr>
           <w:lang w:eastAsia="zh-CN"/>
         </w:rPr>
-        <w:t xml:space="preserve">The industry differences in Figure 4 are also reasonable. Defensive industries like utilities and real estate have the highest overall line position; cyclical industries like </w:t>
+        <w:t xml:space="preserve">The industry differences in Figure </w:t>
+      </w:r>
+      <w:r>
+        <w:rPr>
+          <w:rFonts w:hint="eastAsia"/>
+          <w:lang w:eastAsia="zh-CN"/>
+        </w:rPr>
+        <w:t>3</w:t>
+      </w:r>
+      <w:r>
+        <w:rPr>
+          <w:lang w:eastAsia="zh-CN"/>
+        </w:rPr>
+        <w:t xml:space="preserve"> are also reasonable. Defensive industries like utilities and real estate have the highest overall line position; cyclical industries like </w:t>
       </w:r>
       <w:r>
         <w:rPr>
@@ -4637,7 +4781,20 @@
         <w:rPr>
           <w:lang w:eastAsia="zh-CN"/>
         </w:rPr>
-        <w:t xml:space="preserve">The results are shown in Figure 5 and Table 2: the tilt fund </w:t>
+        <w:t xml:space="preserve">The results are shown in Figure </w:t>
+      </w:r>
+      <w:r>
+        <w:rPr>
+          <w:rFonts w:hint="eastAsia"/>
+          <w:lang w:eastAsia="zh-CN"/>
+        </w:rPr>
+        <w:t>4</w:t>
+      </w:r>
+      <w:r>
+        <w:rPr>
+          <w:lang w:eastAsia="zh-CN"/>
+        </w:rPr>
+        <w:t xml:space="preserve"> and Table 2: the tilt fund </w:t>
       </w:r>
       <w:r>
         <w:rPr>
@@ -4800,7 +4957,15 @@
         <w:rPr>
           <w:color w:val="990F3D"/>
         </w:rPr>
-        <w:t>Figure 5</w:t>
+        <w:t xml:space="preserve">Figure </w:t>
+      </w:r>
+      <w:r>
+        <w:rPr>
+          <w:rFonts w:hint="eastAsia"/>
+          <w:color w:val="990F3D"/>
+          <w:lang w:eastAsia="zh-CN"/>
+        </w:rPr>
+        <w:t xml:space="preserve">4 </w:t>
       </w:r>
       <w:r>
         <w:rPr>
@@ -6255,7 +6420,22 @@
           <w:noProof/>
           <w:lang w:eastAsia="zh-CN"/>
         </w:rPr>
-        <w:t>(Product view 3)</w:t>
+        <w:t xml:space="preserve">(Product view </w:t>
+      </w:r>
+      <w:r>
+        <w:rPr>
+          <w:rFonts w:hint="eastAsia"/>
+          <w:noProof/>
+          <w:lang w:eastAsia="zh-CN"/>
+        </w:rPr>
+        <w:t>4</w:t>
+      </w:r>
+      <w:r>
+        <w:rPr>
+          <w:noProof/>
+          <w:lang w:eastAsia="zh-CN"/>
+        </w:rPr>
+        <w:t>)</w:t>
       </w:r>
     </w:p>
     <w:p>
@@ -6436,13 +6616,19 @@
         <w:rPr>
           <w:lang w:eastAsia="zh-CN"/>
         </w:rPr>
-        <w:t xml:space="preserve">mixed </w:t>
-      </w:r>
-      <w:r>
-        <w:rPr>
-          <w:lang w:eastAsia="zh-CN"/>
-        </w:rPr>
-        <w:t>is scored, and it is always decided to leave it to users,</w:t>
+        <w:t xml:space="preserve">mix </w:t>
+      </w:r>
+      <w:r>
+        <w:rPr>
+          <w:lang w:eastAsia="zh-CN"/>
+        </w:rPr>
+        <w:t>is scored, and it is always decided to leave it to use</w:t>
+      </w:r>
+      <w:r>
+        <w:rPr>
+          <w:lang w:eastAsia="zh-CN"/>
+        </w:rPr>
+        <w:t>rs.</w:t>
       </w:r>
     </w:p>
     <w:p>
@@ -6710,7 +6896,33 @@
         <w:rPr>
           <w:lang w:eastAsia="zh-CN"/>
         </w:rPr>
-        <w:t xml:space="preserve">. The settlement page will clearly calculate how much profit and loss each adjustment brings, so that users can see which decisions are useful and which are not. This is the first function to be done in the future of </w:t>
+        <w:t xml:space="preserve">. The settlement page will clearly calculate how much profit and loss each adjustment brings, </w:t>
+      </w:r>
+      <w:r>
+        <w:rPr>
+          <w:lang w:eastAsia="zh-CN"/>
+        </w:rPr>
+        <w:t xml:space="preserve">how many times users have adjusted, what is added or subtracted in US dollars for each adjustment, and how many results </w:t>
+      </w:r>
+      <w:r>
+        <w:rPr>
+          <w:lang w:eastAsia="zh-CN"/>
+        </w:rPr>
+        <w:lastRenderedPageBreak/>
+        <w:t>are market drifts. Whether these adjustments are worth judging by users</w:t>
+      </w:r>
+      <w:r>
+        <w:rPr>
+          <w:rFonts w:hint="eastAsia"/>
+          <w:lang w:eastAsia="zh-CN"/>
+        </w:rPr>
+        <w:t>.</w:t>
+      </w:r>
+      <w:r>
+        <w:rPr>
+          <w:lang w:eastAsia="zh-CN"/>
+        </w:rPr>
+        <w:t xml:space="preserve"> This is the first function to be done in the future of </w:t>
       </w:r>
       <w:proofErr w:type="spellStart"/>
       <w:r>
@@ -6737,7 +6949,6 @@
         <w:rPr>
           <w:lang w:eastAsia="zh-CN"/>
         </w:rPr>
-        <w:lastRenderedPageBreak/>
         <w:t>There are three specific suggestions based on evidence. First, before believing in the advantage of any optimization fund, add the transaction</w:t>
       </w:r>
       <w:r>
@@ -6874,7 +7085,6 @@
     <w:p>
       <w:pPr>
         <w:rPr>
-          <w:rFonts w:hint="eastAsia"/>
           <w:lang w:eastAsia="zh-CN"/>
         </w:rPr>
       </w:pPr>
@@ -7010,33 +7220,25 @@
         <w:rPr>
           <w:lang w:eastAsia="zh-CN"/>
         </w:rPr>
-        <w:t xml:space="preserve"> The logic </w:t>
-      </w:r>
-      <w:r>
-        <w:rPr>
-          <w:lang w:eastAsia="zh-CN"/>
-        </w:rPr>
-        <w:t>in some parts of the report was originally incorrect and messy; I fixed it and polished it using</w:t>
-      </w:r>
-      <w:r>
-        <w:rPr>
-          <w:lang w:eastAsia="zh-CN"/>
-        </w:rPr>
-        <w:t xml:space="preserve"> AI. </w:t>
-      </w:r>
-      <w:proofErr w:type="spellStart"/>
-      <w:r>
-        <w:rPr>
-          <w:lang w:eastAsia="zh-CN"/>
-        </w:rPr>
-        <w:t>The</w:t>
-      </w:r>
-      <w:proofErr w:type="spellEnd"/>
-      <w:r>
-        <w:rPr>
-          <w:lang w:eastAsia="zh-CN"/>
-        </w:rPr>
-        <w:t xml:space="preserve"> complete prompt record can be found in ai/prompt_log.md, and the proxy instruction file</w:t>
+        <w:t xml:space="preserve"> The logic in some parts of the report was originally incorrect and messy; I fixed it and polished it using AI. </w:t>
+      </w:r>
+      <w:r>
+        <w:rPr>
+          <w:lang w:eastAsia="zh-CN"/>
+        </w:rPr>
+        <w:t xml:space="preserve">The complete prompt record can be found in ai/prompt_log.md, and the </w:t>
+      </w:r>
+      <w:r>
+        <w:rPr>
+          <w:lang w:eastAsia="zh-CN"/>
+        </w:rPr>
+        <w:t>agent</w:t>
+      </w:r>
+      <w:r>
+        <w:rPr>
+          <w:lang w:eastAsia="zh-CN"/>
+        </w:rPr>
+        <w:t xml:space="preserve"> instruction file</w:t>
       </w:r>
       <w:r>
         <w:rPr>
@@ -7525,13 +7727,7 @@
         <w:rPr>
           <w:lang w:val="en-CN"/>
         </w:rPr>
-        <w:t xml:space="preserve"> </w:t>
-      </w:r>
-      <w:r>
-        <w:rPr>
-          <w:lang w:val="en-CN"/>
-        </w:rPr>
-        <w:t xml:space="preserve">(Accessed: </w:t>
+        <w:t xml:space="preserve"> (Accessed: </w:t>
       </w:r>
       <w:r>
         <w:rPr>
@@ -7633,9 +7829,16 @@
       </w:r>
       <w:r>
         <w:rPr>
+          <w:rFonts w:hint="eastAsia"/>
+          <w:lang w:val="en-CN" w:eastAsia="zh-CN"/>
+        </w:rPr>
+        <w:t>13</w:t>
+      </w:r>
+      <w:r>
+        <w:rPr>
           <w:lang w:val="en-CN"/>
         </w:rPr>
-        <w:t>13 August 13, 2026</w:t>
+        <w:t xml:space="preserve"> August, 2026</w:t>
       </w:r>
       <w:r>
         <w:rPr>

</xml_diff>

<commit_message>
Final submission state: report.pdf, updated report.docx with live links, README links, Session 46 log entry
</commit_message>
<xml_diff>
--- a/report/report.docx
+++ b/report/report.docx
@@ -40,6 +40,89 @@
       </w:r>
     </w:p>
     <w:p>
+      <w:pPr>
+        <w:rPr>
+          <w:lang w:eastAsia="zh-CN"/>
+        </w:rPr>
+      </w:pPr>
+      <w:r>
+        <w:rPr>
+          <w:lang w:eastAsia="zh-CN"/>
+        </w:rPr>
+        <w:t xml:space="preserve">GitHub Repositories link: </w:t>
+      </w:r>
+      <w:hyperlink r:id="rId8" w:history="1">
+        <w:r>
+          <w:rPr>
+            <w:rStyle w:val="Hyperlink"/>
+            <w:lang w:eastAsia="zh-CN"/>
+          </w:rPr>
+          <w:t>https://github.com/zeyi-gao-unsw/z5538441_projectB</w:t>
+        </w:r>
+      </w:hyperlink>
+    </w:p>
+    <w:p>
+      <w:pPr>
+        <w:rPr>
+          <w:lang w:eastAsia="zh-CN"/>
+        </w:rPr>
+      </w:pPr>
+      <w:proofErr w:type="spellStart"/>
+      <w:r>
+        <w:rPr>
+          <w:lang w:eastAsia="zh-CN"/>
+        </w:rPr>
+        <w:t>Streamlit</w:t>
+      </w:r>
+      <w:proofErr w:type="spellEnd"/>
+      <w:r>
+        <w:rPr>
+          <w:lang w:eastAsia="zh-CN"/>
+        </w:rPr>
+        <w:t xml:space="preserve"> App link: </w:t>
+      </w:r>
+      <w:hyperlink r:id="rId9" w:history="1">
+        <w:r>
+          <w:rPr>
+            <w:rStyle w:val="Hyperlink"/>
+            <w:lang w:eastAsia="zh-CN"/>
+          </w:rPr>
+          <w:t>https://zeyi-gao-unsw-z5538441-projectb-streamlit-app-</w:t>
+        </w:r>
+        <w:r>
+          <w:rPr>
+            <w:rStyle w:val="Hyperlink"/>
+            <w:lang w:eastAsia="zh-CN"/>
+          </w:rPr>
+          <w:t>h</w:t>
+        </w:r>
+        <w:r>
+          <w:rPr>
+            <w:rStyle w:val="Hyperlink"/>
+            <w:lang w:eastAsia="zh-CN"/>
+          </w:rPr>
+          <w:t>ssehq.streamlit.app/</w:t>
+        </w:r>
+      </w:hyperlink>
+    </w:p>
+    <w:p>
+      <w:pPr>
+        <w:rPr>
+          <w:lang w:eastAsia="zh-CN"/>
+        </w:rPr>
+      </w:pPr>
+    </w:p>
+    <w:p>
+      <w:pPr>
+        <w:rPr>
+          <w:rFonts w:ascii="Georgia" w:hAnsi="Georgia"/>
+          <w:b/>
+          <w:bCs/>
+          <w:color w:val="0F766E"/>
+          <w:sz w:val="30"/>
+          <w:szCs w:val="28"/>
+        </w:rPr>
+      </w:pPr>
       <w:r>
         <w:br w:type="page"/>
       </w:r>
@@ -2186,7 +2269,7 @@
                     <pic:cNvPicPr/>
                   </pic:nvPicPr>
                   <pic:blipFill>
-                    <a:blip r:embed="rId8"/>
+                    <a:blip r:embed="rId10"/>
                     <a:stretch>
                       <a:fillRect/>
                     </a:stretch>
@@ -2298,7 +2381,7 @@
                     <pic:cNvPicPr/>
                   </pic:nvPicPr>
                   <pic:blipFill>
-                    <a:blip r:embed="rId9"/>
+                    <a:blip r:embed="rId11"/>
                     <a:stretch>
                       <a:fillRect/>
                     </a:stretch>
@@ -3939,7 +4022,7 @@
                     <pic:cNvPicPr/>
                   </pic:nvPicPr>
                   <pic:blipFill>
-                    <a:blip r:embed="rId10"/>
+                    <a:blip r:embed="rId12"/>
                     <a:stretch>
                       <a:fillRect/>
                     </a:stretch>
@@ -4927,7 +5010,7 @@
                     <pic:cNvPicPr/>
                   </pic:nvPicPr>
                   <pic:blipFill>
-                    <a:blip r:embed="rId11"/>
+                    <a:blip r:embed="rId13"/>
                     <a:stretch>
                       <a:fillRect/>
                     </a:stretch>
@@ -5989,7 +6072,7 @@
                     <pic:cNvPicPr/>
                   </pic:nvPicPr>
                   <pic:blipFill>
-                    <a:blip r:embed="rId12"/>
+                    <a:blip r:embed="rId14"/>
                     <a:stretch>
                       <a:fillRect/>
                     </a:stretch>
@@ -6146,322 +6229,6 @@
                 <pic:pic xmlns:pic="http://schemas.openxmlformats.org/drawingml/2006/picture">
                   <pic:nvPicPr>
                     <pic:cNvPr id="0" name="app_fact_sheet.png"/>
-                    <pic:cNvPicPr/>
-                  </pic:nvPicPr>
-                  <pic:blipFill>
-                    <a:blip r:embed="rId13"/>
-                    <a:stretch>
-                      <a:fillRect/>
-                    </a:stretch>
-                  </pic:blipFill>
-                  <pic:spPr>
-                    <a:xfrm>
-                      <a:off x="0" y="0"/>
-                      <a:ext cx="5486400" cy="3429000"/>
-                    </a:xfrm>
-                    <a:prstGeom prst="rect">
-                      <a:avLst/>
-                    </a:prstGeom>
-                  </pic:spPr>
-                </pic:pic>
-              </a:graphicData>
-            </a:graphic>
-          </wp:inline>
-        </w:drawing>
-      </w:r>
-      <w:r>
-        <w:rPr>
-          <w:b/>
-          <w:bCs/>
-          <w:color w:val="990F3D"/>
-          <w:sz w:val="18"/>
-          <w:szCs w:val="18"/>
-        </w:rPr>
-        <w:t xml:space="preserve">Product view 2 — </w:t>
-      </w:r>
-      <w:r>
-        <w:rPr>
-          <w:b/>
-          <w:bCs/>
-          <w:color w:val="6B625C"/>
-          <w:sz w:val="18"/>
-          <w:szCs w:val="18"/>
-        </w:rPr>
-        <w:t>A fund fact sheet: headline measures with reading instructions, the one-line method description, and the construction block showing the rule applied to the fund's own latest numbers.</w:t>
-      </w:r>
-    </w:p>
-    <w:p>
-      <w:pPr>
-        <w:jc w:val="center"/>
-        <w:rPr>
-          <w:lang w:eastAsia="zh-CN"/>
-        </w:rPr>
-      </w:pPr>
-      <w:r>
-        <w:rPr>
-          <w:lang w:eastAsia="zh-CN"/>
-        </w:rPr>
-        <w:br/>
-      </w:r>
-    </w:p>
-    <w:p>
-      <w:pPr>
-        <w:rPr>
-          <w:noProof/>
-        </w:rPr>
-      </w:pPr>
-      <w:r>
-        <w:rPr>
-          <w:lang w:eastAsia="zh-CN"/>
-        </w:rPr>
-        <w:br w:type="page"/>
-      </w:r>
-      <w:r>
-        <w:rPr>
-          <w:lang w:eastAsia="zh-CN"/>
-        </w:rPr>
-        <w:lastRenderedPageBreak/>
-        <w:t>Th</w:t>
-      </w:r>
-      <w:r>
-        <w:rPr>
-          <w:lang w:eastAsia="zh-CN"/>
-        </w:rPr>
-        <w:t>ird</w:t>
-      </w:r>
-      <w:r>
-        <w:rPr>
-          <w:lang w:eastAsia="zh-CN"/>
-        </w:rPr>
-        <w:t xml:space="preserve"> </w:t>
-      </w:r>
-      <w:r>
-        <w:rPr>
-          <w:lang w:eastAsia="zh-CN"/>
-        </w:rPr>
-        <w:t>-</w:t>
-      </w:r>
-      <w:r>
-        <w:rPr>
-          <w:lang w:eastAsia="zh-CN"/>
-        </w:rPr>
-        <w:t xml:space="preserve"> Allocate</w:t>
-      </w:r>
-      <w:r>
-        <w:rPr>
-          <w:lang w:eastAsia="zh-CN"/>
-        </w:rPr>
-        <w:t xml:space="preserve">: The user enters a dollar amount and allocates it to each fund, and the historical performance of the portfolio will be given </w:t>
-      </w:r>
-      <w:r>
-        <w:rPr>
-          <w:lang w:eastAsia="zh-CN"/>
-        </w:rPr>
-        <w:t xml:space="preserve">together </w:t>
-      </w:r>
-      <w:r>
-        <w:rPr>
-          <w:lang w:eastAsia="zh-CN"/>
-        </w:rPr>
-        <w:t>with all assumptions.</w:t>
-      </w:r>
-      <w:r>
-        <w:rPr>
-          <w:noProof/>
-        </w:rPr>
-        <w:t xml:space="preserve"> (Product view 3)</w:t>
-      </w:r>
-    </w:p>
-    <w:p>
-      <w:pPr>
-        <w:rPr>
-          <w:lang w:eastAsia="zh-CN"/>
-        </w:rPr>
-      </w:pPr>
-      <w:r>
-        <w:rPr>
-          <w:noProof/>
-          <w:lang w:eastAsia="zh-CN"/>
-        </w:rPr>
-        <w:drawing>
-          <wp:inline distT="0" distB="0" distL="0" distR="0" wp14:anchorId="10637344" wp14:editId="614A85E9">
-            <wp:extent cx="5486400" cy="6737985"/>
-            <wp:effectExtent l="0" t="0" r="0" b="5715"/>
-            <wp:docPr id="141132302" name="Picture 1"/>
-            <wp:cNvGraphicFramePr>
-              <a:graphicFrameLocks xmlns:a="http://schemas.openxmlformats.org/drawingml/2006/main" noChangeAspect="1"/>
-            </wp:cNvGraphicFramePr>
-            <a:graphic xmlns:a="http://schemas.openxmlformats.org/drawingml/2006/main">
-              <a:graphicData uri="http://schemas.openxmlformats.org/drawingml/2006/picture">
-                <pic:pic xmlns:pic="http://schemas.openxmlformats.org/drawingml/2006/picture">
-                  <pic:nvPicPr>
-                    <pic:cNvPr id="141132302" name="Picture 141132302"/>
-                    <pic:cNvPicPr/>
-                  </pic:nvPicPr>
-                  <pic:blipFill>
-                    <a:blip r:embed="rId14"/>
-                    <a:stretch>
-                      <a:fillRect/>
-                    </a:stretch>
-                  </pic:blipFill>
-                  <pic:spPr>
-                    <a:xfrm>
-                      <a:off x="0" y="0"/>
-                      <a:ext cx="5486400" cy="6737985"/>
-                    </a:xfrm>
-                    <a:prstGeom prst="rect">
-                      <a:avLst/>
-                    </a:prstGeom>
-                  </pic:spPr>
-                </pic:pic>
-              </a:graphicData>
-            </a:graphic>
-          </wp:inline>
-        </w:drawing>
-      </w:r>
-      <w:r>
-        <w:rPr>
-          <w:b/>
-          <w:bCs/>
-          <w:color w:val="990F3D"/>
-          <w:sz w:val="18"/>
-          <w:szCs w:val="18"/>
-        </w:rPr>
-        <w:t xml:space="preserve">Product view 3 — </w:t>
-      </w:r>
-      <w:r>
-        <w:rPr>
-          <w:b/>
-          <w:bCs/>
-          <w:color w:val="6B625C"/>
-          <w:sz w:val="18"/>
-          <w:szCs w:val="18"/>
-        </w:rPr>
-        <w:t>The allocation step: a dollar amount is entered first, then placed across the funds, with each fund's live share of the mix shown as it is typed</w:t>
-      </w:r>
-    </w:p>
-    <w:p>
-      <w:pPr>
-        <w:rPr>
-          <w:lang w:eastAsia="zh-CN"/>
-        </w:rPr>
-      </w:pPr>
-      <w:r>
-        <w:rPr>
-          <w:lang w:eastAsia="zh-CN"/>
-        </w:rPr>
-        <w:br w:type="page"/>
-      </w:r>
-    </w:p>
-    <w:p>
-      <w:pPr>
-        <w:rPr>
-          <w:noProof/>
-          <w:lang w:eastAsia="zh-CN"/>
-        </w:rPr>
-      </w:pPr>
-      <w:r>
-        <w:rPr>
-          <w:lang w:eastAsia="zh-CN"/>
-        </w:rPr>
-        <w:lastRenderedPageBreak/>
-        <w:t>F</w:t>
-      </w:r>
-      <w:r>
-        <w:rPr>
-          <w:lang w:eastAsia="zh-CN"/>
-        </w:rPr>
-        <w:t>ourth</w:t>
-      </w:r>
-      <w:r>
-        <w:rPr>
-          <w:lang w:eastAsia="zh-CN"/>
-        </w:rPr>
-        <w:t xml:space="preserve"> </w:t>
-      </w:r>
-      <w:r>
-        <w:rPr>
-          <w:lang w:eastAsia="zh-CN"/>
-        </w:rPr>
-        <w:t>-</w:t>
-      </w:r>
-      <w:r>
-        <w:rPr>
-          <w:lang w:eastAsia="zh-CN"/>
-        </w:rPr>
-        <w:t xml:space="preserve"> </w:t>
-      </w:r>
-      <w:r>
-        <w:rPr>
-          <w:lang w:eastAsia="zh-CN"/>
-        </w:rPr>
-        <w:t>Explor</w:t>
-      </w:r>
-      <w:r>
-        <w:rPr>
-          <w:lang w:eastAsia="zh-CN"/>
-        </w:rPr>
-        <w:t>e</w:t>
-      </w:r>
-      <w:r>
-        <w:rPr>
-          <w:lang w:eastAsia="zh-CN"/>
-        </w:rPr>
-        <w:t>: The sentiment page provides a multiple-choice comparison and standardized view of the industry index. The permanent sentence is that it describes the tone of news and does not represent a trading signal.</w:t>
-      </w:r>
-      <w:r>
-        <w:rPr>
-          <w:lang w:eastAsia="zh-CN"/>
-        </w:rPr>
-        <w:t xml:space="preserve"> </w:t>
-      </w:r>
-      <w:r>
-        <w:rPr>
-          <w:noProof/>
-          <w:lang w:eastAsia="zh-CN"/>
-        </w:rPr>
-        <w:t xml:space="preserve">(Product view </w:t>
-      </w:r>
-      <w:r>
-        <w:rPr>
-          <w:rFonts w:hint="eastAsia"/>
-          <w:noProof/>
-          <w:lang w:eastAsia="zh-CN"/>
-        </w:rPr>
-        <w:t>4</w:t>
-      </w:r>
-      <w:r>
-        <w:rPr>
-          <w:noProof/>
-          <w:lang w:eastAsia="zh-CN"/>
-        </w:rPr>
-        <w:t>)</w:t>
-      </w:r>
-    </w:p>
-    <w:p>
-      <w:pPr>
-        <w:rPr>
-          <w:noProof/>
-          <w:lang w:eastAsia="zh-CN"/>
-        </w:rPr>
-      </w:pPr>
-      <w:r>
-        <w:rPr>
-          <w:noProof/>
-        </w:rPr>
-        <w:drawing>
-          <wp:inline distT="0" distB="0" distL="0" distR="0" wp14:anchorId="28E7A80E" wp14:editId="5A26E27F">
-            <wp:extent cx="5486400" cy="3429000"/>
-            <wp:effectExtent l="0" t="0" r="0" b="0"/>
-            <wp:docPr id="1536942778" name="Picture 1536942778"/>
-            <wp:cNvGraphicFramePr>
-              <a:graphicFrameLocks xmlns:a="http://schemas.openxmlformats.org/drawingml/2006/main" noChangeAspect="1"/>
-            </wp:cNvGraphicFramePr>
-            <a:graphic xmlns:a="http://schemas.openxmlformats.org/drawingml/2006/main">
-              <a:graphicData uri="http://schemas.openxmlformats.org/drawingml/2006/picture">
-                <pic:pic xmlns:pic="http://schemas.openxmlformats.org/drawingml/2006/picture">
-                  <pic:nvPicPr>
-                    <pic:cNvPr id="0" name="app_sentiment.png"/>
                     <pic:cNvPicPr/>
                   </pic:nvPicPr>
                   <pic:blipFill>
@@ -6493,27 +6260,7 @@
           <w:sz w:val="18"/>
           <w:szCs w:val="18"/>
         </w:rPr>
-        <w:t xml:space="preserve">Product view </w:t>
-      </w:r>
-      <w:r>
-        <w:rPr>
-          <w:b/>
-          <w:bCs/>
-          <w:color w:val="990F3D"/>
-          <w:sz w:val="18"/>
-          <w:szCs w:val="18"/>
-        </w:rPr>
-        <w:t>4</w:t>
-      </w:r>
-      <w:r>
-        <w:rPr>
-          <w:b/>
-          <w:bCs/>
-          <w:color w:val="990F3D"/>
-          <w:sz w:val="18"/>
-          <w:szCs w:val="18"/>
-        </w:rPr>
-        <w:t xml:space="preserve"> — </w:t>
+        <w:t xml:space="preserve">Product view 2 — </w:t>
       </w:r>
       <w:r>
         <w:rPr>
@@ -6523,131 +6270,107 @@
           <w:sz w:val="18"/>
           <w:szCs w:val="18"/>
         </w:rPr>
-        <w:t>The sentiment tab: sector news tone with multi-select comparison and the standardized view, under the permanent not-a-signal disclaimer.</w:t>
+        <w:t>A fund fact sheet: headline measures with reading instructions, the one-line method description, and the construction block showing the rule applied to the fund's own latest numbers.</w:t>
       </w:r>
     </w:p>
     <w:p>
       <w:pPr>
-        <w:rPr>
-          <w:lang w:eastAsia="zh-CN"/>
-        </w:rPr>
-      </w:pPr>
-      <w:r>
-        <w:rPr>
-          <w:lang w:eastAsia="zh-CN"/>
-        </w:rPr>
-        <w:t xml:space="preserve">The saved combination will </w:t>
-      </w:r>
-      <w:r>
-        <w:rPr>
-          <w:lang w:eastAsia="zh-CN"/>
-        </w:rPr>
-        <w:t>be added to</w:t>
-      </w:r>
-      <w:r>
-        <w:rPr>
-          <w:lang w:eastAsia="zh-CN"/>
-        </w:rPr>
-        <w:t xml:space="preserve"> My </w:t>
-      </w:r>
-      <w:r>
-        <w:rPr>
-          <w:lang w:eastAsia="zh-CN"/>
-        </w:rPr>
-        <w:t>P</w:t>
-      </w:r>
-      <w:r>
-        <w:rPr>
-          <w:lang w:eastAsia="zh-CN"/>
-        </w:rPr>
-        <w:t>ortfolio and can be sent back to the practice area for a time machine walkthrough at any time</w:t>
-      </w:r>
-      <w:r>
-        <w:rPr>
-          <w:lang w:eastAsia="zh-CN"/>
-        </w:rPr>
-        <w:t xml:space="preserve"> (Product view </w:t>
-      </w:r>
-      <w:r>
-        <w:rPr>
-          <w:lang w:eastAsia="zh-CN"/>
-        </w:rPr>
-        <w:t>5</w:t>
-      </w:r>
-      <w:r>
-        <w:rPr>
-          <w:lang w:eastAsia="zh-CN"/>
-        </w:rPr>
-        <w:t>)</w:t>
-      </w:r>
-      <w:r>
-        <w:rPr>
-          <w:lang w:eastAsia="zh-CN"/>
-        </w:rPr>
-        <w:t xml:space="preserve">. Keep the same line for the whole journey that </w:t>
-      </w:r>
-      <w:proofErr w:type="spellStart"/>
-      <w:r>
-        <w:rPr>
-          <w:lang w:eastAsia="zh-CN"/>
-        </w:rPr>
-        <w:t>HyperInvest</w:t>
-      </w:r>
-      <w:proofErr w:type="spellEnd"/>
-      <w:r>
-        <w:rPr>
-          <w:lang w:eastAsia="zh-CN"/>
-        </w:rPr>
-        <w:t xml:space="preserve"> is an evidence layer</w:t>
-      </w:r>
-      <w:r>
-        <w:rPr>
-          <w:lang w:eastAsia="zh-CN"/>
-        </w:rPr>
-        <w:t xml:space="preserve"> rather than an advice layer</w:t>
-      </w:r>
-      <w:r>
-        <w:rPr>
-          <w:lang w:eastAsia="zh-CN"/>
-        </w:rPr>
-        <w:t xml:space="preserve">, and the app itself does not recommend any fund; no </w:t>
-      </w:r>
-      <w:r>
-        <w:rPr>
-          <w:lang w:eastAsia="zh-CN"/>
-        </w:rPr>
-        <w:t xml:space="preserve">mix </w:t>
-      </w:r>
-      <w:r>
-        <w:rPr>
-          <w:lang w:eastAsia="zh-CN"/>
-        </w:rPr>
-        <w:t>is scored, and it is always decided to leave it to use</w:t>
-      </w:r>
-      <w:r>
-        <w:rPr>
-          <w:lang w:eastAsia="zh-CN"/>
-        </w:rPr>
-        <w:t>rs.</w:t>
+        <w:jc w:val="center"/>
+        <w:rPr>
+          <w:lang w:eastAsia="zh-CN"/>
+        </w:rPr>
+      </w:pPr>
+      <w:r>
+        <w:rPr>
+          <w:lang w:eastAsia="zh-CN"/>
+        </w:rPr>
+        <w:br/>
       </w:r>
     </w:p>
     <w:p>
       <w:pPr>
         <w:rPr>
-          <w:lang w:eastAsia="zh-CN"/>
-        </w:rPr>
-      </w:pPr>
-      <w:r>
-        <w:rPr>
           <w:noProof/>
-          <w:highlight w:val="yellow"/>
+        </w:rPr>
+      </w:pPr>
+      <w:r>
+        <w:rPr>
+          <w:lang w:eastAsia="zh-CN"/>
+        </w:rPr>
+        <w:br w:type="page"/>
+      </w:r>
+      <w:r>
+        <w:rPr>
+          <w:lang w:eastAsia="zh-CN"/>
         </w:rPr>
         <w:lastRenderedPageBreak/>
+        <w:t>Th</w:t>
+      </w:r>
+      <w:r>
+        <w:rPr>
+          <w:lang w:eastAsia="zh-CN"/>
+        </w:rPr>
+        <w:t>ird</w:t>
+      </w:r>
+      <w:r>
+        <w:rPr>
+          <w:lang w:eastAsia="zh-CN"/>
+        </w:rPr>
+        <w:t xml:space="preserve"> </w:t>
+      </w:r>
+      <w:r>
+        <w:rPr>
+          <w:lang w:eastAsia="zh-CN"/>
+        </w:rPr>
+        <w:t>-</w:t>
+      </w:r>
+      <w:r>
+        <w:rPr>
+          <w:lang w:eastAsia="zh-CN"/>
+        </w:rPr>
+        <w:t xml:space="preserve"> Allocate</w:t>
+      </w:r>
+      <w:r>
+        <w:rPr>
+          <w:lang w:eastAsia="zh-CN"/>
+        </w:rPr>
+        <w:t xml:space="preserve">: The user enters a dollar amount and allocates it to each fund, and the historical performance of the portfolio will be given </w:t>
+      </w:r>
+      <w:r>
+        <w:rPr>
+          <w:lang w:eastAsia="zh-CN"/>
+        </w:rPr>
+        <w:t xml:space="preserve">together </w:t>
+      </w:r>
+      <w:r>
+        <w:rPr>
+          <w:lang w:eastAsia="zh-CN"/>
+        </w:rPr>
+        <w:t>with all assumptions.</w:t>
+      </w:r>
+      <w:r>
+        <w:rPr>
+          <w:noProof/>
+        </w:rPr>
+        <w:t xml:space="preserve"> (Product view 3)</w:t>
+      </w:r>
+    </w:p>
+    <w:p>
+      <w:pPr>
+        <w:rPr>
+          <w:lang w:eastAsia="zh-CN"/>
+        </w:rPr>
+      </w:pPr>
+      <w:r>
+        <w:rPr>
+          <w:noProof/>
+          <w:lang w:eastAsia="zh-CN"/>
+        </w:rPr>
         <w:drawing>
-          <wp:inline distT="0" distB="0" distL="0" distR="0" wp14:anchorId="1B7AD7F3" wp14:editId="52BB3348">
-            <wp:extent cx="5486400" cy="3429000"/>
-            <wp:effectExtent l="0" t="0" r="4445" b="2540"/>
-            <wp:docPr id="65491481" name="Picture 65491481"/>
+          <wp:inline distT="0" distB="0" distL="0" distR="0" wp14:anchorId="10637344" wp14:editId="614A85E9">
+            <wp:extent cx="5486400" cy="6737985"/>
+            <wp:effectExtent l="0" t="0" r="0" b="5715"/>
+            <wp:docPr id="141132302" name="Picture 1"/>
             <wp:cNvGraphicFramePr>
               <a:graphicFrameLocks xmlns:a="http://schemas.openxmlformats.org/drawingml/2006/main" noChangeAspect="1"/>
             </wp:cNvGraphicFramePr>
@@ -6655,11 +6378,177 @@
               <a:graphicData uri="http://schemas.openxmlformats.org/drawingml/2006/picture">
                 <pic:pic xmlns:pic="http://schemas.openxmlformats.org/drawingml/2006/picture">
                   <pic:nvPicPr>
-                    <pic:cNvPr id="0" name="app_blind_walk.png"/>
+                    <pic:cNvPr id="141132302" name="Picture 141132302"/>
                     <pic:cNvPicPr/>
                   </pic:nvPicPr>
                   <pic:blipFill>
                     <a:blip r:embed="rId16"/>
+                    <a:stretch>
+                      <a:fillRect/>
+                    </a:stretch>
+                  </pic:blipFill>
+                  <pic:spPr>
+                    <a:xfrm>
+                      <a:off x="0" y="0"/>
+                      <a:ext cx="5486400" cy="6737985"/>
+                    </a:xfrm>
+                    <a:prstGeom prst="rect">
+                      <a:avLst/>
+                    </a:prstGeom>
+                  </pic:spPr>
+                </pic:pic>
+              </a:graphicData>
+            </a:graphic>
+          </wp:inline>
+        </w:drawing>
+      </w:r>
+      <w:r>
+        <w:rPr>
+          <w:b/>
+          <w:bCs/>
+          <w:color w:val="990F3D"/>
+          <w:sz w:val="18"/>
+          <w:szCs w:val="18"/>
+        </w:rPr>
+        <w:t xml:space="preserve">Product view 3 — </w:t>
+      </w:r>
+      <w:r>
+        <w:rPr>
+          <w:b/>
+          <w:bCs/>
+          <w:color w:val="6B625C"/>
+          <w:sz w:val="18"/>
+          <w:szCs w:val="18"/>
+        </w:rPr>
+        <w:t>The allocation step: a dollar amount is entered first, then placed across the funds, with each fund's live share of the mix shown as it is typed</w:t>
+      </w:r>
+    </w:p>
+    <w:p>
+      <w:pPr>
+        <w:rPr>
+          <w:lang w:eastAsia="zh-CN"/>
+        </w:rPr>
+      </w:pPr>
+      <w:r>
+        <w:rPr>
+          <w:lang w:eastAsia="zh-CN"/>
+        </w:rPr>
+        <w:br w:type="page"/>
+      </w:r>
+    </w:p>
+    <w:p>
+      <w:pPr>
+        <w:rPr>
+          <w:noProof/>
+          <w:lang w:eastAsia="zh-CN"/>
+        </w:rPr>
+      </w:pPr>
+      <w:r>
+        <w:rPr>
+          <w:lang w:eastAsia="zh-CN"/>
+        </w:rPr>
+        <w:lastRenderedPageBreak/>
+        <w:t>F</w:t>
+      </w:r>
+      <w:r>
+        <w:rPr>
+          <w:lang w:eastAsia="zh-CN"/>
+        </w:rPr>
+        <w:t>ourth</w:t>
+      </w:r>
+      <w:r>
+        <w:rPr>
+          <w:lang w:eastAsia="zh-CN"/>
+        </w:rPr>
+        <w:t xml:space="preserve"> </w:t>
+      </w:r>
+      <w:r>
+        <w:rPr>
+          <w:lang w:eastAsia="zh-CN"/>
+        </w:rPr>
+        <w:t>-</w:t>
+      </w:r>
+      <w:r>
+        <w:rPr>
+          <w:lang w:eastAsia="zh-CN"/>
+        </w:rPr>
+        <w:t xml:space="preserve"> </w:t>
+      </w:r>
+      <w:r>
+        <w:rPr>
+          <w:lang w:eastAsia="zh-CN"/>
+        </w:rPr>
+        <w:t>Explor</w:t>
+      </w:r>
+      <w:r>
+        <w:rPr>
+          <w:lang w:eastAsia="zh-CN"/>
+        </w:rPr>
+        <w:t>e</w:t>
+      </w:r>
+      <w:r>
+        <w:rPr>
+          <w:lang w:eastAsia="zh-CN"/>
+        </w:rPr>
+        <w:t>: The sentiment page provides a multiple-choice comparison and standardized view of the industry index. The permanent sentence is that it describes the tone of news and does not represent a trading signal.</w:t>
+      </w:r>
+      <w:r>
+        <w:rPr>
+          <w:lang w:eastAsia="zh-CN"/>
+        </w:rPr>
+        <w:t xml:space="preserve"> </w:t>
+      </w:r>
+      <w:r>
+        <w:rPr>
+          <w:noProof/>
+          <w:lang w:eastAsia="zh-CN"/>
+        </w:rPr>
+        <w:t xml:space="preserve">(Product view </w:t>
+      </w:r>
+      <w:r>
+        <w:rPr>
+          <w:rFonts w:hint="eastAsia"/>
+          <w:noProof/>
+          <w:lang w:eastAsia="zh-CN"/>
+        </w:rPr>
+        <w:t>4</w:t>
+      </w:r>
+      <w:r>
+        <w:rPr>
+          <w:noProof/>
+          <w:lang w:eastAsia="zh-CN"/>
+        </w:rPr>
+        <w:t>)</w:t>
+      </w:r>
+    </w:p>
+    <w:p>
+      <w:pPr>
+        <w:rPr>
+          <w:noProof/>
+          <w:lang w:eastAsia="zh-CN"/>
+        </w:rPr>
+      </w:pPr>
+      <w:r>
+        <w:rPr>
+          <w:noProof/>
+        </w:rPr>
+        <w:drawing>
+          <wp:inline distT="0" distB="0" distL="0" distR="0" wp14:anchorId="28E7A80E" wp14:editId="5A26E27F">
+            <wp:extent cx="5486400" cy="3429000"/>
+            <wp:effectExtent l="0" t="0" r="0" b="0"/>
+            <wp:docPr id="1536942778" name="Picture 1536942778"/>
+            <wp:cNvGraphicFramePr>
+              <a:graphicFrameLocks xmlns:a="http://schemas.openxmlformats.org/drawingml/2006/main" noChangeAspect="1"/>
+            </wp:cNvGraphicFramePr>
+            <a:graphic xmlns:a="http://schemas.openxmlformats.org/drawingml/2006/main">
+              <a:graphicData uri="http://schemas.openxmlformats.org/drawingml/2006/picture">
+                <pic:pic xmlns:pic="http://schemas.openxmlformats.org/drawingml/2006/picture">
+                  <pic:nvPicPr>
+                    <pic:cNvPr id="0" name="app_sentiment.png"/>
+                    <pic:cNvPicPr/>
+                  </pic:nvPicPr>
+                  <pic:blipFill>
+                    <a:blip r:embed="rId17"/>
                     <a:stretch>
                       <a:fillRect/>
                     </a:stretch>
@@ -6697,7 +6586,7 @@
           <w:sz w:val="18"/>
           <w:szCs w:val="18"/>
         </w:rPr>
-        <w:t>5</w:t>
+        <w:t>4</w:t>
       </w:r>
       <w:r>
         <w:rPr>
@@ -6717,15 +6606,112 @@
           <w:sz w:val="18"/>
           <w:szCs w:val="18"/>
         </w:rPr>
-        <w:t>The Practice time machine in Blind walk: the future is hidden, a turbulent stretch (the May 2021 crypto sell-off) slows travel to daily steps, and forward movement pauses at window starts.</w:t>
+        <w:t>The sentiment tab: sector news tone with multi-select comparison and the standardized view, under the permanent not-a-signal disclaimer.</w:t>
       </w:r>
     </w:p>
     <w:p>
       <w:pPr>
-        <w:pStyle w:val="Heading1"/>
-      </w:pPr>
-      <w:r>
-        <w:t>6. Critical reflection and recommendations</w:t>
+        <w:rPr>
+          <w:lang w:eastAsia="zh-CN"/>
+        </w:rPr>
+      </w:pPr>
+      <w:r>
+        <w:rPr>
+          <w:lang w:eastAsia="zh-CN"/>
+        </w:rPr>
+        <w:t xml:space="preserve">The saved combination will </w:t>
+      </w:r>
+      <w:r>
+        <w:rPr>
+          <w:lang w:eastAsia="zh-CN"/>
+        </w:rPr>
+        <w:t>be added to</w:t>
+      </w:r>
+      <w:r>
+        <w:rPr>
+          <w:lang w:eastAsia="zh-CN"/>
+        </w:rPr>
+        <w:t xml:space="preserve"> My </w:t>
+      </w:r>
+      <w:r>
+        <w:rPr>
+          <w:lang w:eastAsia="zh-CN"/>
+        </w:rPr>
+        <w:t>P</w:t>
+      </w:r>
+      <w:r>
+        <w:rPr>
+          <w:lang w:eastAsia="zh-CN"/>
+        </w:rPr>
+        <w:t>ortfolio and can be sent back to the practice area for a time machine walkthrough at any time</w:t>
+      </w:r>
+      <w:r>
+        <w:rPr>
+          <w:lang w:eastAsia="zh-CN"/>
+        </w:rPr>
+        <w:t xml:space="preserve"> (Product view </w:t>
+      </w:r>
+      <w:r>
+        <w:rPr>
+          <w:lang w:eastAsia="zh-CN"/>
+        </w:rPr>
+        <w:t>5</w:t>
+      </w:r>
+      <w:r>
+        <w:rPr>
+          <w:lang w:eastAsia="zh-CN"/>
+        </w:rPr>
+        <w:t>)</w:t>
+      </w:r>
+      <w:r>
+        <w:rPr>
+          <w:lang w:eastAsia="zh-CN"/>
+        </w:rPr>
+        <w:t xml:space="preserve">. Keep the same line for the whole journey that </w:t>
+      </w:r>
+      <w:proofErr w:type="spellStart"/>
+      <w:r>
+        <w:rPr>
+          <w:lang w:eastAsia="zh-CN"/>
+        </w:rPr>
+        <w:t>HyperInvest</w:t>
+      </w:r>
+      <w:proofErr w:type="spellEnd"/>
+      <w:r>
+        <w:rPr>
+          <w:lang w:eastAsia="zh-CN"/>
+        </w:rPr>
+        <w:t xml:space="preserve"> is an evidence layer</w:t>
+      </w:r>
+      <w:r>
+        <w:rPr>
+          <w:lang w:eastAsia="zh-CN"/>
+        </w:rPr>
+        <w:t xml:space="preserve"> rather than an advice layer</w:t>
+      </w:r>
+      <w:r>
+        <w:rPr>
+          <w:lang w:eastAsia="zh-CN"/>
+        </w:rPr>
+        <w:t xml:space="preserve">, and the app itself does not recommend any fund; no </w:t>
+      </w:r>
+      <w:r>
+        <w:rPr>
+          <w:lang w:eastAsia="zh-CN"/>
+        </w:rPr>
+        <w:t xml:space="preserve">mix </w:t>
+      </w:r>
+      <w:r>
+        <w:rPr>
+          <w:lang w:eastAsia="zh-CN"/>
+        </w:rPr>
+        <w:t>is scored, and it is always decided to leave it to use</w:t>
+      </w:r>
+      <w:r>
+        <w:rPr>
+          <w:lang w:eastAsia="zh-CN"/>
+        </w:rPr>
+        <w:t>rs.</w:t>
       </w:r>
     </w:p>
     <w:p>
@@ -6736,106 +6722,93 @@
       </w:pPr>
       <w:r>
         <w:rPr>
-          <w:lang w:eastAsia="zh-CN"/>
-        </w:rPr>
-        <w:t>After review</w:t>
-      </w:r>
-      <w:r>
-        <w:rPr>
-          <w:lang w:eastAsia="zh-CN"/>
-        </w:rPr>
-        <w:t>ing</w:t>
-      </w:r>
-      <w:r>
-        <w:rPr>
-          <w:lang w:eastAsia="zh-CN"/>
-        </w:rPr>
-        <w:t xml:space="preserve"> the whole project, the most effective thing is not a certain result, but discipline.</w:t>
-      </w:r>
-      <w:r>
-        <w:rPr>
-          <w:lang w:eastAsia="zh-CN"/>
-        </w:rPr>
-        <w:t xml:space="preserve"> The weight is only formed by past data, the </w:t>
-      </w:r>
-      <w:r>
-        <w:rPr>
-          <w:lang w:eastAsia="zh-CN"/>
-        </w:rPr>
-        <w:t>sentiment</w:t>
-      </w:r>
-      <w:r>
-        <w:rPr>
-          <w:lang w:eastAsia="zh-CN"/>
-        </w:rPr>
-        <w:t xml:space="preserve"> signals </w:t>
-      </w:r>
-      <w:r>
-        <w:rPr>
-          <w:lang w:eastAsia="zh-CN"/>
-        </w:rPr>
-        <w:t>are</w:t>
-      </w:r>
-      <w:r>
-        <w:rPr>
-          <w:lang w:eastAsia="zh-CN"/>
-        </w:rPr>
-        <w:t xml:space="preserve"> forced to lag one trading day, and the output of the solver is compared across methods every time it is constructed. These checks detected mistakes. The </w:t>
-      </w:r>
-      <w:r>
-        <w:rPr>
-          <w:lang w:eastAsia="zh-CN"/>
-        </w:rPr>
-        <w:t>solver’s silent stalling</w:t>
-      </w:r>
-      <w:r>
-        <w:rPr>
-          <w:lang w:eastAsia="zh-CN"/>
-        </w:rPr>
-        <w:t xml:space="preserve"> and the </w:t>
-      </w:r>
-      <w:r>
-        <w:rPr>
-          <w:lang w:eastAsia="zh-CN"/>
-        </w:rPr>
-        <w:t>look-ahead in the sentiment signal were caught in this way</w:t>
-      </w:r>
-      <w:r>
-        <w:rPr>
-          <w:lang w:eastAsia="zh-CN"/>
-        </w:rPr>
-        <w:t>. Another valid judgment is that neutrality and usefulness can coexist; the plain language teaches how to read and understand the evidenc</w:t>
-      </w:r>
-      <w:r>
-        <w:rPr>
-          <w:lang w:eastAsia="zh-CN"/>
-        </w:rPr>
-        <w:t>e, not choose for users.</w:t>
+          <w:noProof/>
+          <w:highlight w:val="yellow"/>
+        </w:rPr>
+        <w:lastRenderedPageBreak/>
+        <w:drawing>
+          <wp:inline distT="0" distB="0" distL="0" distR="0" wp14:anchorId="1B7AD7F3" wp14:editId="52BB3348">
+            <wp:extent cx="5486400" cy="3429000"/>
+            <wp:effectExtent l="0" t="0" r="4445" b="2540"/>
+            <wp:docPr id="65491481" name="Picture 65491481"/>
+            <wp:cNvGraphicFramePr>
+              <a:graphicFrameLocks xmlns:a="http://schemas.openxmlformats.org/drawingml/2006/main" noChangeAspect="1"/>
+            </wp:cNvGraphicFramePr>
+            <a:graphic xmlns:a="http://schemas.openxmlformats.org/drawingml/2006/main">
+              <a:graphicData uri="http://schemas.openxmlformats.org/drawingml/2006/picture">
+                <pic:pic xmlns:pic="http://schemas.openxmlformats.org/drawingml/2006/picture">
+                  <pic:nvPicPr>
+                    <pic:cNvPr id="0" name="app_blind_walk.png"/>
+                    <pic:cNvPicPr/>
+                  </pic:nvPicPr>
+                  <pic:blipFill>
+                    <a:blip r:embed="rId18"/>
+                    <a:stretch>
+                      <a:fillRect/>
+                    </a:stretch>
+                  </pic:blipFill>
+                  <pic:spPr>
+                    <a:xfrm>
+                      <a:off x="0" y="0"/>
+                      <a:ext cx="5486400" cy="3429000"/>
+                    </a:xfrm>
+                    <a:prstGeom prst="rect">
+                      <a:avLst/>
+                    </a:prstGeom>
+                  </pic:spPr>
+                </pic:pic>
+              </a:graphicData>
+            </a:graphic>
+          </wp:inline>
+        </w:drawing>
+      </w:r>
+      <w:r>
+        <w:rPr>
+          <w:b/>
+          <w:bCs/>
+          <w:color w:val="990F3D"/>
+          <w:sz w:val="18"/>
+          <w:szCs w:val="18"/>
+        </w:rPr>
+        <w:t xml:space="preserve">Product view </w:t>
+      </w:r>
+      <w:r>
+        <w:rPr>
+          <w:b/>
+          <w:bCs/>
+          <w:color w:val="990F3D"/>
+          <w:sz w:val="18"/>
+          <w:szCs w:val="18"/>
+        </w:rPr>
+        <w:t>5</w:t>
+      </w:r>
+      <w:r>
+        <w:rPr>
+          <w:b/>
+          <w:bCs/>
+          <w:color w:val="990F3D"/>
+          <w:sz w:val="18"/>
+          <w:szCs w:val="18"/>
+        </w:rPr>
+        <w:t xml:space="preserve"> — </w:t>
+      </w:r>
+      <w:r>
+        <w:rPr>
+          <w:b/>
+          <w:bCs/>
+          <w:color w:val="6B625C"/>
+          <w:sz w:val="18"/>
+          <w:szCs w:val="18"/>
+        </w:rPr>
+        <w:t>The Practice time machine in Blind walk: the future is hidden, a turbulent stretch (the May 2021 crypto sell-off) slows travel to daily steps, and forward movement pauses at window starts.</w:t>
       </w:r>
     </w:p>
     <w:p>
       <w:pPr>
-        <w:rPr>
-          <w:lang w:eastAsia="zh-CN"/>
-        </w:rPr>
-      </w:pPr>
-      <w:r>
-        <w:rPr>
-          <w:lang w:eastAsia="zh-CN"/>
-        </w:rPr>
-        <w:t xml:space="preserve">The unsuccessful part also has a lot of information. Sentiment tilt reduces value, and post-analysis is more useful than the result itself. The signal is real but noisy, and the noise is directly folded into the weight, which shows that it is an unnecessary position adjustment, not an advantage. The three explicit simplifications qualify all the conclusions: zero transaction costs, zero risk-free interest rates, and the sample </w:t>
-      </w:r>
-      <w:r>
-        <w:rPr>
-          <w:lang w:eastAsia="zh-CN"/>
-        </w:rPr>
-        <w:t>end</w:t>
-      </w:r>
-      <w:r>
-        <w:rPr>
-          <w:lang w:eastAsia="zh-CN"/>
-        </w:rPr>
-        <w:t xml:space="preserve"> on 29 December 2023, so this product does not have a word to describe today’s market.</w:t>
+        <w:pStyle w:val="Heading1"/>
+      </w:pPr>
+      <w:r>
+        <w:t>6. Critical reflection and recommendations</w:t>
       </w:r>
     </w:p>
     <w:p>
@@ -6848,6 +6821,116 @@
         <w:rPr>
           <w:lang w:eastAsia="zh-CN"/>
         </w:rPr>
+        <w:t>After review</w:t>
+      </w:r>
+      <w:r>
+        <w:rPr>
+          <w:lang w:eastAsia="zh-CN"/>
+        </w:rPr>
+        <w:t>ing</w:t>
+      </w:r>
+      <w:r>
+        <w:rPr>
+          <w:lang w:eastAsia="zh-CN"/>
+        </w:rPr>
+        <w:t xml:space="preserve"> the whole project, the most effective thing is not a certain result, but discipline.</w:t>
+      </w:r>
+      <w:r>
+        <w:rPr>
+          <w:lang w:eastAsia="zh-CN"/>
+        </w:rPr>
+        <w:t xml:space="preserve"> The weight is only formed by past data, the </w:t>
+      </w:r>
+      <w:r>
+        <w:rPr>
+          <w:lang w:eastAsia="zh-CN"/>
+        </w:rPr>
+        <w:t>sentiment</w:t>
+      </w:r>
+      <w:r>
+        <w:rPr>
+          <w:lang w:eastAsia="zh-CN"/>
+        </w:rPr>
+        <w:t xml:space="preserve"> signals </w:t>
+      </w:r>
+      <w:r>
+        <w:rPr>
+          <w:lang w:eastAsia="zh-CN"/>
+        </w:rPr>
+        <w:t>are</w:t>
+      </w:r>
+      <w:r>
+        <w:rPr>
+          <w:lang w:eastAsia="zh-CN"/>
+        </w:rPr>
+        <w:t xml:space="preserve"> forced to lag one trading day, and the output of the solver is compared across methods every time it is constructed. These checks detected mistakes. The </w:t>
+      </w:r>
+      <w:r>
+        <w:rPr>
+          <w:lang w:eastAsia="zh-CN"/>
+        </w:rPr>
+        <w:t>solver’s silent stalling</w:t>
+      </w:r>
+      <w:r>
+        <w:rPr>
+          <w:lang w:eastAsia="zh-CN"/>
+        </w:rPr>
+        <w:t xml:space="preserve"> and the </w:t>
+      </w:r>
+      <w:r>
+        <w:rPr>
+          <w:lang w:eastAsia="zh-CN"/>
+        </w:rPr>
+        <w:t>look-ahead in the sentiment signal were caught in this way</w:t>
+      </w:r>
+      <w:r>
+        <w:rPr>
+          <w:lang w:eastAsia="zh-CN"/>
+        </w:rPr>
+        <w:t>. Another valid judgment is that neutrality and usefulness can coexist; the plain language teaches how to read and understand the evidenc</w:t>
+      </w:r>
+      <w:r>
+        <w:rPr>
+          <w:lang w:eastAsia="zh-CN"/>
+        </w:rPr>
+        <w:t>e, not choose for users.</w:t>
+      </w:r>
+    </w:p>
+    <w:p>
+      <w:pPr>
+        <w:rPr>
+          <w:lang w:eastAsia="zh-CN"/>
+        </w:rPr>
+      </w:pPr>
+      <w:r>
+        <w:rPr>
+          <w:lang w:eastAsia="zh-CN"/>
+        </w:rPr>
+        <w:t xml:space="preserve">The unsuccessful part also has a lot of information. Sentiment tilt reduces value, and post-analysis is more useful than the result itself. The signal is real but noisy, and the noise is directly folded into the weight, which shows that it is an unnecessary position adjustment, not an advantage. The three explicit simplifications qualify all the conclusions: zero transaction costs, zero risk-free interest rates, and the sample </w:t>
+      </w:r>
+      <w:r>
+        <w:rPr>
+          <w:lang w:eastAsia="zh-CN"/>
+        </w:rPr>
+        <w:t>end</w:t>
+      </w:r>
+      <w:r>
+        <w:rPr>
+          <w:lang w:eastAsia="zh-CN"/>
+        </w:rPr>
+        <w:t xml:space="preserve"> on 29 December 2023, so this product does not have a word to describe today’s market.</w:t>
+      </w:r>
+    </w:p>
+    <w:p>
+      <w:pPr>
+        <w:rPr>
+          <w:lang w:eastAsia="zh-CN"/>
+        </w:rPr>
+      </w:pPr>
+      <w:r>
+        <w:rPr>
+          <w:lang w:eastAsia="zh-CN"/>
+        </w:rPr>
         <w:t>In addition, there is another function in the practice area that only ha</w:t>
       </w:r>
       <w:r>
@@ -7220,7 +7303,31 @@
         <w:rPr>
           <w:lang w:eastAsia="zh-CN"/>
         </w:rPr>
-        <w:t xml:space="preserve"> The logic in some parts of the report was originally incorrect and messy; I fixed it and polished it using AI. </w:t>
+        <w:t xml:space="preserve"> The logic in some parts of the report was originally incorrect and messy; I fixed it </w:t>
+      </w:r>
+      <w:r>
+        <w:rPr>
+          <w:lang w:eastAsia="zh-CN"/>
+        </w:rPr>
+        <w:t xml:space="preserve">and </w:t>
+      </w:r>
+      <w:r>
+        <w:rPr>
+          <w:lang w:eastAsia="zh-CN"/>
+        </w:rPr>
+        <w:t xml:space="preserve">polished </w:t>
+      </w:r>
+      <w:r>
+        <w:rPr>
+          <w:lang w:eastAsia="zh-CN"/>
+        </w:rPr>
+        <w:t>the report</w:t>
+      </w:r>
+      <w:r>
+        <w:rPr>
+          <w:lang w:eastAsia="zh-CN"/>
+        </w:rPr>
+        <w:t xml:space="preserve"> using AI. </w:t>
       </w:r>
       <w:r>
         <w:rPr>
@@ -7327,7 +7434,7 @@
                     <pic:cNvPicPr/>
                   </pic:nvPicPr>
                   <pic:blipFill>
-                    <a:blip r:embed="rId17"/>
+                    <a:blip r:embed="rId19"/>
                     <a:stretch>
                       <a:fillRect/>
                     </a:stretch>
@@ -7396,7 +7503,7 @@
                     <pic:cNvPicPr/>
                   </pic:nvPicPr>
                   <pic:blipFill>
-                    <a:blip r:embed="rId18"/>
+                    <a:blip r:embed="rId20"/>
                     <a:stretch>
                       <a:fillRect/>
                     </a:stretch>
@@ -7467,7 +7574,7 @@
                     <pic:cNvPicPr/>
                   </pic:nvPicPr>
                   <pic:blipFill>
-                    <a:blip r:embed="rId19"/>
+                    <a:blip r:embed="rId21"/>
                     <a:stretch>
                       <a:fillRect/>
                     </a:stretch>
@@ -7548,7 +7655,7 @@
                     <pic:cNvPicPr/>
                   </pic:nvPicPr>
                   <pic:blipFill>
-                    <a:blip r:embed="rId20"/>
+                    <a:blip r:embed="rId22"/>
                     <a:stretch>
                       <a:fillRect/>
                     </a:stretch>
@@ -7642,7 +7749,7 @@
                     <pic:cNvPicPr/>
                   </pic:nvPicPr>
                   <pic:blipFill>
-                    <a:blip r:embed="rId21"/>
+                    <a:blip r:embed="rId23"/>
                     <a:stretch>
                       <a:fillRect/>
                     </a:stretch>
@@ -7714,7 +7821,7 @@
         </w:rPr>
         <w:t xml:space="preserve">Massachusetts Securities Division (2020) In the Matter of Robinhood Financial, LLC (Administrative Complaint, Docket No. E-2020-0047), Commonwealth of Massachusetts, 16 December. Available at: </w:t>
       </w:r>
-      <w:hyperlink r:id="rId22" w:history="1">
+      <w:hyperlink r:id="rId24" w:history="1">
         <w:r>
           <w:rPr>
             <w:rStyle w:val="Hyperlink"/>
@@ -7849,8 +7956,8 @@
       </w:r>
     </w:p>
     <w:sectPr>
-      <w:headerReference w:type="default" r:id="rId23"/>
-      <w:footerReference w:type="default" r:id="rId24"/>
+      <w:headerReference w:type="default" r:id="rId25"/>
+      <w:footerReference w:type="default" r:id="rId26"/>
       <w:pgSz w:w="12240" w:h="15840"/>
       <w:pgMar w:top="1440" w:right="1800" w:bottom="1440" w:left="1800" w:header="720" w:footer="720" w:gutter="0"/>
       <w:cols w:space="720"/>
@@ -20055,6 +20162,18 @@
       <w:shd w:val="clear" w:color="auto" w:fill="E1DFDD"/>
     </w:rPr>
   </w:style>
+  <w:style w:type="character" w:styleId="FollowedHyperlink">
+    <w:name w:val="FollowedHyperlink"/>
+    <w:basedOn w:val="DefaultParagraphFont"/>
+    <w:uiPriority w:val="99"/>
+    <w:semiHidden/>
+    <w:unhideWhenUsed/>
+    <w:rsid w:val="006412C0"/>
+    <w:rPr>
+      <w:color w:val="800080" w:themeColor="followedHyperlink"/>
+      <w:u w:val="single"/>
+    </w:rPr>
+  </w:style>
 </w:styles>
 </file>
 

</xml_diff>